<commit_message>
Add the judge's orders after the claimant's response to both journeys
Specified fast track claims that reach JUDICIAL_REFERRAL now get the
Standard Direction Order, reusing CreateSdo. Intermediate and multi
track claims, in both journeys, get a directions order made with
"Make an order" (GENERATE_DIRECTIONS_ORDER) instead: the judge keeps
the claim on its track and uploads a blank pre-hearing order, which
moves the claim to CASE_PROGRESSION. The guides cover both orders.
</commit_message>
<xml_diff>
--- a/playwright-tests/RUNNING_SPECIFIED_TESTS.docx
+++ b/playwright-tests/RUNNING_SPECIFIED_TESTS.docx
@@ -32,7 +32,7 @@
         <w:rPr>
           <w:rFonts w:ascii="Arial" w:cs="Arial" w:eastAsia="Arial" w:hAnsi="Arial"/>
         </w:rPr>
-        <w:t xml:space="preserve">Each command starts the journey from scratch: it creates a new specified (money) claim and takes it through the steps in order. A step that does not apply to the claim, or is switched off, is skipped. The journey currently ends with the claimant's response to the defence.</w:t>
+        <w:t xml:space="preserve">Each command starts the journey from scratch: it creates a new specified (money) claim and takes it through the steps in order. A step that does not apply to the claim, or is switched off, is skipped. The journey currently ends with the judge's Standard Direction Order or directions order.</w:t>
       </w:r>
     </w:p>
     <w:p>
@@ -204,6 +204,44 @@
     </w:p>
     <w:p>
       <w:pPr>
+        <w:pStyle w:val="ListParagraph"/>
+        <w:numPr>
+          <w:ilvl w:val="0"/>
+          <w:numId w:val="2"/>
+        </w:numPr>
+        <w:tabs>
+          <w:tab w:val="left" w:pos="720"/>
+        </w:tabs>
+        <w:spacing w:after="60"/>
+      </w:pPr>
+      <w:r>
+        <w:rPr>
+          <w:rFonts w:ascii="Arial" w:cs="Arial" w:eastAsia="Arial" w:hAnsi="Arial"/>
+        </w:rPr>
+        <w:t xml:space="preserve">CREATE_SDO: the judge makes a Standard Direction Order, moving the claim from JUDICIAL_REFERRAL to CASE_PROGRESSION. It only runs on the fast track, when the claimant's response took the claim to JUDICIAL_REFERRAL. It is always done in the UI, where the judge opens the event by its URL (and claims the directions task first where work allocation needs one).</w:t>
+      </w:r>
+    </w:p>
+    <w:p>
+      <w:pPr>
+        <w:pStyle w:val="ListParagraph"/>
+        <w:numPr>
+          <w:ilvl w:val="0"/>
+          <w:numId w:val="2"/>
+        </w:numPr>
+        <w:tabs>
+          <w:tab w:val="left" w:pos="720"/>
+        </w:tabs>
+        <w:spacing w:after="60"/>
+      </w:pPr>
+      <w:r>
+        <w:rPr>
+          <w:rFonts w:ascii="Arial" w:cs="Arial" w:eastAsia="Arial" w:hAnsi="Arial"/>
+        </w:rPr>
+        <w:t xml:space="preserve">MAKE_DIRECTIONS_ORDER: on the intermediate and multi tracks, which have no Standard Direction Order, the judge makes a directions order with "Make an order" instead, also moving the claim from JUDICIAL_REFERRAL to CASE_PROGRESSION. The judge keeps the claim on its track, chooses the blank template for an order before a hearing and uploads the completed order (playwright-tests/documents/TEST_ORDER.docx; the page only takes Word documents). It is always done in the UI (claiming the track allocation task first where work allocation needs one).</w:t>
+      </w:r>
+    </w:p>
+    <w:p>
+      <w:pPr>
         <w:spacing w:after="120"/>
       </w:pPr>
       <w:r>
@@ -243,7 +281,7 @@
         <w:rPr>
           <w:rFonts w:ascii="Arial" w:cs="Arial" w:eastAsia="Arial" w:hAnsi="Arial"/>
         </w:rPr>
-        <w:t xml:space="preserve">The steps with an API version are CREATE_CLAIM, INFORM_AGREED_EXTENSION_DEFENDANT1/2, RESPOND_TO_CLAIM_DEFENDANT1/2 and RESPOND_TO_DEFENCE. With API_UNTIL=&lt;state&gt; they go through the CCD API until the claim reaches that state, and every step after it goes through the UI. Leave API_UNTIL unset to do everything through the UI.</w:t>
+        <w:t xml:space="preserve">The steps with an API version are CREATE_CLAIM, INFORM_AGREED_EXTENSION_DEFENDANT1/2, RESPOND_TO_CLAIM_DEFENDANT1/2 and RESPOND_TO_DEFENCE. CREATE_SDO and MAKE_DIRECTIONS_ORDER always use the UI. With API_UNTIL=&lt;state&gt; they go through the CCD API until the claim reaches that state, and every step after it goes through the UI. Leave API_UNTIL unset to do everything through the UI.</w:t>
       </w:r>
     </w:p>
     <w:p>
@@ -254,7 +292,7 @@
         <w:rPr>
           <w:rFonts w:ascii="Arial" w:cs="Arial" w:eastAsia="Arial" w:hAnsi="Arial"/>
         </w:rPr>
-        <w:t xml:space="preserve">Everything through the API (All_FINAL_ORDERS_ISSUED is only ever reached by the last step, RESPOND_TO_DEFENCE, so every step uses the API):</w:t>
+        <w:t xml:space="preserve">Everything that has an API version through the API (All_FINAL_ORDERS_ISSUED is only ever reached by RESPOND_TO_DEFENCE, so every step before the Standard Direction Order uses the API):</w:t>
       </w:r>
     </w:p>
     <w:p>
@@ -340,7 +378,7 @@
         <w:rPr>
           <w:rFonts w:ascii="Arial" w:cs="Arial" w:eastAsia="Arial" w:hAnsi="Arial"/>
         </w:rPr>
-        <w:t xml:space="preserve">States the journey reaches: PENDING_CASE_ISSUED, AWAITING_RESPONDENT_ACKNOWLEDGEMENT, AWAITING_APPLICANT_INTENTION, JUDICIAL_REFERRAL, IN_MEDIATION, All_FINAL_ORDERS_ISSUED, PROCEEDS_IN_HERITAGE_SYSTEM.</w:t>
+        <w:t xml:space="preserve">States the journey reaches: PENDING_CASE_ISSUED, AWAITING_RESPONDENT_ACKNOWLEDGEMENT, AWAITING_APPLICANT_INTENTION, JUDICIAL_REFERRAL, CASE_PROGRESSION, IN_MEDIATION, All_FINAL_ORDERS_ISSUED, PROCEEDS_IN_HERITAGE_SYSTEM.</w:t>
       </w:r>
     </w:p>
     <w:p>

</xml_diff>

<commit_message>
Add evidence uploads to the specified journey
Once the judge's order has moved a specified claim to CASE_PROGRESSION,
on the fast, intermediate or multi track, each solicitor uploads a
disclosure list with "Upload Your Documents", reusing UploadEvidence.
Defendant 2's solicitor only uploads for 1v2DS. The guide covers the
new steps.
</commit_message>
<xml_diff>
--- a/playwright-tests/RUNNING_SPECIFIED_TESTS.docx
+++ b/playwright-tests/RUNNING_SPECIFIED_TESTS.docx
@@ -242,6 +242,25 @@
     </w:p>
     <w:p>
       <w:pPr>
+        <w:pStyle w:val="ListParagraph"/>
+        <w:numPr>
+          <w:ilvl w:val="0"/>
+          <w:numId w:val="2"/>
+        </w:numPr>
+        <w:tabs>
+          <w:tab w:val="left" w:pos="720"/>
+        </w:tabs>
+        <w:spacing w:after="60"/>
+      </w:pPr>
+      <w:r>
+        <w:rPr>
+          <w:rFonts w:ascii="Arial" w:cs="Arial" w:eastAsia="Arial" w:hAnsi="Arial"/>
+        </w:rPr>
+        <w:t xml:space="preserve">UPLOAD_EVIDENCE (group: _CLAIMANT_SOLICITOR, _DEFENDANT1_SOLICITOR, _DEFENDANT2_SOLICITOR): once the judge's order has moved the claim to CASE_PROGRESSION, each solicitor uploads a disclosure list with "Upload Your Documents" (the second defendant's solicitor only for 1v2DS). A solicitor acting for two parties uploads it for both. The claim stays in CASE_PROGRESSION. It is always done in the UI.</w:t>
+      </w:r>
+    </w:p>
+    <w:p>
+      <w:pPr>
         <w:spacing w:after="120"/>
       </w:pPr>
       <w:r>
@@ -281,7 +300,7 @@
         <w:rPr>
           <w:rFonts w:ascii="Arial" w:cs="Arial" w:eastAsia="Arial" w:hAnsi="Arial"/>
         </w:rPr>
-        <w:t xml:space="preserve">The steps with an API version are CREATE_CLAIM, INFORM_AGREED_EXTENSION_DEFENDANT1/2, RESPOND_TO_CLAIM_DEFENDANT1/2 and RESPOND_TO_DEFENCE. CREATE_SDO and MAKE_DIRECTIONS_ORDER always use the UI. With API_UNTIL=&lt;state&gt; they go through the CCD API until the claim reaches that state, and every step after it goes through the UI. Leave API_UNTIL unset to do everything through the UI.</w:t>
+        <w:t xml:space="preserve">The steps with an API version are CREATE_CLAIM, INFORM_AGREED_EXTENSION_DEFENDANT1/2, RESPOND_TO_CLAIM_DEFENDANT1/2 and RESPOND_TO_DEFENCE. CREATE_SDO, MAKE_DIRECTIONS_ORDER and UPLOAD_EVIDENCE always use the UI. With API_UNTIL=&lt;state&gt; they go through the CCD API until the claim reaches that state, and every step after it goes through the UI. Leave API_UNTIL unset to do everything through the UI.</w:t>
       </w:r>
     </w:p>
     <w:p>

</xml_diff>

<commit_message>
Add the hearing notice to the specified journey
Once the evidence is in, the hearing centre admin lists the trial with
"Create a hearing notice", which moves the claim to HEARING_READINESS.
CreateHearingNotice now covers the intermediate and multi tracks too:
they share the trial notice with the fast track, but the duration is
typed in instead of picked from a list. The guide covers the new step.
</commit_message>
<xml_diff>
--- a/playwright-tests/RUNNING_SPECIFIED_TESTS.docx
+++ b/playwright-tests/RUNNING_SPECIFIED_TESTS.docx
@@ -261,6 +261,25 @@
     </w:p>
     <w:p>
       <w:pPr>
+        <w:pStyle w:val="ListParagraph"/>
+        <w:numPr>
+          <w:ilvl w:val="0"/>
+          <w:numId w:val="2"/>
+        </w:numPr>
+        <w:tabs>
+          <w:tab w:val="left" w:pos="720"/>
+        </w:tabs>
+        <w:spacing w:after="60"/>
+      </w:pPr>
+      <w:r>
+        <w:rPr>
+          <w:rFonts w:ascii="Arial" w:cs="Arial" w:eastAsia="Arial" w:hAnsi="Arial"/>
+        </w:rPr>
+        <w:t xml:space="preserve">CREATE_HEARING_NOTICE: once the evidence is in, the hearing centre admin lists the trial with "Create a hearing notice" (a first listing of a "Trial (Fast, Intermediate and Multi track)" notice at Clerkenwell, 8 weeks ahead). This stands in for HMC returning a listed hearing. civil-service works out the hearing fee and moves the claim to HEARING_READINESS. It is always done in the UI.</w:t>
+      </w:r>
+    </w:p>
+    <w:p>
+      <w:pPr>
         <w:spacing w:after="120"/>
       </w:pPr>
       <w:r>
@@ -300,7 +319,7 @@
         <w:rPr>
           <w:rFonts w:ascii="Arial" w:cs="Arial" w:eastAsia="Arial" w:hAnsi="Arial"/>
         </w:rPr>
-        <w:t xml:space="preserve">The steps with an API version are CREATE_CLAIM, INFORM_AGREED_EXTENSION_DEFENDANT1/2, RESPOND_TO_CLAIM_DEFENDANT1/2 and RESPOND_TO_DEFENCE. CREATE_SDO, MAKE_DIRECTIONS_ORDER and UPLOAD_EVIDENCE always use the UI. With API_UNTIL=&lt;state&gt; they go through the CCD API until the claim reaches that state, and every step after it goes through the UI. Leave API_UNTIL unset to do everything through the UI.</w:t>
+        <w:t xml:space="preserve">The steps with an API version are CREATE_CLAIM, INFORM_AGREED_EXTENSION_DEFENDANT1/2, RESPOND_TO_CLAIM_DEFENDANT1/2 and RESPOND_TO_DEFENCE. CREATE_SDO, MAKE_DIRECTIONS_ORDER, UPLOAD_EVIDENCE and CREATE_HEARING_NOTICE always use the UI. With API_UNTIL=&lt;state&gt; they go through the CCD API until the claim reaches that state, and every step after it goes through the UI. Leave API_UNTIL unset to do everything through the UI.</w:t>
       </w:r>
     </w:p>
     <w:p>
@@ -397,7 +416,7 @@
         <w:rPr>
           <w:rFonts w:ascii="Arial" w:cs="Arial" w:eastAsia="Arial" w:hAnsi="Arial"/>
         </w:rPr>
-        <w:t xml:space="preserve">States the journey reaches: PENDING_CASE_ISSUED, AWAITING_RESPONDENT_ACKNOWLEDGEMENT, AWAITING_APPLICANT_INTENTION, JUDICIAL_REFERRAL, CASE_PROGRESSION, IN_MEDIATION, All_FINAL_ORDERS_ISSUED, PROCEEDS_IN_HERITAGE_SYSTEM.</w:t>
+        <w:t xml:space="preserve">States the journey reaches: PENDING_CASE_ISSUED, AWAITING_RESPONDENT_ACKNOWLEDGEMENT, AWAITING_APPLICANT_INTENTION, JUDICIAL_REFERRAL, CASE_PROGRESSION, HEARING_READINESS, IN_MEDIATION, All_FINAL_ORDERS_ISSUED, PROCEEDS_IN_HERITAGE_SYSTEM.</w:t>
       </w:r>
     </w:p>
     <w:p>

</xml_diff>

<commit_message>
Add the hearing fee payment to the specified journey
Once the trial is listed, the claimant's solicitor pays the hearing fee
from the Service Request tab, by PBA or card. If the payment service has
not told civil-service within a minute, the test does, then runs
HEARING_FEE_PAID, moving the claim to PREPARE_FOR_HEARING_CONDUCT_HEARING.
The guide covers the new step and the Word copy is regenerated.
</commit_message>
<xml_diff>
--- a/playwright-tests/RUNNING_SPECIFIED_TESTS.docx
+++ b/playwright-tests/RUNNING_SPECIFIED_TESTS.docx
@@ -32,7 +32,7 @@
         <w:rPr>
           <w:rFonts w:ascii="Arial" w:cs="Arial" w:eastAsia="Arial" w:hAnsi="Arial"/>
         </w:rPr>
-        <w:t xml:space="preserve">Each command starts the journey from scratch: it creates a new specified (money) claim and takes it through the steps in order. A step that does not apply to the claim, or is switched off, is skipped. The journey currently ends with the judge's Standard Direction Order or directions order.</w:t>
+        <w:t xml:space="preserve">Each command starts the journey from scratch: it creates a new specified (money) claim and takes it through the steps in order. A step that does not apply to the claim, or is switched off, is skipped. The journey currently ends with the claimant's solicitor paying the hearing fee, leaving the claim in PREPARE_FOR_HEARING_CONDUCT_HEARING.</w:t>
       </w:r>
     </w:p>
     <w:p>
@@ -280,6 +280,25 @@
     </w:p>
     <w:p>
       <w:pPr>
+        <w:pStyle w:val="ListParagraph"/>
+        <w:numPr>
+          <w:ilvl w:val="0"/>
+          <w:numId w:val="2"/>
+        </w:numPr>
+        <w:tabs>
+          <w:tab w:val="left" w:pos="720"/>
+        </w:tabs>
+        <w:spacing w:after="60"/>
+      </w:pPr>
+      <w:r>
+        <w:rPr>
+          <w:rFonts w:ascii="Arial" w:cs="Arial" w:eastAsia="Arial" w:hAnsi="Arial"/>
+        </w:rPr>
+        <w:t xml:space="preserve">PAY_HEARING_FEE: the claimant's solicitor pays the hearing fee from the Service Request tab, by PBA or card (PAYMENT_METHOD). If the payment service has not told civil-service about the payment within a minute, the test does. The test then runs HEARING_FEE_PAID, which civil-service's scheduler would otherwise run later, moving the claim to PREPARE_FOR_HEARING_CONDUCT_HEARING. It is always done in the UI.</w:t>
+      </w:r>
+    </w:p>
+    <w:p>
+      <w:pPr>
         <w:spacing w:after="120"/>
       </w:pPr>
       <w:r>
@@ -319,7 +338,7 @@
         <w:rPr>
           <w:rFonts w:ascii="Arial" w:cs="Arial" w:eastAsia="Arial" w:hAnsi="Arial"/>
         </w:rPr>
-        <w:t xml:space="preserve">The steps with an API version are CREATE_CLAIM, INFORM_AGREED_EXTENSION_DEFENDANT1/2, RESPOND_TO_CLAIM_DEFENDANT1/2 and RESPOND_TO_DEFENCE. CREATE_SDO, MAKE_DIRECTIONS_ORDER, UPLOAD_EVIDENCE and CREATE_HEARING_NOTICE always use the UI. With API_UNTIL=&lt;state&gt; they go through the CCD API until the claim reaches that state, and every step after it goes through the UI. Leave API_UNTIL unset to do everything through the UI.</w:t>
+        <w:t xml:space="preserve">The steps with an API version are CREATE_CLAIM, INFORM_AGREED_EXTENSION_DEFENDANT1/2, RESPOND_TO_CLAIM_DEFENDANT1/2 and RESPOND_TO_DEFENCE. CREATE_SDO, MAKE_DIRECTIONS_ORDER, UPLOAD_EVIDENCE, CREATE_HEARING_NOTICE and PAY_HEARING_FEE always use the UI. With API_UNTIL=&lt;state&gt; they go through the CCD API until the claim reaches that state, and every step after it goes through the UI. Leave API_UNTIL unset to do everything through the UI.</w:t>
       </w:r>
     </w:p>
     <w:p>
@@ -416,7 +435,7 @@
         <w:rPr>
           <w:rFonts w:ascii="Arial" w:cs="Arial" w:eastAsia="Arial" w:hAnsi="Arial"/>
         </w:rPr>
-        <w:t xml:space="preserve">States the journey reaches: PENDING_CASE_ISSUED, AWAITING_RESPONDENT_ACKNOWLEDGEMENT, AWAITING_APPLICANT_INTENTION, JUDICIAL_REFERRAL, CASE_PROGRESSION, HEARING_READINESS, IN_MEDIATION, All_FINAL_ORDERS_ISSUED, PROCEEDS_IN_HERITAGE_SYSTEM.</w:t>
+        <w:t xml:space="preserve">States the journey reaches: PENDING_CASE_ISSUED, AWAITING_RESPONDENT_ACKNOWLEDGEMENT, AWAITING_APPLICANT_INTENTION, JUDICIAL_REFERRAL, CASE_PROGRESSION, HEARING_READINESS, PREPARE_FOR_HEARING_CONDUCT_HEARING, IN_MEDIATION, All_FINAL_ORDERS_ISSUED, PROCEEDS_IN_HERITAGE_SYSTEM.</w:t>
       </w:r>
     </w:p>
     <w:p>
@@ -2226,7 +2245,7 @@
         <w:rPr>
           <w:rFonts w:ascii="Arial" w:cs="Arial" w:eastAsia="Arial" w:hAnsi="Arial"/>
         </w:rPr>
-        <w:t xml:space="preserve">8. Paying the claim fee by PBA or card</w:t>
+        <w:t xml:space="preserve">8. Paying fees by PBA or card</w:t>
       </w:r>
     </w:p>
     <w:p>
@@ -2237,7 +2256,7 @@
         <w:rPr>
           <w:rFonts w:ascii="Arial" w:cs="Arial" w:eastAsia="Arial" w:hAnsi="Arial"/>
         </w:rPr>
-        <w:t xml:space="preserve">PAYMENT_METHOD=PBA (the default) pays from the claimant solicitor's PBA account. PAYMENT_METHOD=CARD pays on GOV.UK Pay's pages with a test card, always in the UI, even when the claim is created through the API. Use CARD when PBA payments fail on the environment, for example with "Unable to retrieve account information".</w:t>
+        <w:t xml:space="preserve">PAYMENT_METHOD picks how the claimant's solicitor pays the claim fee and the hearing fee. PBA (the default) pays from their PBA account. CARD pays on GOV.UK Pay's pages with a test card, always in the UI, even when the claim is created through the API. Use CARD when PBA payments fail on the environment, for example with "Unable to retrieve account information".</w:t>
       </w:r>
     </w:p>
     <w:p>
@@ -3693,7 +3712,7 @@
                 <w:sz w:val="20"/>
                 <w:szCs w:val="20"/>
               </w:rPr>
-              <w:t xml:space="preserve">How the claim fee is paid. CARD is always paid in the UI. Any other value stops the run.</w:t>
+              <w:t xml:space="preserve">How the claim fee and the hearing fee are paid. CARD is always paid in the UI. Any other value stops the run.</w:t>
             </w:r>
           </w:p>
         </w:tc>

</xml_diff>

<commit_message>
Add the trial ready check to the specified journey
Once the hearing fee is paid, TRIAL_READY_CHECK asks the parties to
confirm they are ready for trial. civil-service's scheduler only does
this for fast track claims less than 3 weeks before the hearing, so the
test runs the event itself on the fast track and checks it was recorded
on the case. The claim stays in PREPARE_FOR_HEARING_CONDUCT_HEARING.
The guide covers the new step and the Word copy is regenerated.
</commit_message>
<xml_diff>
--- a/playwright-tests/RUNNING_SPECIFIED_TESTS.docx
+++ b/playwright-tests/RUNNING_SPECIFIED_TESTS.docx
@@ -32,7 +32,7 @@
         <w:rPr>
           <w:rFonts w:ascii="Arial" w:cs="Arial" w:eastAsia="Arial" w:hAnsi="Arial"/>
         </w:rPr>
-        <w:t xml:space="preserve">Each command starts the journey from scratch: it creates a new specified (money) claim and takes it through the steps in order. A step that does not apply to the claim, or is switched off, is skipped. The journey currently ends with the claimant's solicitor paying the hearing fee, leaving the claim in PREPARE_FOR_HEARING_CONDUCT_HEARING.</w:t>
+        <w:t xml:space="preserve">Each command starts the journey from scratch: it creates a new specified (money) claim and takes it through the steps in order. A step that does not apply to the claim, or is switched off, is skipped. The journey currently ends in PREPARE_FOR_HEARING_CONDUCT_HEARING, with the hearing fee paid and, on the fast track, the trial ready check made.</w:t>
       </w:r>
     </w:p>
     <w:p>
@@ -295,6 +295,25 @@
           <w:rFonts w:ascii="Arial" w:cs="Arial" w:eastAsia="Arial" w:hAnsi="Arial"/>
         </w:rPr>
         <w:t xml:space="preserve">PAY_HEARING_FEE: the claimant's solicitor pays the hearing fee from the Service Request tab, by PBA or card (PAYMENT_METHOD). If the payment service has not told civil-service about the payment within a minute, the test does. The test then runs HEARING_FEE_PAID, which civil-service's scheduler would otherwise run later, moving the claim to PREPARE_FOR_HEARING_CONDUCT_HEARING. It is always done in the UI.</w:t>
+      </w:r>
+    </w:p>
+    <w:p>
+      <w:pPr>
+        <w:pStyle w:val="ListParagraph"/>
+        <w:numPr>
+          <w:ilvl w:val="0"/>
+          <w:numId w:val="2"/>
+        </w:numPr>
+        <w:tabs>
+          <w:tab w:val="left" w:pos="720"/>
+        </w:tabs>
+        <w:spacing w:after="60"/>
+      </w:pPr>
+      <w:r>
+        <w:rPr>
+          <w:rFonts w:ascii="Arial" w:cs="Arial" w:eastAsia="Arial" w:hAnsi="Arial"/>
+        </w:rPr>
+        <w:t xml:space="preserve">TRIAL_READY_CHECK: on the fast track only, the parties are asked to confirm they are ready for trial. civil-service's scheduler does this once the hearing is less than 3 weeks away; the hearing is 8 weeks ahead, so the test runs the event itself and checks it was recorded on the case. The claim stays in PREPARE_FOR_HEARING_CONDUCT_HEARING.</w:t>
       </w:r>
     </w:p>
     <w:p>

</xml_diff>

<commit_message>
Add trial arrangement confirmations to the specified journey
After the trial ready check, each solicitor confirms with "Confirm trial
arrangements" that the case is ready for trial, reusing
ConfirmTrialArrangements. Defendant 2's solicitor only confirms for
1v2DS, and a solicitor acting for both defendants confirms for both.
The CCD definition only offers the event on the fast track, so the
steps are skipped on the intermediate and multi tracks. The guide
covers the new steps and the Word copy is regenerated.
</commit_message>
<xml_diff>
--- a/playwright-tests/RUNNING_SPECIFIED_TESTS.docx
+++ b/playwright-tests/RUNNING_SPECIFIED_TESTS.docx
@@ -32,7 +32,7 @@
         <w:rPr>
           <w:rFonts w:ascii="Arial" w:cs="Arial" w:eastAsia="Arial" w:hAnsi="Arial"/>
         </w:rPr>
-        <w:t xml:space="preserve">Each command starts the journey from scratch: it creates a new specified (money) claim and takes it through the steps in order. A step that does not apply to the claim, or is switched off, is skipped. The journey currently ends in PREPARE_FOR_HEARING_CONDUCT_HEARING, with the hearing fee paid and, on the fast track, the trial ready check made.</w:t>
+        <w:t xml:space="preserve">Each command starts the journey from scratch: it creates a new specified (money) claim and takes it through the steps in order. A step that does not apply to the claim, or is switched off, is skipped. The journey currently ends in PREPARE_FOR_HEARING_CONDUCT_HEARING, with the hearing fee paid and, on the fast track, the trial ready check made and the solicitors' trial arrangements confirmed.</w:t>
       </w:r>
     </w:p>
     <w:p>
@@ -318,6 +318,25 @@
     </w:p>
     <w:p>
       <w:pPr>
+        <w:pStyle w:val="ListParagraph"/>
+        <w:numPr>
+          <w:ilvl w:val="0"/>
+          <w:numId w:val="2"/>
+        </w:numPr>
+        <w:tabs>
+          <w:tab w:val="left" w:pos="720"/>
+        </w:tabs>
+        <w:spacing w:after="60"/>
+      </w:pPr>
+      <w:r>
+        <w:rPr>
+          <w:rFonts w:ascii="Arial" w:cs="Arial" w:eastAsia="Arial" w:hAnsi="Arial"/>
+        </w:rPr>
+        <w:t xml:space="preserve">CONFIRM_TRIAL_ARRANGEMENTS (group: _CLAIMANT_SOLICITOR, _DEFENDANT1_SOLICITOR, _DEFENDANT2_SOLICITOR): each solicitor confirms with "Confirm trial arrangements" that the case is ready for trial, with no change to the hearing requirements (the second defendant's solicitor only for 1v2DS). A solicitor acting for two parties confirms for both. Like the trial ready check it is fast track only (XUI does not offer it on the intermediate or multi tracks), and it has to be done more than 3 weeks before the hearing. The claim stays in PREPARE_FOR_HEARING_CONDUCT_HEARING. It is always done in the UI.</w:t>
+      </w:r>
+    </w:p>
+    <w:p>
+      <w:pPr>
         <w:spacing w:after="120"/>
       </w:pPr>
       <w:r>
@@ -357,7 +376,7 @@
         <w:rPr>
           <w:rFonts w:ascii="Arial" w:cs="Arial" w:eastAsia="Arial" w:hAnsi="Arial"/>
         </w:rPr>
-        <w:t xml:space="preserve">The steps with an API version are CREATE_CLAIM, INFORM_AGREED_EXTENSION_DEFENDANT1/2, RESPOND_TO_CLAIM_DEFENDANT1/2 and RESPOND_TO_DEFENCE. CREATE_SDO, MAKE_DIRECTIONS_ORDER, UPLOAD_EVIDENCE, CREATE_HEARING_NOTICE and PAY_HEARING_FEE always use the UI. With API_UNTIL=&lt;state&gt; they go through the CCD API until the claim reaches that state, and every step after it goes through the UI. Leave API_UNTIL unset to do everything through the UI.</w:t>
+        <w:t xml:space="preserve">The steps with an API version are CREATE_CLAIM, INFORM_AGREED_EXTENSION_DEFENDANT1/2, RESPOND_TO_CLAIM_DEFENDANT1/2 and RESPOND_TO_DEFENCE. CREATE_SDO, MAKE_DIRECTIONS_ORDER, UPLOAD_EVIDENCE, CREATE_HEARING_NOTICE, PAY_HEARING_FEE and CONFIRM_TRIAL_ARRANGEMENTS always use the UI. With API_UNTIL=&lt;state&gt; they go through the CCD API until the claim reaches that state, and every step after it goes through the UI. Leave API_UNTIL unset to do everything through the UI.</w:t>
       </w:r>
     </w:p>
     <w:p>

</xml_diff>

<commit_message>
Add the trial bundle to the specified journey
After the trial arrangements are confirmed, the test asks civil-service
to create the trial bundle, which its scheduler does about 3 weeks before
the hearing, waits for it to be stitched and checks the claimant's
solicitor sees it on the Bundles tab. civil-service does not create
bundles for intermediate or multi track claims, so the step is skipped
for them. The guide covers the new step and the Word copy is regenerated.
</commit_message>
<xml_diff>
--- a/playwright-tests/RUNNING_SPECIFIED_TESTS.docx
+++ b/playwright-tests/RUNNING_SPECIFIED_TESTS.docx
@@ -32,7 +32,7 @@
         <w:rPr>
           <w:rFonts w:ascii="Arial" w:cs="Arial" w:eastAsia="Arial" w:hAnsi="Arial"/>
         </w:rPr>
-        <w:t xml:space="preserve">Each command starts the journey from scratch: it creates a new specified (money) claim and takes it through the steps in order. A step that does not apply to the claim, or is switched off, is skipped. The journey currently ends in PREPARE_FOR_HEARING_CONDUCT_HEARING, with the hearing fee paid and, on the fast track, the trial ready check made and the solicitors' trial arrangements confirmed.</w:t>
+        <w:t xml:space="preserve">Each command starts the journey from scratch: it creates a new specified (money) claim and takes it through the steps in order. A step that does not apply to the claim, or is switched off, is skipped. The journey currently ends in PREPARE_FOR_HEARING_CONDUCT_HEARING, with the hearing fee paid and, on the fast track, the trial ready check made, the solicitors' trial arrangements confirmed and the trial bundle created.</w:t>
       </w:r>
     </w:p>
     <w:p>
@@ -333,6 +333,25 @@
           <w:rFonts w:ascii="Arial" w:cs="Arial" w:eastAsia="Arial" w:hAnsi="Arial"/>
         </w:rPr>
         <w:t xml:space="preserve">CONFIRM_TRIAL_ARRANGEMENTS (group: _CLAIMANT_SOLICITOR, _DEFENDANT1_SOLICITOR, _DEFENDANT2_SOLICITOR): each solicitor confirms with "Confirm trial arrangements" that the case is ready for trial, with no change to the hearing requirements (the second defendant's solicitor only for 1v2DS). A solicitor acting for two parties confirms for both. Like the trial ready check it is fast track only (XUI does not offer it on the intermediate or multi tracks), and it has to be done more than 3 weeks before the hearing. The claim stays in PREPARE_FOR_HEARING_CONDUCT_HEARING. It is always done in the UI.</w:t>
+      </w:r>
+    </w:p>
+    <w:p>
+      <w:pPr>
+        <w:pStyle w:val="ListParagraph"/>
+        <w:numPr>
+          <w:ilvl w:val="0"/>
+          <w:numId w:val="2"/>
+        </w:numPr>
+        <w:tabs>
+          <w:tab w:val="left" w:pos="720"/>
+        </w:tabs>
+        <w:spacing w:after="60"/>
+      </w:pPr>
+      <w:r>
+        <w:rPr>
+          <w:rFonts w:ascii="Arial" w:cs="Arial" w:eastAsia="Arial" w:hAnsi="Arial"/>
+        </w:rPr>
+        <w:t xml:space="preserve">CREATE_TRIAL_BUNDLE: the trial bundle is created. civil-service's scheduler does this about 3 weeks before the hearing, for every track except intermediate and multi (small claims have bundles too, but go to mediation in this journey), so the test asks civil-service to do it now, waits for the bundle to be stitched into one document and checks the claimant's solicitor sees it on the Bundles tab. The claim stays in PREPARE_FOR_HEARING_CONDUCT_HEARING.</w:t>
       </w:r>
     </w:p>
     <w:p>

</xml_diff>

<commit_message>
Add the decision outcome, final order and order review to the specified journey
After the trial bundle, the claim moves to DECISION_OUTCOME as
civil-service's scheduler does once the hearing date has passed. The
judge then makes the final order set by FINAL_ORDER, and court staff
confirm the order review, which moves the claim to
All_FINAL_ORDERS_ISSUED. These run on the fast, intermediate and multi
tracks.

MakeFinalOrder now also makes the intermediate and multi track orders:
the judge keeps the claim on its track, picks a template, gives today as
the hearing date for the after-hearing template, and uploads the
completed order. The guide covers the new steps and FINAL_ORDER, and the
Word copy is regenerated.
</commit_message>
<xml_diff>
--- a/playwright-tests/RUNNING_SPECIFIED_TESTS.docx
+++ b/playwright-tests/RUNNING_SPECIFIED_TESTS.docx
@@ -32,7 +32,7 @@
         <w:rPr>
           <w:rFonts w:ascii="Arial" w:cs="Arial" w:eastAsia="Arial" w:hAnsi="Arial"/>
         </w:rPr>
-        <w:t xml:space="preserve">Each command starts the journey from scratch: it creates a new specified (money) claim and takes it through the steps in order. A step that does not apply to the claim, or is switched off, is skipped. The journey currently ends in PREPARE_FOR_HEARING_CONDUCT_HEARING, with the hearing fee paid and, on the fast track, the trial ready check made, the solicitors' trial arrangements confirmed and the trial bundle created.</w:t>
+        <w:t xml:space="preserve">Each command starts the journey from scratch: it creates a new specified (money) claim and takes it through the steps in order. A step that does not apply to the claim, or is switched off, is skipped. The journey currently ends with court staff confirming the judge's final order, which moves the claim to All_FINAL_ORDERS_ISSUED.</w:t>
       </w:r>
     </w:p>
     <w:p>
@@ -356,6 +356,63 @@
     </w:p>
     <w:p>
       <w:pPr>
+        <w:pStyle w:val="ListParagraph"/>
+        <w:numPr>
+          <w:ilvl w:val="0"/>
+          <w:numId w:val="2"/>
+        </w:numPr>
+        <w:tabs>
+          <w:tab w:val="left" w:pos="720"/>
+        </w:tabs>
+        <w:spacing w:after="60"/>
+      </w:pPr>
+      <w:r>
+        <w:rPr>
+          <w:rFonts w:ascii="Arial" w:cs="Arial" w:eastAsia="Arial" w:hAnsi="Arial"/>
+        </w:rPr>
+        <w:t xml:space="preserve">MOVE_TO_DECISION_OUTCOME: once the hearing date has passed, civil-service's scheduler moves the claim to DECISION_OUTCOME to wait for the judge's decision, on every track. The hearing is weeks away, so the test runs the event itself.</w:t>
+      </w:r>
+    </w:p>
+    <w:p>
+      <w:pPr>
+        <w:pStyle w:val="ListParagraph"/>
+        <w:numPr>
+          <w:ilvl w:val="0"/>
+          <w:numId w:val="2"/>
+        </w:numPr>
+        <w:tabs>
+          <w:tab w:val="left" w:pos="720"/>
+        </w:tabs>
+        <w:spacing w:after="60"/>
+      </w:pPr>
+      <w:r>
+        <w:rPr>
+          <w:rFonts w:ascii="Arial" w:cs="Arial" w:eastAsia="Arial" w:hAnsi="Arial"/>
+        </w:rPr>
+        <w:t xml:space="preserve">MAKE_FINAL_ORDER: the judge makes the final order with "Make an order" (FINAL_ORDER, see section 10). On the fast track the judge writes a free form or an assisted order on the page. On the intermediate and multi tracks the judge keeps the claim on its track, picks a template (for the after-hearing template, giving today as the hearing date), and uploads the completed order (playwright-tests/documents/TEST_ORDER.docx). The test checks the order was added to the case and its notifications sent. The claim stays in DECISION_OUTCOME. It is always done in the UI.</w:t>
+      </w:r>
+    </w:p>
+    <w:p>
+      <w:pPr>
+        <w:pStyle w:val="ListParagraph"/>
+        <w:numPr>
+          <w:ilvl w:val="0"/>
+          <w:numId w:val="2"/>
+        </w:numPr>
+        <w:tabs>
+          <w:tab w:val="left" w:pos="720"/>
+        </w:tabs>
+        <w:spacing w:after="60"/>
+      </w:pPr>
+      <w:r>
+        <w:rPr>
+          <w:rFonts w:ascii="Arial" w:cs="Arial" w:eastAsia="Arial" w:hAnsi="Arial"/>
+        </w:rPr>
+        <w:t xml:space="preserve">CONFIRM_ORDER_REVIEW: the hearing centre admin reviews the order with "Confirm order review": no date a party must do something by, a final order, and nothing left to do. This closes the claim on any track, moving it to All_FINAL_ORDERS_ISSUED. It is always done in the UI.</w:t>
+      </w:r>
+    </w:p>
+    <w:p>
+      <w:pPr>
         <w:spacing w:after="120"/>
       </w:pPr>
       <w:r>
@@ -395,7 +452,7 @@
         <w:rPr>
           <w:rFonts w:ascii="Arial" w:cs="Arial" w:eastAsia="Arial" w:hAnsi="Arial"/>
         </w:rPr>
-        <w:t xml:space="preserve">The steps with an API version are CREATE_CLAIM, INFORM_AGREED_EXTENSION_DEFENDANT1/2, RESPOND_TO_CLAIM_DEFENDANT1/2 and RESPOND_TO_DEFENCE. CREATE_SDO, MAKE_DIRECTIONS_ORDER, UPLOAD_EVIDENCE, CREATE_HEARING_NOTICE, PAY_HEARING_FEE and CONFIRM_TRIAL_ARRANGEMENTS always use the UI. With API_UNTIL=&lt;state&gt; they go through the CCD API until the claim reaches that state, and every step after it goes through the UI. Leave API_UNTIL unset to do everything through the UI.</w:t>
+        <w:t xml:space="preserve">The steps with an API version are CREATE_CLAIM, INFORM_AGREED_EXTENSION_DEFENDANT1/2, RESPOND_TO_CLAIM_DEFENDANT1/2 and RESPOND_TO_DEFENCE. CREATE_SDO, MAKE_DIRECTIONS_ORDER, UPLOAD_EVIDENCE, CREATE_HEARING_NOTICE, PAY_HEARING_FEE, CONFIRM_TRIAL_ARRANGEMENTS, MAKE_FINAL_ORDER and CONFIRM_ORDER_REVIEW always use the UI. With API_UNTIL=&lt;state&gt; they go through the CCD API until the claim reaches that state, and every step after it goes through the UI. Leave API_UNTIL unset to do everything through the UI.</w:t>
       </w:r>
     </w:p>
     <w:p>
@@ -406,7 +463,7 @@
         <w:rPr>
           <w:rFonts w:ascii="Arial" w:cs="Arial" w:eastAsia="Arial" w:hAnsi="Arial"/>
         </w:rPr>
-        <w:t xml:space="preserve">Everything that has an API version through the API (All_FINAL_ORDERS_ISSUED is only ever reached by RESPOND_TO_DEFENCE, so every step before the Standard Direction Order uses the API):</w:t>
+        <w:t xml:space="preserve">Everything that has an API version through the API (All_FINAL_ORDERS_ISSUED is the last state the journey reaches, so every step that has an API version uses it):</w:t>
       </w:r>
     </w:p>
     <w:p>
@@ -492,7 +549,7 @@
         <w:rPr>
           <w:rFonts w:ascii="Arial" w:cs="Arial" w:eastAsia="Arial" w:hAnsi="Arial"/>
         </w:rPr>
-        <w:t xml:space="preserve">States the journey reaches: PENDING_CASE_ISSUED, AWAITING_RESPONDENT_ACKNOWLEDGEMENT, AWAITING_APPLICANT_INTENTION, JUDICIAL_REFERRAL, CASE_PROGRESSION, HEARING_READINESS, PREPARE_FOR_HEARING_CONDUCT_HEARING, IN_MEDIATION, All_FINAL_ORDERS_ISSUED, PROCEEDS_IN_HERITAGE_SYSTEM.</w:t>
+        <w:t xml:space="preserve">States the journey reaches: PENDING_CASE_ISSUED, AWAITING_RESPONDENT_ACKNOWLEDGEMENT, AWAITING_APPLICANT_INTENTION, JUDICIAL_REFERRAL, CASE_PROGRESSION, HEARING_READINESS, PREPARE_FOR_HEARING_CONDUCT_HEARING, DECISION_OUTCOME, IN_MEDIATION, All_FINAL_ORDERS_ISSUED, PROCEEDS_IN_HERITAGE_SYSTEM.</w:t>
       </w:r>
     </w:p>
     <w:p>
@@ -2401,10 +2458,10 @@
         </w:tblBorders>
       </w:tblPr>
       <w:tblGrid>
-        <w:gridCol w:w="1752"/>
-        <w:gridCol w:w="3310"/>
-        <w:gridCol w:w="1265"/>
-        <w:gridCol w:w="3311"/>
+        <w:gridCol w:w="1692"/>
+        <w:gridCol w:w="3196"/>
+        <w:gridCol w:w="1551"/>
+        <w:gridCol w:w="3199"/>
       </w:tblGrid>
       <w:tr>
         <w:trPr>
@@ -2412,7 +2469,7 @@
         </w:trPr>
         <w:tc>
           <w:tcPr>
-            <w:tcW w:type="dxa" w:w="1752"/>
+            <w:tcW w:type="dxa" w:w="1692"/>
             <w:tcBorders>
               <w:top w:val="single" w:color="BFBFBF" w:sz="4"/>
               <w:left w:val="single" w:color="BFBFBF" w:sz="4"/>
@@ -2442,7 +2499,7 @@
         </w:tc>
         <w:tc>
           <w:tcPr>
-            <w:tcW w:type="dxa" w:w="3310"/>
+            <w:tcW w:type="dxa" w:w="3196"/>
             <w:tcBorders>
               <w:top w:val="single" w:color="BFBFBF" w:sz="4"/>
               <w:left w:val="single" w:color="BFBFBF" w:sz="4"/>
@@ -2472,7 +2529,7 @@
         </w:tc>
         <w:tc>
           <w:tcPr>
-            <w:tcW w:type="dxa" w:w="1265"/>
+            <w:tcW w:type="dxa" w:w="1551"/>
             <w:tcBorders>
               <w:top w:val="single" w:color="BFBFBF" w:sz="4"/>
               <w:left w:val="single" w:color="BFBFBF" w:sz="4"/>
@@ -2502,7 +2559,7 @@
         </w:tc>
         <w:tc>
           <w:tcPr>
-            <w:tcW w:type="dxa" w:w="3311"/>
+            <w:tcW w:type="dxa" w:w="3199"/>
             <w:tcBorders>
               <w:top w:val="single" w:color="BFBFBF" w:sz="4"/>
               <w:left w:val="single" w:color="BFBFBF" w:sz="4"/>
@@ -2537,7 +2594,7 @@
         </w:trPr>
         <w:tc>
           <w:tcPr>
-            <w:tcW w:type="dxa" w:w="1752"/>
+            <w:tcW w:type="dxa" w:w="1692"/>
             <w:tcBorders>
               <w:top w:val="single" w:color="BFBFBF" w:sz="4"/>
               <w:left w:val="single" w:color="BFBFBF" w:sz="4"/>
@@ -2564,7 +2621,7 @@
         </w:tc>
         <w:tc>
           <w:tcPr>
-            <w:tcW w:type="dxa" w:w="3310"/>
+            <w:tcW w:type="dxa" w:w="3196"/>
             <w:tcBorders>
               <w:top w:val="single" w:color="BFBFBF" w:sz="4"/>
               <w:left w:val="single" w:color="BFBFBF" w:sz="4"/>
@@ -2591,7 +2648,7 @@
         </w:tc>
         <w:tc>
           <w:tcPr>
-            <w:tcW w:type="dxa" w:w="1265"/>
+            <w:tcW w:type="dxa" w:w="1551"/>
             <w:tcBorders>
               <w:top w:val="single" w:color="BFBFBF" w:sz="4"/>
               <w:left w:val="single" w:color="BFBFBF" w:sz="4"/>
@@ -2618,7 +2675,7 @@
         </w:tc>
         <w:tc>
           <w:tcPr>
-            <w:tcW w:type="dxa" w:w="3311"/>
+            <w:tcW w:type="dxa" w:w="3199"/>
             <w:tcBorders>
               <w:top w:val="single" w:color="BFBFBF" w:sz="4"/>
               <w:left w:val="single" w:color="BFBFBF" w:sz="4"/>
@@ -2650,7 +2707,7 @@
         </w:trPr>
         <w:tc>
           <w:tcPr>
-            <w:tcW w:type="dxa" w:w="1752"/>
+            <w:tcW w:type="dxa" w:w="1692"/>
             <w:tcBorders>
               <w:top w:val="single" w:color="BFBFBF" w:sz="4"/>
               <w:left w:val="single" w:color="BFBFBF" w:sz="4"/>
@@ -2677,7 +2734,7 @@
         </w:tc>
         <w:tc>
           <w:tcPr>
-            <w:tcW w:type="dxa" w:w="3310"/>
+            <w:tcW w:type="dxa" w:w="3196"/>
             <w:tcBorders>
               <w:top w:val="single" w:color="BFBFBF" w:sz="4"/>
               <w:left w:val="single" w:color="BFBFBF" w:sz="4"/>
@@ -2704,7 +2761,7 @@
         </w:tc>
         <w:tc>
           <w:tcPr>
-            <w:tcW w:type="dxa" w:w="1265"/>
+            <w:tcW w:type="dxa" w:w="1551"/>
             <w:tcBorders>
               <w:top w:val="single" w:color="BFBFBF" w:sz="4"/>
               <w:left w:val="single" w:color="BFBFBF" w:sz="4"/>
@@ -2731,7 +2788,7 @@
         </w:tc>
         <w:tc>
           <w:tcPr>
-            <w:tcW w:type="dxa" w:w="3311"/>
+            <w:tcW w:type="dxa" w:w="3199"/>
             <w:tcBorders>
               <w:top w:val="single" w:color="BFBFBF" w:sz="4"/>
               <w:left w:val="single" w:color="BFBFBF" w:sz="4"/>
@@ -2763,7 +2820,7 @@
         </w:trPr>
         <w:tc>
           <w:tcPr>
-            <w:tcW w:type="dxa" w:w="1752"/>
+            <w:tcW w:type="dxa" w:w="1692"/>
             <w:tcBorders>
               <w:top w:val="single" w:color="BFBFBF" w:sz="4"/>
               <w:left w:val="single" w:color="BFBFBF" w:sz="4"/>
@@ -2790,7 +2847,7 @@
         </w:tc>
         <w:tc>
           <w:tcPr>
-            <w:tcW w:type="dxa" w:w="3310"/>
+            <w:tcW w:type="dxa" w:w="3196"/>
             <w:tcBorders>
               <w:top w:val="single" w:color="BFBFBF" w:sz="4"/>
               <w:left w:val="single" w:color="BFBFBF" w:sz="4"/>
@@ -2817,7 +2874,7 @@
         </w:tc>
         <w:tc>
           <w:tcPr>
-            <w:tcW w:type="dxa" w:w="1265"/>
+            <w:tcW w:type="dxa" w:w="1551"/>
             <w:tcBorders>
               <w:top w:val="single" w:color="BFBFBF" w:sz="4"/>
               <w:left w:val="single" w:color="BFBFBF" w:sz="4"/>
@@ -2844,7 +2901,7 @@
         </w:tc>
         <w:tc>
           <w:tcPr>
-            <w:tcW w:type="dxa" w:w="3311"/>
+            <w:tcW w:type="dxa" w:w="3199"/>
             <w:tcBorders>
               <w:top w:val="single" w:color="BFBFBF" w:sz="4"/>
               <w:left w:val="single" w:color="BFBFBF" w:sz="4"/>
@@ -2876,7 +2933,7 @@
         </w:trPr>
         <w:tc>
           <w:tcPr>
-            <w:tcW w:type="dxa" w:w="1752"/>
+            <w:tcW w:type="dxa" w:w="1692"/>
             <w:tcBorders>
               <w:top w:val="single" w:color="BFBFBF" w:sz="4"/>
               <w:left w:val="single" w:color="BFBFBF" w:sz="4"/>
@@ -2903,7 +2960,7 @@
         </w:tc>
         <w:tc>
           <w:tcPr>
-            <w:tcW w:type="dxa" w:w="3310"/>
+            <w:tcW w:type="dxa" w:w="3196"/>
             <w:tcBorders>
               <w:top w:val="single" w:color="BFBFBF" w:sz="4"/>
               <w:left w:val="single" w:color="BFBFBF" w:sz="4"/>
@@ -2930,7 +2987,7 @@
         </w:tc>
         <w:tc>
           <w:tcPr>
-            <w:tcW w:type="dxa" w:w="1265"/>
+            <w:tcW w:type="dxa" w:w="1551"/>
             <w:tcBorders>
               <w:top w:val="single" w:color="BFBFBF" w:sz="4"/>
               <w:left w:val="single" w:color="BFBFBF" w:sz="4"/>
@@ -2957,7 +3014,7 @@
         </w:tc>
         <w:tc>
           <w:tcPr>
-            <w:tcW w:type="dxa" w:w="3311"/>
+            <w:tcW w:type="dxa" w:w="3199"/>
             <w:tcBorders>
               <w:top w:val="single" w:color="BFBFBF" w:sz="4"/>
               <w:left w:val="single" w:color="BFBFBF" w:sz="4"/>
@@ -2989,7 +3046,7 @@
         </w:trPr>
         <w:tc>
           <w:tcPr>
-            <w:tcW w:type="dxa" w:w="1752"/>
+            <w:tcW w:type="dxa" w:w="1692"/>
             <w:tcBorders>
               <w:top w:val="single" w:color="BFBFBF" w:sz="4"/>
               <w:left w:val="single" w:color="BFBFBF" w:sz="4"/>
@@ -3016,7 +3073,7 @@
         </w:tc>
         <w:tc>
           <w:tcPr>
-            <w:tcW w:type="dxa" w:w="3310"/>
+            <w:tcW w:type="dxa" w:w="3196"/>
             <w:tcBorders>
               <w:top w:val="single" w:color="BFBFBF" w:sz="4"/>
               <w:left w:val="single" w:color="BFBFBF" w:sz="4"/>
@@ -3043,7 +3100,7 @@
         </w:tc>
         <w:tc>
           <w:tcPr>
-            <w:tcW w:type="dxa" w:w="1265"/>
+            <w:tcW w:type="dxa" w:w="1551"/>
             <w:tcBorders>
               <w:top w:val="single" w:color="BFBFBF" w:sz="4"/>
               <w:left w:val="single" w:color="BFBFBF" w:sz="4"/>
@@ -3070,7 +3127,7 @@
         </w:tc>
         <w:tc>
           <w:tcPr>
-            <w:tcW w:type="dxa" w:w="3311"/>
+            <w:tcW w:type="dxa" w:w="3199"/>
             <w:tcBorders>
               <w:top w:val="single" w:color="BFBFBF" w:sz="4"/>
               <w:left w:val="single" w:color="BFBFBF" w:sz="4"/>
@@ -3102,7 +3159,7 @@
         </w:trPr>
         <w:tc>
           <w:tcPr>
-            <w:tcW w:type="dxa" w:w="1752"/>
+            <w:tcW w:type="dxa" w:w="1692"/>
             <w:tcBorders>
               <w:top w:val="single" w:color="BFBFBF" w:sz="4"/>
               <w:left w:val="single" w:color="BFBFBF" w:sz="4"/>
@@ -3129,7 +3186,7 @@
         </w:tc>
         <w:tc>
           <w:tcPr>
-            <w:tcW w:type="dxa" w:w="3310"/>
+            <w:tcW w:type="dxa" w:w="3196"/>
             <w:tcBorders>
               <w:top w:val="single" w:color="BFBFBF" w:sz="4"/>
               <w:left w:val="single" w:color="BFBFBF" w:sz="4"/>
@@ -3156,7 +3213,7 @@
         </w:tc>
         <w:tc>
           <w:tcPr>
-            <w:tcW w:type="dxa" w:w="1265"/>
+            <w:tcW w:type="dxa" w:w="1551"/>
             <w:tcBorders>
               <w:top w:val="single" w:color="BFBFBF" w:sz="4"/>
               <w:left w:val="single" w:color="BFBFBF" w:sz="4"/>
@@ -3183,7 +3240,7 @@
         </w:tc>
         <w:tc>
           <w:tcPr>
-            <w:tcW w:type="dxa" w:w="3311"/>
+            <w:tcW w:type="dxa" w:w="3199"/>
             <w:tcBorders>
               <w:top w:val="single" w:color="BFBFBF" w:sz="4"/>
               <w:left w:val="single" w:color="BFBFBF" w:sz="4"/>
@@ -3215,7 +3272,7 @@
         </w:trPr>
         <w:tc>
           <w:tcPr>
-            <w:tcW w:type="dxa" w:w="1752"/>
+            <w:tcW w:type="dxa" w:w="1692"/>
             <w:tcBorders>
               <w:top w:val="single" w:color="BFBFBF" w:sz="4"/>
               <w:left w:val="single" w:color="BFBFBF" w:sz="4"/>
@@ -3242,7 +3299,7 @@
         </w:tc>
         <w:tc>
           <w:tcPr>
-            <w:tcW w:type="dxa" w:w="3310"/>
+            <w:tcW w:type="dxa" w:w="3196"/>
             <w:tcBorders>
               <w:top w:val="single" w:color="BFBFBF" w:sz="4"/>
               <w:left w:val="single" w:color="BFBFBF" w:sz="4"/>
@@ -3269,7 +3326,7 @@
         </w:tc>
         <w:tc>
           <w:tcPr>
-            <w:tcW w:type="dxa" w:w="1265"/>
+            <w:tcW w:type="dxa" w:w="1551"/>
             <w:tcBorders>
               <w:top w:val="single" w:color="BFBFBF" w:sz="4"/>
               <w:left w:val="single" w:color="BFBFBF" w:sz="4"/>
@@ -3296,7 +3353,7 @@
         </w:tc>
         <w:tc>
           <w:tcPr>
-            <w:tcW w:type="dxa" w:w="3311"/>
+            <w:tcW w:type="dxa" w:w="3199"/>
             <w:tcBorders>
               <w:top w:val="single" w:color="BFBFBF" w:sz="4"/>
               <w:left w:val="single" w:color="BFBFBF" w:sz="4"/>
@@ -3328,7 +3385,7 @@
         </w:trPr>
         <w:tc>
           <w:tcPr>
-            <w:tcW w:type="dxa" w:w="1752"/>
+            <w:tcW w:type="dxa" w:w="1692"/>
             <w:tcBorders>
               <w:top w:val="single" w:color="BFBFBF" w:sz="4"/>
               <w:left w:val="single" w:color="BFBFBF" w:sz="4"/>
@@ -3355,7 +3412,7 @@
         </w:tc>
         <w:tc>
           <w:tcPr>
-            <w:tcW w:type="dxa" w:w="3310"/>
+            <w:tcW w:type="dxa" w:w="3196"/>
             <w:tcBorders>
               <w:top w:val="single" w:color="BFBFBF" w:sz="4"/>
               <w:left w:val="single" w:color="BFBFBF" w:sz="4"/>
@@ -3382,7 +3439,7 @@
         </w:tc>
         <w:tc>
           <w:tcPr>
-            <w:tcW w:type="dxa" w:w="1265"/>
+            <w:tcW w:type="dxa" w:w="1551"/>
             <w:tcBorders>
               <w:top w:val="single" w:color="BFBFBF" w:sz="4"/>
               <w:left w:val="single" w:color="BFBFBF" w:sz="4"/>
@@ -3409,7 +3466,7 @@
         </w:tc>
         <w:tc>
           <w:tcPr>
-            <w:tcW w:type="dxa" w:w="3311"/>
+            <w:tcW w:type="dxa" w:w="3199"/>
             <w:tcBorders>
               <w:top w:val="single" w:color="BFBFBF" w:sz="4"/>
               <w:left w:val="single" w:color="BFBFBF" w:sz="4"/>
@@ -3441,7 +3498,7 @@
         </w:trPr>
         <w:tc>
           <w:tcPr>
-            <w:tcW w:type="dxa" w:w="1752"/>
+            <w:tcW w:type="dxa" w:w="1692"/>
             <w:tcBorders>
               <w:top w:val="single" w:color="BFBFBF" w:sz="4"/>
               <w:left w:val="single" w:color="BFBFBF" w:sz="4"/>
@@ -3468,7 +3525,7 @@
         </w:tc>
         <w:tc>
           <w:tcPr>
-            <w:tcW w:type="dxa" w:w="3310"/>
+            <w:tcW w:type="dxa" w:w="3196"/>
             <w:tcBorders>
               <w:top w:val="single" w:color="BFBFBF" w:sz="4"/>
               <w:left w:val="single" w:color="BFBFBF" w:sz="4"/>
@@ -3495,7 +3552,7 @@
         </w:tc>
         <w:tc>
           <w:tcPr>
-            <w:tcW w:type="dxa" w:w="1265"/>
+            <w:tcW w:type="dxa" w:w="1551"/>
             <w:tcBorders>
               <w:top w:val="single" w:color="BFBFBF" w:sz="4"/>
               <w:left w:val="single" w:color="BFBFBF" w:sz="4"/>
@@ -3522,7 +3579,7 @@
         </w:tc>
         <w:tc>
           <w:tcPr>
-            <w:tcW w:type="dxa" w:w="3311"/>
+            <w:tcW w:type="dxa" w:w="3199"/>
             <w:tcBorders>
               <w:top w:val="single" w:color="BFBFBF" w:sz="4"/>
               <w:left w:val="single" w:color="BFBFBF" w:sz="4"/>
@@ -3554,7 +3611,7 @@
         </w:trPr>
         <w:tc>
           <w:tcPr>
-            <w:tcW w:type="dxa" w:w="1752"/>
+            <w:tcW w:type="dxa" w:w="1692"/>
             <w:tcBorders>
               <w:top w:val="single" w:color="BFBFBF" w:sz="4"/>
               <w:left w:val="single" w:color="BFBFBF" w:sz="4"/>
@@ -3581,7 +3638,7 @@
         </w:tc>
         <w:tc>
           <w:tcPr>
-            <w:tcW w:type="dxa" w:w="3310"/>
+            <w:tcW w:type="dxa" w:w="3196"/>
             <w:tcBorders>
               <w:top w:val="single" w:color="BFBFBF" w:sz="4"/>
               <w:left w:val="single" w:color="BFBFBF" w:sz="4"/>
@@ -3608,7 +3665,7 @@
         </w:tc>
         <w:tc>
           <w:tcPr>
-            <w:tcW w:type="dxa" w:w="1265"/>
+            <w:tcW w:type="dxa" w:w="1551"/>
             <w:tcBorders>
               <w:top w:val="single" w:color="BFBFBF" w:sz="4"/>
               <w:left w:val="single" w:color="BFBFBF" w:sz="4"/>
@@ -3635,7 +3692,7 @@
         </w:tc>
         <w:tc>
           <w:tcPr>
-            <w:tcW w:type="dxa" w:w="3311"/>
+            <w:tcW w:type="dxa" w:w="3199"/>
             <w:tcBorders>
               <w:top w:val="single" w:color="BFBFBF" w:sz="4"/>
               <w:left w:val="single" w:color="BFBFBF" w:sz="4"/>
@@ -3667,7 +3724,7 @@
         </w:trPr>
         <w:tc>
           <w:tcPr>
-            <w:tcW w:type="dxa" w:w="1752"/>
+            <w:tcW w:type="dxa" w:w="1692"/>
             <w:tcBorders>
               <w:top w:val="single" w:color="BFBFBF" w:sz="4"/>
               <w:left w:val="single" w:color="BFBFBF" w:sz="4"/>
@@ -3694,7 +3751,7 @@
         </w:tc>
         <w:tc>
           <w:tcPr>
-            <w:tcW w:type="dxa" w:w="3310"/>
+            <w:tcW w:type="dxa" w:w="3196"/>
             <w:tcBorders>
               <w:top w:val="single" w:color="BFBFBF" w:sz="4"/>
               <w:left w:val="single" w:color="BFBFBF" w:sz="4"/>
@@ -3721,7 +3778,7 @@
         </w:tc>
         <w:tc>
           <w:tcPr>
-            <w:tcW w:type="dxa" w:w="1265"/>
+            <w:tcW w:type="dxa" w:w="1551"/>
             <w:tcBorders>
               <w:top w:val="single" w:color="BFBFBF" w:sz="4"/>
               <w:left w:val="single" w:color="BFBFBF" w:sz="4"/>
@@ -3748,7 +3805,7 @@
         </w:tc>
         <w:tc>
           <w:tcPr>
-            <w:tcW w:type="dxa" w:w="3311"/>
+            <w:tcW w:type="dxa" w:w="3199"/>
             <w:tcBorders>
               <w:top w:val="single" w:color="BFBFBF" w:sz="4"/>
               <w:left w:val="single" w:color="BFBFBF" w:sz="4"/>
@@ -3780,7 +3837,7 @@
         </w:trPr>
         <w:tc>
           <w:tcPr>
-            <w:tcW w:type="dxa" w:w="1752"/>
+            <w:tcW w:type="dxa" w:w="1692"/>
             <w:tcBorders>
               <w:top w:val="single" w:color="BFBFBF" w:sz="4"/>
               <w:left w:val="single" w:color="BFBFBF" w:sz="4"/>
@@ -3807,7 +3864,7 @@
         </w:tc>
         <w:tc>
           <w:tcPr>
-            <w:tcW w:type="dxa" w:w="3310"/>
+            <w:tcW w:type="dxa" w:w="3196"/>
             <w:tcBorders>
               <w:top w:val="single" w:color="BFBFBF" w:sz="4"/>
               <w:left w:val="single" w:color="BFBFBF" w:sz="4"/>
@@ -3834,7 +3891,7 @@
         </w:tc>
         <w:tc>
           <w:tcPr>
-            <w:tcW w:type="dxa" w:w="1265"/>
+            <w:tcW w:type="dxa" w:w="1551"/>
             <w:tcBorders>
               <w:top w:val="single" w:color="BFBFBF" w:sz="4"/>
               <w:left w:val="single" w:color="BFBFBF" w:sz="4"/>
@@ -3861,7 +3918,7 @@
         </w:tc>
         <w:tc>
           <w:tcPr>
-            <w:tcW w:type="dxa" w:w="3311"/>
+            <w:tcW w:type="dxa" w:w="3199"/>
             <w:tcBorders>
               <w:top w:val="single" w:color="BFBFBF" w:sz="4"/>
               <w:left w:val="single" w:color="BFBFBF" w:sz="4"/>
@@ -3893,7 +3950,7 @@
         </w:trPr>
         <w:tc>
           <w:tcPr>
-            <w:tcW w:type="dxa" w:w="1752"/>
+            <w:tcW w:type="dxa" w:w="1692"/>
             <w:tcBorders>
               <w:top w:val="single" w:color="BFBFBF" w:sz="4"/>
               <w:left w:val="single" w:color="BFBFBF" w:sz="4"/>
@@ -3920,7 +3977,7 @@
         </w:tc>
         <w:tc>
           <w:tcPr>
-            <w:tcW w:type="dxa" w:w="3310"/>
+            <w:tcW w:type="dxa" w:w="3196"/>
             <w:tcBorders>
               <w:top w:val="single" w:color="BFBFBF" w:sz="4"/>
               <w:left w:val="single" w:color="BFBFBF" w:sz="4"/>
@@ -3947,7 +4004,7 @@
         </w:tc>
         <w:tc>
           <w:tcPr>
-            <w:tcW w:type="dxa" w:w="1265"/>
+            <w:tcW w:type="dxa" w:w="1551"/>
             <w:tcBorders>
               <w:top w:val="single" w:color="BFBFBF" w:sz="4"/>
               <w:left w:val="single" w:color="BFBFBF" w:sz="4"/>
@@ -3974,7 +4031,7 @@
         </w:tc>
         <w:tc>
           <w:tcPr>
-            <w:tcW w:type="dxa" w:w="3311"/>
+            <w:tcW w:type="dxa" w:w="3199"/>
             <w:tcBorders>
               <w:top w:val="single" w:color="BFBFBF" w:sz="4"/>
               <w:left w:val="single" w:color="BFBFBF" w:sz="4"/>
@@ -4006,7 +4063,7 @@
         </w:trPr>
         <w:tc>
           <w:tcPr>
-            <w:tcW w:type="dxa" w:w="1752"/>
+            <w:tcW w:type="dxa" w:w="1692"/>
             <w:tcBorders>
               <w:top w:val="single" w:color="BFBFBF" w:sz="4"/>
               <w:left w:val="single" w:color="BFBFBF" w:sz="4"/>
@@ -4033,7 +4090,7 @@
         </w:tc>
         <w:tc>
           <w:tcPr>
-            <w:tcW w:type="dxa" w:w="3310"/>
+            <w:tcW w:type="dxa" w:w="3196"/>
             <w:tcBorders>
               <w:top w:val="single" w:color="BFBFBF" w:sz="4"/>
               <w:left w:val="single" w:color="BFBFBF" w:sz="4"/>
@@ -4060,7 +4117,7 @@
         </w:tc>
         <w:tc>
           <w:tcPr>
-            <w:tcW w:type="dxa" w:w="1265"/>
+            <w:tcW w:type="dxa" w:w="1551"/>
             <w:tcBorders>
               <w:top w:val="single" w:color="BFBFBF" w:sz="4"/>
               <w:left w:val="single" w:color="BFBFBF" w:sz="4"/>
@@ -4087,7 +4144,7 @@
         </w:tc>
         <w:tc>
           <w:tcPr>
-            <w:tcW w:type="dxa" w:w="3311"/>
+            <w:tcW w:type="dxa" w:w="3199"/>
             <w:tcBorders>
               <w:top w:val="single" w:color="BFBFBF" w:sz="4"/>
               <w:left w:val="single" w:color="BFBFBF" w:sz="4"/>
@@ -4119,7 +4176,7 @@
         </w:trPr>
         <w:tc>
           <w:tcPr>
-            <w:tcW w:type="dxa" w:w="1752"/>
+            <w:tcW w:type="dxa" w:w="1692"/>
             <w:tcBorders>
               <w:top w:val="single" w:color="BFBFBF" w:sz="4"/>
               <w:left w:val="single" w:color="BFBFBF" w:sz="4"/>
@@ -4146,7 +4203,7 @@
         </w:tc>
         <w:tc>
           <w:tcPr>
-            <w:tcW w:type="dxa" w:w="3310"/>
+            <w:tcW w:type="dxa" w:w="3196"/>
             <w:tcBorders>
               <w:top w:val="single" w:color="BFBFBF" w:sz="4"/>
               <w:left w:val="single" w:color="BFBFBF" w:sz="4"/>
@@ -4173,7 +4230,7 @@
         </w:tc>
         <w:tc>
           <w:tcPr>
-            <w:tcW w:type="dxa" w:w="1265"/>
+            <w:tcW w:type="dxa" w:w="1551"/>
             <w:tcBorders>
               <w:top w:val="single" w:color="BFBFBF" w:sz="4"/>
               <w:left w:val="single" w:color="BFBFBF" w:sz="4"/>
@@ -4200,7 +4257,7 @@
         </w:tc>
         <w:tc>
           <w:tcPr>
-            <w:tcW w:type="dxa" w:w="3311"/>
+            <w:tcW w:type="dxa" w:w="3199"/>
             <w:tcBorders>
               <w:top w:val="single" w:color="BFBFBF" w:sz="4"/>
               <w:left w:val="single" w:color="BFBFBF" w:sz="4"/>
@@ -4232,7 +4289,7 @@
         </w:trPr>
         <w:tc>
           <w:tcPr>
-            <w:tcW w:type="dxa" w:w="1752"/>
+            <w:tcW w:type="dxa" w:w="1692"/>
             <w:tcBorders>
               <w:top w:val="single" w:color="BFBFBF" w:sz="4"/>
               <w:left w:val="single" w:color="BFBFBF" w:sz="4"/>
@@ -4259,7 +4316,7 @@
         </w:tc>
         <w:tc>
           <w:tcPr>
-            <w:tcW w:type="dxa" w:w="3310"/>
+            <w:tcW w:type="dxa" w:w="3196"/>
             <w:tcBorders>
               <w:top w:val="single" w:color="BFBFBF" w:sz="4"/>
               <w:left w:val="single" w:color="BFBFBF" w:sz="4"/>
@@ -4286,7 +4343,7 @@
         </w:tc>
         <w:tc>
           <w:tcPr>
-            <w:tcW w:type="dxa" w:w="1265"/>
+            <w:tcW w:type="dxa" w:w="1551"/>
             <w:tcBorders>
               <w:top w:val="single" w:color="BFBFBF" w:sz="4"/>
               <w:left w:val="single" w:color="BFBFBF" w:sz="4"/>
@@ -4313,7 +4370,7 @@
         </w:tc>
         <w:tc>
           <w:tcPr>
-            <w:tcW w:type="dxa" w:w="3311"/>
+            <w:tcW w:type="dxa" w:w="3199"/>
             <w:tcBorders>
               <w:top w:val="single" w:color="BFBFBF" w:sz="4"/>
               <w:left w:val="single" w:color="BFBFBF" w:sz="4"/>
@@ -4345,7 +4402,7 @@
         </w:trPr>
         <w:tc>
           <w:tcPr>
-            <w:tcW w:type="dxa" w:w="1752"/>
+            <w:tcW w:type="dxa" w:w="1692"/>
             <w:tcBorders>
               <w:top w:val="single" w:color="BFBFBF" w:sz="4"/>
               <w:left w:val="single" w:color="BFBFBF" w:sz="4"/>
@@ -4372,7 +4429,7 @@
         </w:tc>
         <w:tc>
           <w:tcPr>
-            <w:tcW w:type="dxa" w:w="3310"/>
+            <w:tcW w:type="dxa" w:w="3196"/>
             <w:tcBorders>
               <w:top w:val="single" w:color="BFBFBF" w:sz="4"/>
               <w:left w:val="single" w:color="BFBFBF" w:sz="4"/>
@@ -4399,7 +4456,7 @@
         </w:tc>
         <w:tc>
           <w:tcPr>
-            <w:tcW w:type="dxa" w:w="1265"/>
+            <w:tcW w:type="dxa" w:w="1551"/>
             <w:tcBorders>
               <w:top w:val="single" w:color="BFBFBF" w:sz="4"/>
               <w:left w:val="single" w:color="BFBFBF" w:sz="4"/>
@@ -4426,7 +4483,7 @@
         </w:tc>
         <w:tc>
           <w:tcPr>
-            <w:tcW w:type="dxa" w:w="3311"/>
+            <w:tcW w:type="dxa" w:w="3199"/>
             <w:tcBorders>
               <w:top w:val="single" w:color="BFBFBF" w:sz="4"/>
               <w:left w:val="single" w:color="BFBFBF" w:sz="4"/>
@@ -4458,7 +4515,7 @@
         </w:trPr>
         <w:tc>
           <w:tcPr>
-            <w:tcW w:type="dxa" w:w="1752"/>
+            <w:tcW w:type="dxa" w:w="1692"/>
             <w:tcBorders>
               <w:top w:val="single" w:color="BFBFBF" w:sz="4"/>
               <w:left w:val="single" w:color="BFBFBF" w:sz="4"/>
@@ -4485,7 +4542,7 @@
         </w:tc>
         <w:tc>
           <w:tcPr>
-            <w:tcW w:type="dxa" w:w="3310"/>
+            <w:tcW w:type="dxa" w:w="3196"/>
             <w:tcBorders>
               <w:top w:val="single" w:color="BFBFBF" w:sz="4"/>
               <w:left w:val="single" w:color="BFBFBF" w:sz="4"/>
@@ -4512,7 +4569,7 @@
         </w:tc>
         <w:tc>
           <w:tcPr>
-            <w:tcW w:type="dxa" w:w="1265"/>
+            <w:tcW w:type="dxa" w:w="1551"/>
             <w:tcBorders>
               <w:top w:val="single" w:color="BFBFBF" w:sz="4"/>
               <w:left w:val="single" w:color="BFBFBF" w:sz="4"/>
@@ -4539,7 +4596,7 @@
         </w:tc>
         <w:tc>
           <w:tcPr>
-            <w:tcW w:type="dxa" w:w="3311"/>
+            <w:tcW w:type="dxa" w:w="3199"/>
             <w:tcBorders>
               <w:top w:val="single" w:color="BFBFBF" w:sz="4"/>
               <w:left w:val="single" w:color="BFBFBF" w:sz="4"/>
@@ -4571,7 +4628,7 @@
         </w:trPr>
         <w:tc>
           <w:tcPr>
-            <w:tcW w:type="dxa" w:w="1752"/>
+            <w:tcW w:type="dxa" w:w="1692"/>
             <w:tcBorders>
               <w:top w:val="single" w:color="BFBFBF" w:sz="4"/>
               <w:left w:val="single" w:color="BFBFBF" w:sz="4"/>
@@ -4598,7 +4655,7 @@
         </w:tc>
         <w:tc>
           <w:tcPr>
-            <w:tcW w:type="dxa" w:w="3310"/>
+            <w:tcW w:type="dxa" w:w="3196"/>
             <w:tcBorders>
               <w:top w:val="single" w:color="BFBFBF" w:sz="4"/>
               <w:left w:val="single" w:color="BFBFBF" w:sz="4"/>
@@ -4625,7 +4682,7 @@
         </w:tc>
         <w:tc>
           <w:tcPr>
-            <w:tcW w:type="dxa" w:w="1265"/>
+            <w:tcW w:type="dxa" w:w="1551"/>
             <w:tcBorders>
               <w:top w:val="single" w:color="BFBFBF" w:sz="4"/>
               <w:left w:val="single" w:color="BFBFBF" w:sz="4"/>
@@ -4652,7 +4709,7 @@
         </w:tc>
         <w:tc>
           <w:tcPr>
-            <w:tcW w:type="dxa" w:w="3311"/>
+            <w:tcW w:type="dxa" w:w="3199"/>
             <w:tcBorders>
               <w:top w:val="single" w:color="BFBFBF" w:sz="4"/>
               <w:left w:val="single" w:color="BFBFBF" w:sz="4"/>
@@ -4674,6 +4731,119 @@
                 <w:szCs w:val="20"/>
               </w:rPr>
               <w:t xml:space="preserve">How the claimant suggests the defendant pays when they reject the date or plan.</w:t>
+            </w:r>
+          </w:p>
+        </w:tc>
+      </w:tr>
+      <w:tr>
+        <w:trPr>
+          <w:tblHeader w:val="off"/>
+        </w:trPr>
+        <w:tc>
+          <w:tcPr>
+            <w:tcW w:type="dxa" w:w="1692"/>
+            <w:tcBorders>
+              <w:top w:val="single" w:color="BFBFBF" w:sz="4"/>
+              <w:left w:val="single" w:color="BFBFBF" w:sz="4"/>
+              <w:bottom w:val="single" w:color="BFBFBF" w:sz="4"/>
+              <w:right w:val="single" w:color="BFBFBF" w:sz="4"/>
+            </w:tcBorders>
+            <w:tcMar>
+              <w:top w:type="dxa" w:w="60"/>
+              <w:left w:type="dxa" w:w="100"/>
+              <w:bottom w:type="dxa" w:w="60"/>
+              <w:right w:type="dxa" w:w="100"/>
+            </w:tcMar>
+          </w:tcPr>
+          <w:p>
+            <w:r>
+              <w:rPr>
+                <w:rFonts w:ascii="Courier New" w:cs="Courier New" w:eastAsia="Courier New" w:hAnsi="Courier New"/>
+                <w:sz w:val="20"/>
+                <w:szCs w:val="20"/>
+              </w:rPr>
+              <w:t xml:space="preserve">FINAL_ORDER</w:t>
+            </w:r>
+          </w:p>
+        </w:tc>
+        <w:tc>
+          <w:tcPr>
+            <w:tcW w:type="dxa" w:w="3196"/>
+            <w:tcBorders>
+              <w:top w:val="single" w:color="BFBFBF" w:sz="4"/>
+              <w:left w:val="single" w:color="BFBFBF" w:sz="4"/>
+              <w:bottom w:val="single" w:color="BFBFBF" w:sz="4"/>
+              <w:right w:val="single" w:color="BFBFBF" w:sz="4"/>
+            </w:tcBorders>
+            <w:tcMar>
+              <w:top w:type="dxa" w:w="60"/>
+              <w:left w:type="dxa" w:w="100"/>
+              <w:bottom w:type="dxa" w:w="60"/>
+              <w:right w:type="dxa" w:w="100"/>
+            </w:tcMar>
+          </w:tcPr>
+          <w:p>
+            <w:r>
+              <w:rPr>
+                <w:rFonts w:ascii="Arial" w:cs="Arial" w:eastAsia="Arial" w:hAnsi="Arial"/>
+                <w:sz w:val="20"/>
+                <w:szCs w:val="20"/>
+              </w:rPr>
+              <w:t xml:space="preserve">Fast: FREE_FORM_ORDER, ASSISTED_ORDER. Intermediate: BLANK_TEMPLATE_AFTER_HEARING, BLANK_TEMPLATE_BEFORE_HEARING, FIX_A_DATE_FOR_CMC. Multi: those three and FIX_A_DATE_FOR_CCMC</w:t>
+            </w:r>
+          </w:p>
+        </w:tc>
+        <w:tc>
+          <w:tcPr>
+            <w:tcW w:type="dxa" w:w="1551"/>
+            <w:tcBorders>
+              <w:top w:val="single" w:color="BFBFBF" w:sz="4"/>
+              <w:left w:val="single" w:color="BFBFBF" w:sz="4"/>
+              <w:bottom w:val="single" w:color="BFBFBF" w:sz="4"/>
+              <w:right w:val="single" w:color="BFBFBF" w:sz="4"/>
+            </w:tcBorders>
+            <w:tcMar>
+              <w:top w:type="dxa" w:w="60"/>
+              <w:left w:type="dxa" w:w="100"/>
+              <w:bottom w:type="dxa" w:w="60"/>
+              <w:right w:type="dxa" w:w="100"/>
+            </w:tcMar>
+          </w:tcPr>
+          <w:p>
+            <w:r>
+              <w:rPr>
+                <w:rFonts w:ascii="Arial" w:cs="Arial" w:eastAsia="Arial" w:hAnsi="Arial"/>
+                <w:sz w:val="20"/>
+                <w:szCs w:val="20"/>
+              </w:rPr>
+              <w:t xml:space="preserve">First order for the track</w:t>
+            </w:r>
+          </w:p>
+        </w:tc>
+        <w:tc>
+          <w:tcPr>
+            <w:tcW w:type="dxa" w:w="3199"/>
+            <w:tcBorders>
+              <w:top w:val="single" w:color="BFBFBF" w:sz="4"/>
+              <w:left w:val="single" w:color="BFBFBF" w:sz="4"/>
+              <w:bottom w:val="single" w:color="BFBFBF" w:sz="4"/>
+              <w:right w:val="single" w:color="BFBFBF" w:sz="4"/>
+            </w:tcBorders>
+            <w:tcMar>
+              <w:top w:type="dxa" w:w="60"/>
+              <w:left w:type="dxa" w:w="100"/>
+              <w:bottom w:type="dxa" w:w="60"/>
+              <w:right w:type="dxa" w:w="100"/>
+            </w:tcMar>
+          </w:tcPr>
+          <w:p>
+            <w:r>
+              <w:rPr>
+                <w:rFonts w:ascii="Arial" w:cs="Arial" w:eastAsia="Arial" w:hAnsi="Arial"/>
+                <w:sz w:val="20"/>
+                <w:szCs w:val="20"/>
+              </w:rPr>
+              <w:t xml:space="preserve">FREE_FORM_ORDER on fast, BLANK_TEMPLATE_AFTER_HEARING on intermediate and multi. Any other value stops the run.</w:t>
             </w:r>
           </w:p>
         </w:tc>

</xml_diff>

<commit_message>
Let specified defendants giving their finances be self-employed
RESPONDENT1_EMPLOYMENT and RESPONDENT2_EMPLOYMENT set what each
defendant says about their work when they admit the claim and give
their finances: RETIRED, as before, or SELF_EMPLOYED, a plumber with a
£30,000 turnover who is not behind on their tax. The UI answers each
defendant's employment and self-employment pages, and the API submit
sends the same answers.

In a 1v2DS claim, Defendant 2's solicitor should never see Defendant 1's
self-employment or income and expenses pages, which hold Defendant 1's
answers. The CCD definition currently shows them because their show
conditions do not check isRespondent1, so the response step now fails,
naming the page, rather than answering Defendant 1's fields. The guide
covers the new settings and this check, and the Word copy is
regenerated.
</commit_message>
<xml_diff>
--- a/playwright-tests/RUNNING_SPECIFIED_TESTS.docx
+++ b/playwright-tests/RUNNING_SPECIFIED_TESTS.docx
@@ -675,7 +675,7 @@
         <w:rPr>
           <w:rFonts w:ascii="Arial" w:cs="Arial" w:eastAsia="Arial" w:hAnsi="Arial"/>
         </w:rPr>
-        <w:t xml:space="preserve">Full or part admission: ADMISSION_PAYMENT_ROUTE picks when they will pay. IMMEDIATELY (the default), BY_SET_DATE (a month from today) or SUGGESTION_OF_REPAYMENT_PLAN (£100 a month, starting a month from today). The defendant's financial details are filled in wherever XUI asks for them.</w:t>
+        <w:t xml:space="preserve">Full or part admission: ADMISSION_PAYMENT_ROUTE picks when they will pay. IMMEDIATELY (the default), BY_SET_DATE (a month from today) or SUGGESTION_OF_REPAYMENT_PLAN (£100 a month, starting a month from today). The defendant's financial details are filled in wherever XUI asks for them: an individual or sole trader not paying immediately owns their home, has no partner, children, dependants, debts or court orders, and is retired or self-employed (RESPONDENT1_EMPLOYMENT and RESPONDENT2_EMPLOYMENT). A self-employed defendant is a plumber with a £30,000 turnover who is not behind on their tax.</w:t>
       </w:r>
     </w:p>
     <w:p>
@@ -1100,6 +1100,17 @@
     </w:p>
     <w:p>
       <w:pPr>
+        <w:spacing w:after="120"/>
+      </w:pPr>
+      <w:r>
+        <w:rPr>
+          <w:rFonts w:ascii="Arial" w:cs="Arial" w:eastAsia="Arial" w:hAnsi="Arial"/>
+        </w:rPr>
+        <w:t xml:space="preserve">In a 1v2DS claim Defendant 2's solicitor should only see Defendant 2's financial pages. If they are shown one of Defendant 1's (DefendantSelfEmployment, DefendantIncomeExpenses or DefendantIncomeExpensesFullAdmission, which hold Defendant 1's answers), the step fails. Those pages' show conditions in the CCD definition need isRespondent1 = "Yes"; until that fix is deployed, a 1v2DS claim where both defendants admit and pay later fails at Defendant 2's response.</w:t>
+      </w:r>
+    </w:p>
+    <w:p>
+      <w:pPr>
         <w:shd w:fill="F2F2F2" w:color="auto" w:val="clear"/>
         <w:spacing w:after="160" w:before="60"/>
       </w:pPr>
@@ -1124,6 +1135,20 @@
           <w:szCs w:val="18"/>
         </w:rPr>
         <w:t xml:space="preserve">ENV=aat RESPONDENT1_RESPONSE=PART_ADMISSION ADMISSION_PAYMENT_ROUTE=SUGGESTION_OF_REPAYMENT_PLAN npx playwright test playwright-tests/e2e/journeys/SpecifiedSS.test.ts --project chromium</w:t>
+      </w:r>
+    </w:p>
+    <w:p>
+      <w:pPr>
+        <w:shd w:fill="F2F2F2" w:color="auto" w:val="clear"/>
+        <w:spacing w:after="160" w:before="60"/>
+      </w:pPr>
+      <w:r>
+        <w:rPr>
+          <w:rFonts w:ascii="Courier New" w:cs="Courier New" w:eastAsia="Courier New" w:hAnsi="Courier New"/>
+          <w:sz w:val="18"/>
+          <w:szCs w:val="18"/>
+        </w:rPr>
+        <w:t xml:space="preserve">ENV=aat RESPONDENT1_RESPONSE=PART_ADMISSION ADMISSION_PAYMENT_ROUTE=SUGGESTION_OF_REPAYMENT_PLAN RESPONDENT1_EMPLOYMENT=SELF_EMPLOYED npx playwright test playwright-tests/e2e/journeys/SpecifiedSS.test.ts --project chromium</w:t>
       </w:r>
     </w:p>
     <w:p>
@@ -4166,6 +4191,232 @@
                 <w:szCs w:val="20"/>
               </w:rPr>
               <w:t xml:space="preserve">Defendant 2's response, or in a 2v1 claim the defendant's response to Claimant 2.</w:t>
+            </w:r>
+          </w:p>
+        </w:tc>
+      </w:tr>
+      <w:tr>
+        <w:trPr>
+          <w:tblHeader w:val="off"/>
+        </w:trPr>
+        <w:tc>
+          <w:tcPr>
+            <w:tcW w:type="dxa" w:w="1692"/>
+            <w:tcBorders>
+              <w:top w:val="single" w:color="BFBFBF" w:sz="4"/>
+              <w:left w:val="single" w:color="BFBFBF" w:sz="4"/>
+              <w:bottom w:val="single" w:color="BFBFBF" w:sz="4"/>
+              <w:right w:val="single" w:color="BFBFBF" w:sz="4"/>
+            </w:tcBorders>
+            <w:tcMar>
+              <w:top w:type="dxa" w:w="60"/>
+              <w:left w:type="dxa" w:w="100"/>
+              <w:bottom w:type="dxa" w:w="60"/>
+              <w:right w:type="dxa" w:w="100"/>
+            </w:tcMar>
+          </w:tcPr>
+          <w:p>
+            <w:r>
+              <w:rPr>
+                <w:rFonts w:ascii="Courier New" w:cs="Courier New" w:eastAsia="Courier New" w:hAnsi="Courier New"/>
+                <w:sz w:val="20"/>
+                <w:szCs w:val="20"/>
+              </w:rPr>
+              <w:t xml:space="preserve">RESPONDENT1_EMPLOYMENT</w:t>
+            </w:r>
+          </w:p>
+        </w:tc>
+        <w:tc>
+          <w:tcPr>
+            <w:tcW w:type="dxa" w:w="3196"/>
+            <w:tcBorders>
+              <w:top w:val="single" w:color="BFBFBF" w:sz="4"/>
+              <w:left w:val="single" w:color="BFBFBF" w:sz="4"/>
+              <w:bottom w:val="single" w:color="BFBFBF" w:sz="4"/>
+              <w:right w:val="single" w:color="BFBFBF" w:sz="4"/>
+            </w:tcBorders>
+            <w:tcMar>
+              <w:top w:type="dxa" w:w="60"/>
+              <w:left w:type="dxa" w:w="100"/>
+              <w:bottom w:type="dxa" w:w="60"/>
+              <w:right w:type="dxa" w:w="100"/>
+            </w:tcMar>
+          </w:tcPr>
+          <w:p>
+            <w:r>
+              <w:rPr>
+                <w:rFonts w:ascii="Arial" w:cs="Arial" w:eastAsia="Arial" w:hAnsi="Arial"/>
+                <w:sz w:val="20"/>
+                <w:szCs w:val="20"/>
+              </w:rPr>
+              <w:t xml:space="preserve">RETIRED, SELF_EMPLOYED</w:t>
+            </w:r>
+          </w:p>
+        </w:tc>
+        <w:tc>
+          <w:tcPr>
+            <w:tcW w:type="dxa" w:w="1551"/>
+            <w:tcBorders>
+              <w:top w:val="single" w:color="BFBFBF" w:sz="4"/>
+              <w:left w:val="single" w:color="BFBFBF" w:sz="4"/>
+              <w:bottom w:val="single" w:color="BFBFBF" w:sz="4"/>
+              <w:right w:val="single" w:color="BFBFBF" w:sz="4"/>
+            </w:tcBorders>
+            <w:tcMar>
+              <w:top w:type="dxa" w:w="60"/>
+              <w:left w:type="dxa" w:w="100"/>
+              <w:bottom w:type="dxa" w:w="60"/>
+              <w:right w:type="dxa" w:w="100"/>
+            </w:tcMar>
+          </w:tcPr>
+          <w:p>
+            <w:r>
+              <w:rPr>
+                <w:rFonts w:ascii="Arial" w:cs="Arial" w:eastAsia="Arial" w:hAnsi="Arial"/>
+                <w:sz w:val="20"/>
+                <w:szCs w:val="20"/>
+              </w:rPr>
+              <w:t xml:space="preserve">RETIRED</w:t>
+            </w:r>
+          </w:p>
+        </w:tc>
+        <w:tc>
+          <w:tcPr>
+            <w:tcW w:type="dxa" w:w="3199"/>
+            <w:tcBorders>
+              <w:top w:val="single" w:color="BFBFBF" w:sz="4"/>
+              <w:left w:val="single" w:color="BFBFBF" w:sz="4"/>
+              <w:bottom w:val="single" w:color="BFBFBF" w:sz="4"/>
+              <w:right w:val="single" w:color="BFBFBF" w:sz="4"/>
+            </w:tcBorders>
+            <w:tcMar>
+              <w:top w:type="dxa" w:w="60"/>
+              <w:left w:type="dxa" w:w="100"/>
+              <w:bottom w:type="dxa" w:w="60"/>
+              <w:right w:type="dxa" w:w="100"/>
+            </w:tcMar>
+          </w:tcPr>
+          <w:p>
+            <w:r>
+              <w:rPr>
+                <w:rFonts w:ascii="Arial" w:cs="Arial" w:eastAsia="Arial" w:hAnsi="Arial"/>
+                <w:sz w:val="20"/>
+                <w:szCs w:val="20"/>
+              </w:rPr>
+              <w:t xml:space="preserve">What Defendant 1 says about their work when they give their finances (an individual or sole trader admitting and not paying immediately).</w:t>
+            </w:r>
+          </w:p>
+        </w:tc>
+      </w:tr>
+      <w:tr>
+        <w:trPr>
+          <w:tblHeader w:val="off"/>
+        </w:trPr>
+        <w:tc>
+          <w:tcPr>
+            <w:tcW w:type="dxa" w:w="1692"/>
+            <w:tcBorders>
+              <w:top w:val="single" w:color="BFBFBF" w:sz="4"/>
+              <w:left w:val="single" w:color="BFBFBF" w:sz="4"/>
+              <w:bottom w:val="single" w:color="BFBFBF" w:sz="4"/>
+              <w:right w:val="single" w:color="BFBFBF" w:sz="4"/>
+            </w:tcBorders>
+            <w:tcMar>
+              <w:top w:type="dxa" w:w="60"/>
+              <w:left w:type="dxa" w:w="100"/>
+              <w:bottom w:type="dxa" w:w="60"/>
+              <w:right w:type="dxa" w:w="100"/>
+            </w:tcMar>
+          </w:tcPr>
+          <w:p>
+            <w:r>
+              <w:rPr>
+                <w:rFonts w:ascii="Courier New" w:cs="Courier New" w:eastAsia="Courier New" w:hAnsi="Courier New"/>
+                <w:sz w:val="20"/>
+                <w:szCs w:val="20"/>
+              </w:rPr>
+              <w:t xml:space="preserve">RESPONDENT2_EMPLOYMENT</w:t>
+            </w:r>
+          </w:p>
+        </w:tc>
+        <w:tc>
+          <w:tcPr>
+            <w:tcW w:type="dxa" w:w="3196"/>
+            <w:tcBorders>
+              <w:top w:val="single" w:color="BFBFBF" w:sz="4"/>
+              <w:left w:val="single" w:color="BFBFBF" w:sz="4"/>
+              <w:bottom w:val="single" w:color="BFBFBF" w:sz="4"/>
+              <w:right w:val="single" w:color="BFBFBF" w:sz="4"/>
+            </w:tcBorders>
+            <w:tcMar>
+              <w:top w:type="dxa" w:w="60"/>
+              <w:left w:type="dxa" w:w="100"/>
+              <w:bottom w:type="dxa" w:w="60"/>
+              <w:right w:type="dxa" w:w="100"/>
+            </w:tcMar>
+          </w:tcPr>
+          <w:p>
+            <w:r>
+              <w:rPr>
+                <w:rFonts w:ascii="Arial" w:cs="Arial" w:eastAsia="Arial" w:hAnsi="Arial"/>
+                <w:sz w:val="20"/>
+                <w:szCs w:val="20"/>
+              </w:rPr>
+              <w:t xml:space="preserve">RETIRED, SELF_EMPLOYED</w:t>
+            </w:r>
+          </w:p>
+        </w:tc>
+        <w:tc>
+          <w:tcPr>
+            <w:tcW w:type="dxa" w:w="1551"/>
+            <w:tcBorders>
+              <w:top w:val="single" w:color="BFBFBF" w:sz="4"/>
+              <w:left w:val="single" w:color="BFBFBF" w:sz="4"/>
+              <w:bottom w:val="single" w:color="BFBFBF" w:sz="4"/>
+              <w:right w:val="single" w:color="BFBFBF" w:sz="4"/>
+            </w:tcBorders>
+            <w:tcMar>
+              <w:top w:type="dxa" w:w="60"/>
+              <w:left w:type="dxa" w:w="100"/>
+              <w:bottom w:type="dxa" w:w="60"/>
+              <w:right w:type="dxa" w:w="100"/>
+            </w:tcMar>
+          </w:tcPr>
+          <w:p>
+            <w:r>
+              <w:rPr>
+                <w:rFonts w:ascii="Arial" w:cs="Arial" w:eastAsia="Arial" w:hAnsi="Arial"/>
+                <w:sz w:val="20"/>
+                <w:szCs w:val="20"/>
+              </w:rPr>
+              <w:t xml:space="preserve">RETIRED</w:t>
+            </w:r>
+          </w:p>
+        </w:tc>
+        <w:tc>
+          <w:tcPr>
+            <w:tcW w:type="dxa" w:w="3199"/>
+            <w:tcBorders>
+              <w:top w:val="single" w:color="BFBFBF" w:sz="4"/>
+              <w:left w:val="single" w:color="BFBFBF" w:sz="4"/>
+              <w:bottom w:val="single" w:color="BFBFBF" w:sz="4"/>
+              <w:right w:val="single" w:color="BFBFBF" w:sz="4"/>
+            </w:tcBorders>
+            <w:tcMar>
+              <w:top w:type="dxa" w:w="60"/>
+              <w:left w:type="dxa" w:w="100"/>
+              <w:bottom w:type="dxa" w:w="60"/>
+              <w:right w:type="dxa" w:w="100"/>
+            </w:tcMar>
+          </w:tcPr>
+          <w:p>
+            <w:r>
+              <w:rPr>
+                <w:rFonts w:ascii="Arial" w:cs="Arial" w:eastAsia="Arial" w:hAnsi="Arial"/>
+                <w:sz w:val="20"/>
+                <w:szCs w:val="20"/>
+              </w:rPr>
+              <w:t xml:space="preserve">The same for Defendant 2.</w:t>
             </w:r>
           </w:p>
         </w:tc>

</xml_diff>

<commit_message>
Add the case note to the specified journey
With ADD_CASE_NOTE=Yes, the hearing centre admin adds a case note
straight after the claim is issued, reusing AddCaseNote, as in the
unspecified journey. The test checks the note shows on the Notes tab and
the claim stays in AWAITING_RESPONDENT_ACKNOWLEDGEMENT. The guide covers
the new step and setting, and the Word copy is regenerated.
</commit_message>
<xml_diff>
--- a/playwright-tests/RUNNING_SPECIFIED_TESTS.docx
+++ b/playwright-tests/RUNNING_SPECIFIED_TESTS.docx
@@ -142,7 +142,7 @@
         <w:rPr>
           <w:rFonts w:ascii="Arial" w:cs="Arial" w:eastAsia="Arial" w:hAnsi="Arial"/>
         </w:rPr>
-        <w:t xml:space="preserve">ASSIGN_DEFENDANT_SOLICITORS: the defendants' solicitors are given access to the claim. A specified claim has no Notify claim or Notify claim details steps.</w:t>
+        <w:t xml:space="preserve">ADD_CASE_NOTE (optional): the hearing centre admin adds a case note with "Add a case note" straight after the claim is issued (ADD_CASE_NOTE=Yes). The test checks it shows on the Notes tab. The claim stays in AWAITING_RESPONDENT_ACKNOWLEDGEMENT. It is always done in the UI.</w:t>
       </w:r>
     </w:p>
     <w:p>
@@ -161,7 +161,7 @@
         <w:rPr>
           <w:rFonts w:ascii="Arial" w:cs="Arial" w:eastAsia="Arial" w:hAnsi="Arial"/>
         </w:rPr>
-        <w:t xml:space="preserve">INFORM_AGREED_EXTENSION_DEFENDANT1, INFORM_AGREED_EXTENSION_DEFENDANT2 (optional): each defendant's solicitor tells the court about an agreed extension, which moves their response deadline back.</w:t>
+        <w:t xml:space="preserve">ASSIGN_DEFENDANT_SOLICITORS: the defendants' solicitors are given access to the claim. A specified claim has no Notify claim or Notify claim details steps.</w:t>
       </w:r>
     </w:p>
     <w:p>
@@ -180,7 +180,7 @@
         <w:rPr>
           <w:rFonts w:ascii="Arial" w:cs="Arial" w:eastAsia="Arial" w:hAnsi="Arial"/>
         </w:rPr>
-        <w:t xml:space="preserve">RESPOND_TO_CLAIM_DEFENDANT1, RESPOND_TO_CLAIM_DEFENDANT2: each defendant's solicitor responds with a full defence, a full or part admission, or a counterclaim.</w:t>
+        <w:t xml:space="preserve">INFORM_AGREED_EXTENSION_DEFENDANT1, INFORM_AGREED_EXTENSION_DEFENDANT2 (optional): each defendant's solicitor tells the court about an agreed extension, which moves their response deadline back.</w:t>
       </w:r>
     </w:p>
     <w:p>
@@ -199,7 +199,7 @@
         <w:rPr>
           <w:rFonts w:ascii="Arial" w:cs="Arial" w:eastAsia="Arial" w:hAnsi="Arial"/>
         </w:rPr>
-        <w:t xml:space="preserve">RESPOND_TO_DEFENCE: the claimant's solicitor responds to the defence or the admission. It runs whenever the claim is still online once every defendant has responded (AWAITING_APPLICANT_INTENTION).</w:t>
+        <w:t xml:space="preserve">RESPOND_TO_CLAIM_DEFENDANT1, RESPOND_TO_CLAIM_DEFENDANT2: each defendant's solicitor responds with a full defence, a full or part admission, or a counterclaim.</w:t>
       </w:r>
     </w:p>
     <w:p>
@@ -218,7 +218,7 @@
         <w:rPr>
           <w:rFonts w:ascii="Arial" w:cs="Arial" w:eastAsia="Arial" w:hAnsi="Arial"/>
         </w:rPr>
-        <w:t xml:space="preserve">CREATE_SDO: the judge makes a Standard Direction Order, moving the claim from JUDICIAL_REFERRAL to CASE_PROGRESSION. It only runs on the fast track, when the claimant's response took the claim to JUDICIAL_REFERRAL. It is always done in the UI, where the judge opens the event by its URL (and claims the directions task first where work allocation needs one).</w:t>
+        <w:t xml:space="preserve">RESPOND_TO_DEFENCE: the claimant's solicitor responds to the defence or the admission. It runs whenever the claim is still online once every defendant has responded (AWAITING_APPLICANT_INTENTION).</w:t>
       </w:r>
     </w:p>
     <w:p>
@@ -237,7 +237,7 @@
         <w:rPr>
           <w:rFonts w:ascii="Arial" w:cs="Arial" w:eastAsia="Arial" w:hAnsi="Arial"/>
         </w:rPr>
-        <w:t xml:space="preserve">MAKE_DIRECTIONS_ORDER: on the intermediate and multi tracks, which have no Standard Direction Order, the judge makes a directions order with "Make an order" instead, also moving the claim from JUDICIAL_REFERRAL to CASE_PROGRESSION. The judge keeps the claim on its track, chooses the blank template for an order before a hearing and uploads the completed order (playwright-tests/documents/TEST_ORDER.docx; the page only takes Word documents). It is always done in the UI (claiming the track allocation task first where work allocation needs one).</w:t>
+        <w:t xml:space="preserve">CREATE_SDO: the judge makes a Standard Direction Order, moving the claim from JUDICIAL_REFERRAL to CASE_PROGRESSION. It only runs on the fast track, when the claimant's response took the claim to JUDICIAL_REFERRAL. It is always done in the UI, where the judge opens the event by its URL (and claims the directions task first where work allocation needs one).</w:t>
       </w:r>
     </w:p>
     <w:p>
@@ -256,7 +256,7 @@
         <w:rPr>
           <w:rFonts w:ascii="Arial" w:cs="Arial" w:eastAsia="Arial" w:hAnsi="Arial"/>
         </w:rPr>
-        <w:t xml:space="preserve">UPLOAD_EVIDENCE (group: _CLAIMANT_SOLICITOR, _DEFENDANT1_SOLICITOR, _DEFENDANT2_SOLICITOR): once the judge's order has moved the claim to CASE_PROGRESSION, each solicitor uploads a disclosure list with "Upload Your Documents" (the second defendant's solicitor only for 1v2DS). A solicitor acting for two parties uploads it for both. The claim stays in CASE_PROGRESSION. It is always done in the UI.</w:t>
+        <w:t xml:space="preserve">MAKE_DIRECTIONS_ORDER: on the intermediate and multi tracks, which have no Standard Direction Order, the judge makes a directions order with "Make an order" instead, also moving the claim from JUDICIAL_REFERRAL to CASE_PROGRESSION. The judge keeps the claim on its track, chooses the blank template for an order before a hearing and uploads the completed order (playwright-tests/documents/TEST_ORDER.docx; the page only takes Word documents). It is always done in the UI (claiming the track allocation task first where work allocation needs one).</w:t>
       </w:r>
     </w:p>
     <w:p>
@@ -275,7 +275,7 @@
         <w:rPr>
           <w:rFonts w:ascii="Arial" w:cs="Arial" w:eastAsia="Arial" w:hAnsi="Arial"/>
         </w:rPr>
-        <w:t xml:space="preserve">CREATE_HEARING_NOTICE: once the evidence is in, the hearing centre admin lists the trial with "Create a hearing notice" (a first listing of a "Trial (Fast, Intermediate and Multi track)" notice at Clerkenwell, 8 weeks ahead). This stands in for HMC returning a listed hearing. civil-service works out the hearing fee and moves the claim to HEARING_READINESS. It is always done in the UI.</w:t>
+        <w:t xml:space="preserve">UPLOAD_EVIDENCE (group: _CLAIMANT_SOLICITOR, _DEFENDANT1_SOLICITOR, _DEFENDANT2_SOLICITOR): once the judge's order has moved the claim to CASE_PROGRESSION, each solicitor uploads a disclosure list with "Upload Your Documents" (the second defendant's solicitor only for 1v2DS). A solicitor acting for two parties uploads it for both. The claim stays in CASE_PROGRESSION. It is always done in the UI.</w:t>
       </w:r>
     </w:p>
     <w:p>
@@ -294,7 +294,7 @@
         <w:rPr>
           <w:rFonts w:ascii="Arial" w:cs="Arial" w:eastAsia="Arial" w:hAnsi="Arial"/>
         </w:rPr>
-        <w:t xml:space="preserve">PAY_HEARING_FEE: the claimant's solicitor pays the hearing fee from the Service Request tab, by PBA or card (PAYMENT_METHOD). If the payment service has not told civil-service about the payment within a minute, the test does. The test then runs HEARING_FEE_PAID, which civil-service's scheduler would otherwise run later, moving the claim to PREPARE_FOR_HEARING_CONDUCT_HEARING. It is always done in the UI.</w:t>
+        <w:t xml:space="preserve">CREATE_HEARING_NOTICE: once the evidence is in, the hearing centre admin lists the trial with "Create a hearing notice" (a first listing of a "Trial (Fast, Intermediate and Multi track)" notice at Clerkenwell, 8 weeks ahead). This stands in for HMC returning a listed hearing. civil-service works out the hearing fee and moves the claim to HEARING_READINESS. It is always done in the UI.</w:t>
       </w:r>
     </w:p>
     <w:p>
@@ -313,7 +313,7 @@
         <w:rPr>
           <w:rFonts w:ascii="Arial" w:cs="Arial" w:eastAsia="Arial" w:hAnsi="Arial"/>
         </w:rPr>
-        <w:t xml:space="preserve">TRIAL_READY_CHECK: on the fast track only, the parties are asked to confirm they are ready for trial. civil-service's scheduler does this once the hearing is less than 3 weeks away; the hearing is 8 weeks ahead, so the test runs the event itself and checks it was recorded on the case. The claim stays in PREPARE_FOR_HEARING_CONDUCT_HEARING.</w:t>
+        <w:t xml:space="preserve">PAY_HEARING_FEE: the claimant's solicitor pays the hearing fee from the Service Request tab, by PBA or card (PAYMENT_METHOD). If the payment service has not told civil-service about the payment within a minute, the test does. The test then runs HEARING_FEE_PAID, which civil-service's scheduler would otherwise run later, moving the claim to PREPARE_FOR_HEARING_CONDUCT_HEARING. It is always done in the UI.</w:t>
       </w:r>
     </w:p>
     <w:p>
@@ -332,7 +332,7 @@
         <w:rPr>
           <w:rFonts w:ascii="Arial" w:cs="Arial" w:eastAsia="Arial" w:hAnsi="Arial"/>
         </w:rPr>
-        <w:t xml:space="preserve">CONFIRM_TRIAL_ARRANGEMENTS (group: _CLAIMANT_SOLICITOR, _DEFENDANT1_SOLICITOR, _DEFENDANT2_SOLICITOR): each solicitor confirms with "Confirm trial arrangements" that the case is ready for trial, with no change to the hearing requirements (the second defendant's solicitor only for 1v2DS). A solicitor acting for two parties confirms for both. Like the trial ready check it is fast track only (XUI does not offer it on the intermediate or multi tracks), and it has to be done more than 3 weeks before the hearing. The claim stays in PREPARE_FOR_HEARING_CONDUCT_HEARING. It is always done in the UI.</w:t>
+        <w:t xml:space="preserve">TRIAL_READY_CHECK: on the fast track only, the parties are asked to confirm they are ready for trial. civil-service's scheduler does this once the hearing is less than 3 weeks away; the hearing is 8 weeks ahead, so the test runs the event itself and checks it was recorded on the case. The claim stays in PREPARE_FOR_HEARING_CONDUCT_HEARING.</w:t>
       </w:r>
     </w:p>
     <w:p>
@@ -351,7 +351,7 @@
         <w:rPr>
           <w:rFonts w:ascii="Arial" w:cs="Arial" w:eastAsia="Arial" w:hAnsi="Arial"/>
         </w:rPr>
-        <w:t xml:space="preserve">CREATE_TRIAL_BUNDLE: the trial bundle is created. civil-service's scheduler does this about 3 weeks before the hearing, for every track except intermediate and multi (small claims have bundles too, but go to mediation in this journey), so the test asks civil-service to do it now, waits for the bundle to be stitched into one document and checks the claimant's solicitor sees it on the Bundles tab. The claim stays in PREPARE_FOR_HEARING_CONDUCT_HEARING.</w:t>
+        <w:t xml:space="preserve">CONFIRM_TRIAL_ARRANGEMENTS (group: _CLAIMANT_SOLICITOR, _DEFENDANT1_SOLICITOR, _DEFENDANT2_SOLICITOR): each solicitor confirms with "Confirm trial arrangements" that the case is ready for trial, with no change to the hearing requirements (the second defendant's solicitor only for 1v2DS). A solicitor acting for two parties confirms for both. Like the trial ready check it is fast track only (XUI does not offer it on the intermediate or multi tracks), and it has to be done more than 3 weeks before the hearing. The claim stays in PREPARE_FOR_HEARING_CONDUCT_HEARING. It is always done in the UI.</w:t>
       </w:r>
     </w:p>
     <w:p>
@@ -370,7 +370,7 @@
         <w:rPr>
           <w:rFonts w:ascii="Arial" w:cs="Arial" w:eastAsia="Arial" w:hAnsi="Arial"/>
         </w:rPr>
-        <w:t xml:space="preserve">MOVE_TO_DECISION_OUTCOME: once the hearing date has passed, civil-service's scheduler moves the claim to DECISION_OUTCOME to wait for the judge's decision, on every track. The hearing is weeks away, so the test runs the event itself.</w:t>
+        <w:t xml:space="preserve">CREATE_TRIAL_BUNDLE: the trial bundle is created. civil-service's scheduler does this about 3 weeks before the hearing, for every track except intermediate and multi (small claims have bundles too, but go to mediation in this journey), so the test asks civil-service to do it now, waits for the bundle to be stitched into one document and checks the claimant's solicitor sees it on the Bundles tab. The claim stays in PREPARE_FOR_HEARING_CONDUCT_HEARING.</w:t>
       </w:r>
     </w:p>
     <w:p>
@@ -389,7 +389,7 @@
         <w:rPr>
           <w:rFonts w:ascii="Arial" w:cs="Arial" w:eastAsia="Arial" w:hAnsi="Arial"/>
         </w:rPr>
-        <w:t xml:space="preserve">MAKE_FINAL_ORDER: the judge makes the final order with "Make an order" (FINAL_ORDER, see section 10). On the fast track the judge writes a free form or an assisted order on the page. On the intermediate and multi tracks the judge keeps the claim on its track, picks a template (for the after-hearing template, giving today as the hearing date), and uploads the completed order (playwright-tests/documents/TEST_ORDER.docx). The test checks the order was added to the case and its notifications sent. The claim stays in DECISION_OUTCOME. It is always done in the UI.</w:t>
+        <w:t xml:space="preserve">MOVE_TO_DECISION_OUTCOME: once the hearing date has passed, civil-service's scheduler moves the claim to DECISION_OUTCOME to wait for the judge's decision, on every track. The hearing is weeks away, so the test runs the event itself.</w:t>
       </w:r>
     </w:p>
     <w:p>
@@ -408,6 +408,25 @@
         <w:rPr>
           <w:rFonts w:ascii="Arial" w:cs="Arial" w:eastAsia="Arial" w:hAnsi="Arial"/>
         </w:rPr>
+        <w:t xml:space="preserve">MAKE_FINAL_ORDER: the judge makes the final order with "Make an order" (FINAL_ORDER, see section 10). On the fast track the judge writes a free form or an assisted order on the page. On the intermediate and multi tracks the judge keeps the claim on its track, picks a template (for the after-hearing template, giving today as the hearing date), and uploads the completed order (playwright-tests/documents/TEST_ORDER.docx). The test checks the order was added to the case and its notifications sent. The claim stays in DECISION_OUTCOME. It is always done in the UI.</w:t>
+      </w:r>
+    </w:p>
+    <w:p>
+      <w:pPr>
+        <w:pStyle w:val="ListParagraph"/>
+        <w:numPr>
+          <w:ilvl w:val="0"/>
+          <w:numId w:val="2"/>
+        </w:numPr>
+        <w:tabs>
+          <w:tab w:val="left" w:pos="720"/>
+        </w:tabs>
+        <w:spacing w:after="60"/>
+      </w:pPr>
+      <w:r>
+        <w:rPr>
+          <w:rFonts w:ascii="Arial" w:cs="Arial" w:eastAsia="Arial" w:hAnsi="Arial"/>
+        </w:rPr>
         <w:t xml:space="preserve">CONFIRM_ORDER_REVIEW: the hearing centre admin reviews the order with "Confirm order review": no date a party must do something by, a final order, and nothing left to do. This closes the claim on any track, moving it to All_FINAL_ORDERS_ISSUED. It is always done in the UI.</w:t>
       </w:r>
     </w:p>
@@ -452,7 +471,7 @@
         <w:rPr>
           <w:rFonts w:ascii="Arial" w:cs="Arial" w:eastAsia="Arial" w:hAnsi="Arial"/>
         </w:rPr>
-        <w:t xml:space="preserve">The steps with an API version are CREATE_CLAIM, INFORM_AGREED_EXTENSION_DEFENDANT1/2, RESPOND_TO_CLAIM_DEFENDANT1/2 and RESPOND_TO_DEFENCE. CREATE_SDO, MAKE_DIRECTIONS_ORDER, UPLOAD_EVIDENCE, CREATE_HEARING_NOTICE, PAY_HEARING_FEE, CONFIRM_TRIAL_ARRANGEMENTS, MAKE_FINAL_ORDER and CONFIRM_ORDER_REVIEW always use the UI. With API_UNTIL=&lt;state&gt; they go through the CCD API until the claim reaches that state, and every step after it goes through the UI. Leave API_UNTIL unset to do everything through the UI.</w:t>
+        <w:t xml:space="preserve">The steps with an API version are CREATE_CLAIM, INFORM_AGREED_EXTENSION_DEFENDANT1/2, RESPOND_TO_CLAIM_DEFENDANT1/2 and RESPOND_TO_DEFENCE. ADD_CASE_NOTE, CREATE_SDO, MAKE_DIRECTIONS_ORDER, UPLOAD_EVIDENCE, CREATE_HEARING_NOTICE, PAY_HEARING_FEE, CONFIRM_TRIAL_ARRANGEMENTS, MAKE_FINAL_ORDER and CONFIRM_ORDER_REVIEW always use the UI. With API_UNTIL=&lt;state&gt; they go through the CCD API until the claim reaches that state, and every step after it goes through the UI. Leave API_UNTIL unset to do everything through the UI.</w:t>
       </w:r>
     </w:p>
     <w:p>
@@ -3852,6 +3871,119 @@
                 <w:szCs w:val="20"/>
               </w:rPr>
               <w:t xml:space="preserve">How the claim fee and the hearing fee are paid. CARD is always paid in the UI. Any other value stops the run.</w:t>
+            </w:r>
+          </w:p>
+        </w:tc>
+      </w:tr>
+      <w:tr>
+        <w:trPr>
+          <w:tblHeader w:val="off"/>
+        </w:trPr>
+        <w:tc>
+          <w:tcPr>
+            <w:tcW w:type="dxa" w:w="1692"/>
+            <w:tcBorders>
+              <w:top w:val="single" w:color="BFBFBF" w:sz="4"/>
+              <w:left w:val="single" w:color="BFBFBF" w:sz="4"/>
+              <w:bottom w:val="single" w:color="BFBFBF" w:sz="4"/>
+              <w:right w:val="single" w:color="BFBFBF" w:sz="4"/>
+            </w:tcBorders>
+            <w:tcMar>
+              <w:top w:type="dxa" w:w="60"/>
+              <w:left w:type="dxa" w:w="100"/>
+              <w:bottom w:type="dxa" w:w="60"/>
+              <w:right w:type="dxa" w:w="100"/>
+            </w:tcMar>
+          </w:tcPr>
+          <w:p>
+            <w:r>
+              <w:rPr>
+                <w:rFonts w:ascii="Courier New" w:cs="Courier New" w:eastAsia="Courier New" w:hAnsi="Courier New"/>
+                <w:sz w:val="20"/>
+                <w:szCs w:val="20"/>
+              </w:rPr>
+              <w:t xml:space="preserve">ADD_CASE_NOTE</w:t>
+            </w:r>
+          </w:p>
+        </w:tc>
+        <w:tc>
+          <w:tcPr>
+            <w:tcW w:type="dxa" w:w="3196"/>
+            <w:tcBorders>
+              <w:top w:val="single" w:color="BFBFBF" w:sz="4"/>
+              <w:left w:val="single" w:color="BFBFBF" w:sz="4"/>
+              <w:bottom w:val="single" w:color="BFBFBF" w:sz="4"/>
+              <w:right w:val="single" w:color="BFBFBF" w:sz="4"/>
+            </w:tcBorders>
+            <w:tcMar>
+              <w:top w:type="dxa" w:w="60"/>
+              <w:left w:type="dxa" w:w="100"/>
+              <w:bottom w:type="dxa" w:w="60"/>
+              <w:right w:type="dxa" w:w="100"/>
+            </w:tcMar>
+          </w:tcPr>
+          <w:p>
+            <w:r>
+              <w:rPr>
+                <w:rFonts w:ascii="Arial" w:cs="Arial" w:eastAsia="Arial" w:hAnsi="Arial"/>
+                <w:sz w:val="20"/>
+                <w:szCs w:val="20"/>
+              </w:rPr>
+              <w:t xml:space="preserve">Yes, No</w:t>
+            </w:r>
+          </w:p>
+        </w:tc>
+        <w:tc>
+          <w:tcPr>
+            <w:tcW w:type="dxa" w:w="1551"/>
+            <w:tcBorders>
+              <w:top w:val="single" w:color="BFBFBF" w:sz="4"/>
+              <w:left w:val="single" w:color="BFBFBF" w:sz="4"/>
+              <w:bottom w:val="single" w:color="BFBFBF" w:sz="4"/>
+              <w:right w:val="single" w:color="BFBFBF" w:sz="4"/>
+            </w:tcBorders>
+            <w:tcMar>
+              <w:top w:type="dxa" w:w="60"/>
+              <w:left w:type="dxa" w:w="100"/>
+              <w:bottom w:type="dxa" w:w="60"/>
+              <w:right w:type="dxa" w:w="100"/>
+            </w:tcMar>
+          </w:tcPr>
+          <w:p>
+            <w:r>
+              <w:rPr>
+                <w:rFonts w:ascii="Arial" w:cs="Arial" w:eastAsia="Arial" w:hAnsi="Arial"/>
+                <w:sz w:val="20"/>
+                <w:szCs w:val="20"/>
+              </w:rPr>
+              <w:t xml:space="preserve">No</w:t>
+            </w:r>
+          </w:p>
+        </w:tc>
+        <w:tc>
+          <w:tcPr>
+            <w:tcW w:type="dxa" w:w="3199"/>
+            <w:tcBorders>
+              <w:top w:val="single" w:color="BFBFBF" w:sz="4"/>
+              <w:left w:val="single" w:color="BFBFBF" w:sz="4"/>
+              <w:bottom w:val="single" w:color="BFBFBF" w:sz="4"/>
+              <w:right w:val="single" w:color="BFBFBF" w:sz="4"/>
+            </w:tcBorders>
+            <w:tcMar>
+              <w:top w:type="dxa" w:w="60"/>
+              <w:left w:type="dxa" w:w="100"/>
+              <w:bottom w:type="dxa" w:w="60"/>
+              <w:right w:type="dxa" w:w="100"/>
+            </w:tcMar>
+          </w:tcPr>
+          <w:p>
+            <w:r>
+              <w:rPr>
+                <w:rFonts w:ascii="Arial" w:cs="Arial" w:eastAsia="Arial" w:hAnsi="Arial"/>
+                <w:sz w:val="20"/>
+                <w:szCs w:val="20"/>
+              </w:rPr>
+              <w:t xml:space="preserve">Optional step: the hearing centre admin adds a case note after the claim is issued.</w:t>
             </w:r>
           </w:p>
         </w:tc>

</xml_diff>

<commit_message>
Add case flags to the specified journey
With CASE_FLAGS set, once the claimant has responded and the claim is
still online, the hearing centre admin adds each flag and then makes the
first one inactive, reusing CreateCaseFlag and ManageCaseFlag as in the
unspecified journey. Court staff can flag a case in any online state, so
the steps run at JUDICIAL_REFERRAL, IN_MEDIATION or after an admission,
and the claim stays where the claimant's response left it.

The case flag helpers now take either journey's claim. A specified claim
names no experts or witnesses and has no litigation friends, so those
holders are rejected before the run starts. The guide gains a case flags
section and the Word copy is regenerated.
</commit_message>
<xml_diff>
--- a/playwright-tests/RUNNING_SPECIFIED_TESTS.docx
+++ b/playwright-tests/RUNNING_SPECIFIED_TESTS.docx
@@ -237,7 +237,7 @@
         <w:rPr>
           <w:rFonts w:ascii="Arial" w:cs="Arial" w:eastAsia="Arial" w:hAnsi="Arial"/>
         </w:rPr>
-        <w:t xml:space="preserve">CREATE_SDO: the judge makes a Standard Direction Order, moving the claim from JUDICIAL_REFERRAL to CASE_PROGRESSION. It only runs on the fast track, when the claimant's response took the claim to JUDICIAL_REFERRAL. It is always done in the UI, where the judge opens the event by its URL (and claims the directions task first where work allocation needs one).</w:t>
+        <w:t xml:space="preserve">CREATE_CASE_FLAGS, MAKE_CASE_FLAG_INACTIVE (optional): once the claimant has responded and the claim is still online, the hearing centre admin adds each flag in CASE_FLAGS with "Create case flags", then makes the first one inactive with "Manage case flags" (see section 8). The test checks each flag was saved, and the claim stays in the state the claimant's response left it in. It is always done in the UI.</w:t>
       </w:r>
     </w:p>
     <w:p>
@@ -256,7 +256,7 @@
         <w:rPr>
           <w:rFonts w:ascii="Arial" w:cs="Arial" w:eastAsia="Arial" w:hAnsi="Arial"/>
         </w:rPr>
-        <w:t xml:space="preserve">MAKE_DIRECTIONS_ORDER: on the intermediate and multi tracks, which have no Standard Direction Order, the judge makes a directions order with "Make an order" instead, also moving the claim from JUDICIAL_REFERRAL to CASE_PROGRESSION. The judge keeps the claim on its track, chooses the blank template for an order before a hearing and uploads the completed order (playwright-tests/documents/TEST_ORDER.docx; the page only takes Word documents). It is always done in the UI (claiming the track allocation task first where work allocation needs one).</w:t>
+        <w:t xml:space="preserve">CREATE_SDO: the judge makes a Standard Direction Order, moving the claim from JUDICIAL_REFERRAL to CASE_PROGRESSION. It only runs on the fast track, when the claimant's response took the claim to JUDICIAL_REFERRAL. It is always done in the UI, where the judge opens the event by its URL (and claims the directions task first where work allocation needs one).</w:t>
       </w:r>
     </w:p>
     <w:p>
@@ -275,7 +275,7 @@
         <w:rPr>
           <w:rFonts w:ascii="Arial" w:cs="Arial" w:eastAsia="Arial" w:hAnsi="Arial"/>
         </w:rPr>
-        <w:t xml:space="preserve">UPLOAD_EVIDENCE (group: _CLAIMANT_SOLICITOR, _DEFENDANT1_SOLICITOR, _DEFENDANT2_SOLICITOR): once the judge's order has moved the claim to CASE_PROGRESSION, each solicitor uploads a disclosure list with "Upload Your Documents" (the second defendant's solicitor only for 1v2DS). A solicitor acting for two parties uploads it for both. The claim stays in CASE_PROGRESSION. It is always done in the UI.</w:t>
+        <w:t xml:space="preserve">MAKE_DIRECTIONS_ORDER: on the intermediate and multi tracks, which have no Standard Direction Order, the judge makes a directions order with "Make an order" instead, also moving the claim from JUDICIAL_REFERRAL to CASE_PROGRESSION. The judge keeps the claim on its track, chooses the blank template for an order before a hearing and uploads the completed order (playwright-tests/documents/TEST_ORDER.docx; the page only takes Word documents). It is always done in the UI (claiming the track allocation task first where work allocation needs one).</w:t>
       </w:r>
     </w:p>
     <w:p>
@@ -294,7 +294,7 @@
         <w:rPr>
           <w:rFonts w:ascii="Arial" w:cs="Arial" w:eastAsia="Arial" w:hAnsi="Arial"/>
         </w:rPr>
-        <w:t xml:space="preserve">CREATE_HEARING_NOTICE: once the evidence is in, the hearing centre admin lists the trial with "Create a hearing notice" (a first listing of a "Trial (Fast, Intermediate and Multi track)" notice at Clerkenwell, 8 weeks ahead). This stands in for HMC returning a listed hearing. civil-service works out the hearing fee and moves the claim to HEARING_READINESS. It is always done in the UI.</w:t>
+        <w:t xml:space="preserve">UPLOAD_EVIDENCE (group: _CLAIMANT_SOLICITOR, _DEFENDANT1_SOLICITOR, _DEFENDANT2_SOLICITOR): once the judge's order has moved the claim to CASE_PROGRESSION, each solicitor uploads a disclosure list with "Upload Your Documents" (the second defendant's solicitor only for 1v2DS). A solicitor acting for two parties uploads it for both. The claim stays in CASE_PROGRESSION. It is always done in the UI.</w:t>
       </w:r>
     </w:p>
     <w:p>
@@ -313,7 +313,7 @@
         <w:rPr>
           <w:rFonts w:ascii="Arial" w:cs="Arial" w:eastAsia="Arial" w:hAnsi="Arial"/>
         </w:rPr>
-        <w:t xml:space="preserve">PAY_HEARING_FEE: the claimant's solicitor pays the hearing fee from the Service Request tab, by PBA or card (PAYMENT_METHOD). If the payment service has not told civil-service about the payment within a minute, the test does. The test then runs HEARING_FEE_PAID, which civil-service's scheduler would otherwise run later, moving the claim to PREPARE_FOR_HEARING_CONDUCT_HEARING. It is always done in the UI.</w:t>
+        <w:t xml:space="preserve">CREATE_HEARING_NOTICE: once the evidence is in, the hearing centre admin lists the trial with "Create a hearing notice" (a first listing of a "Trial (Fast, Intermediate and Multi track)" notice at Clerkenwell, 8 weeks ahead). This stands in for HMC returning a listed hearing. civil-service works out the hearing fee and moves the claim to HEARING_READINESS. It is always done in the UI.</w:t>
       </w:r>
     </w:p>
     <w:p>
@@ -332,7 +332,7 @@
         <w:rPr>
           <w:rFonts w:ascii="Arial" w:cs="Arial" w:eastAsia="Arial" w:hAnsi="Arial"/>
         </w:rPr>
-        <w:t xml:space="preserve">TRIAL_READY_CHECK: on the fast track only, the parties are asked to confirm they are ready for trial. civil-service's scheduler does this once the hearing is less than 3 weeks away; the hearing is 8 weeks ahead, so the test runs the event itself and checks it was recorded on the case. The claim stays in PREPARE_FOR_HEARING_CONDUCT_HEARING.</w:t>
+        <w:t xml:space="preserve">PAY_HEARING_FEE: the claimant's solicitor pays the hearing fee from the Service Request tab, by PBA or card (PAYMENT_METHOD). If the payment service has not told civil-service about the payment within a minute, the test does. The test then runs HEARING_FEE_PAID, which civil-service's scheduler would otherwise run later, moving the claim to PREPARE_FOR_HEARING_CONDUCT_HEARING. It is always done in the UI.</w:t>
       </w:r>
     </w:p>
     <w:p>
@@ -351,7 +351,7 @@
         <w:rPr>
           <w:rFonts w:ascii="Arial" w:cs="Arial" w:eastAsia="Arial" w:hAnsi="Arial"/>
         </w:rPr>
-        <w:t xml:space="preserve">CONFIRM_TRIAL_ARRANGEMENTS (group: _CLAIMANT_SOLICITOR, _DEFENDANT1_SOLICITOR, _DEFENDANT2_SOLICITOR): each solicitor confirms with "Confirm trial arrangements" that the case is ready for trial, with no change to the hearing requirements (the second defendant's solicitor only for 1v2DS). A solicitor acting for two parties confirms for both. Like the trial ready check it is fast track only (XUI does not offer it on the intermediate or multi tracks), and it has to be done more than 3 weeks before the hearing. The claim stays in PREPARE_FOR_HEARING_CONDUCT_HEARING. It is always done in the UI.</w:t>
+        <w:t xml:space="preserve">TRIAL_READY_CHECK: on the fast track only, the parties are asked to confirm they are ready for trial. civil-service's scheduler does this once the hearing is less than 3 weeks away; the hearing is 8 weeks ahead, so the test runs the event itself and checks it was recorded on the case. The claim stays in PREPARE_FOR_HEARING_CONDUCT_HEARING.</w:t>
       </w:r>
     </w:p>
     <w:p>
@@ -370,7 +370,7 @@
         <w:rPr>
           <w:rFonts w:ascii="Arial" w:cs="Arial" w:eastAsia="Arial" w:hAnsi="Arial"/>
         </w:rPr>
-        <w:t xml:space="preserve">CREATE_TRIAL_BUNDLE: the trial bundle is created. civil-service's scheduler does this about 3 weeks before the hearing, for every track except intermediate and multi (small claims have bundles too, but go to mediation in this journey), so the test asks civil-service to do it now, waits for the bundle to be stitched into one document and checks the claimant's solicitor sees it on the Bundles tab. The claim stays in PREPARE_FOR_HEARING_CONDUCT_HEARING.</w:t>
+        <w:t xml:space="preserve">CONFIRM_TRIAL_ARRANGEMENTS (group: _CLAIMANT_SOLICITOR, _DEFENDANT1_SOLICITOR, _DEFENDANT2_SOLICITOR): each solicitor confirms with "Confirm trial arrangements" that the case is ready for trial, with no change to the hearing requirements (the second defendant's solicitor only for 1v2DS). A solicitor acting for two parties confirms for both. Like the trial ready check it is fast track only (XUI does not offer it on the intermediate or multi tracks), and it has to be done more than 3 weeks before the hearing. The claim stays in PREPARE_FOR_HEARING_CONDUCT_HEARING. It is always done in the UI.</w:t>
       </w:r>
     </w:p>
     <w:p>
@@ -389,7 +389,7 @@
         <w:rPr>
           <w:rFonts w:ascii="Arial" w:cs="Arial" w:eastAsia="Arial" w:hAnsi="Arial"/>
         </w:rPr>
-        <w:t xml:space="preserve">MOVE_TO_DECISION_OUTCOME: once the hearing date has passed, civil-service's scheduler moves the claim to DECISION_OUTCOME to wait for the judge's decision, on every track. The hearing is weeks away, so the test runs the event itself.</w:t>
+        <w:t xml:space="preserve">CREATE_TRIAL_BUNDLE: the trial bundle is created. civil-service's scheduler does this about 3 weeks before the hearing, for every track except intermediate and multi (small claims have bundles too, but go to mediation in this journey), so the test asks civil-service to do it now, waits for the bundle to be stitched into one document and checks the claimant's solicitor sees it on the Bundles tab. The claim stays in PREPARE_FOR_HEARING_CONDUCT_HEARING.</w:t>
       </w:r>
     </w:p>
     <w:p>
@@ -408,7 +408,7 @@
         <w:rPr>
           <w:rFonts w:ascii="Arial" w:cs="Arial" w:eastAsia="Arial" w:hAnsi="Arial"/>
         </w:rPr>
-        <w:t xml:space="preserve">MAKE_FINAL_ORDER: the judge makes the final order with "Make an order" (FINAL_ORDER, see section 10). On the fast track the judge writes a free form or an assisted order on the page. On the intermediate and multi tracks the judge keeps the claim on its track, picks a template (for the after-hearing template, giving today as the hearing date), and uploads the completed order (playwright-tests/documents/TEST_ORDER.docx). The test checks the order was added to the case and its notifications sent. The claim stays in DECISION_OUTCOME. It is always done in the UI.</w:t>
+        <w:t xml:space="preserve">MOVE_TO_DECISION_OUTCOME: once the hearing date has passed, civil-service's scheduler moves the claim to DECISION_OUTCOME to wait for the judge's decision, on every track. The hearing is weeks away, so the test runs the event itself.</w:t>
       </w:r>
     </w:p>
     <w:p>
@@ -427,6 +427,25 @@
         <w:rPr>
           <w:rFonts w:ascii="Arial" w:cs="Arial" w:eastAsia="Arial" w:hAnsi="Arial"/>
         </w:rPr>
+        <w:t xml:space="preserve">MAKE_FINAL_ORDER: the judge makes the final order with "Make an order" (FINAL_ORDER, see section 11). On the fast track the judge writes a free form or an assisted order on the page. On the intermediate and multi tracks the judge keeps the claim on its track, picks a template (for the after-hearing template, giving today as the hearing date), and uploads the completed order (playwright-tests/documents/TEST_ORDER.docx). The test checks the order was added to the case and its notifications sent. The claim stays in DECISION_OUTCOME. It is always done in the UI.</w:t>
+      </w:r>
+    </w:p>
+    <w:p>
+      <w:pPr>
+        <w:pStyle w:val="ListParagraph"/>
+        <w:numPr>
+          <w:ilvl w:val="0"/>
+          <w:numId w:val="2"/>
+        </w:numPr>
+        <w:tabs>
+          <w:tab w:val="left" w:pos="720"/>
+        </w:tabs>
+        <w:spacing w:after="60"/>
+      </w:pPr>
+      <w:r>
+        <w:rPr>
+          <w:rFonts w:ascii="Arial" w:cs="Arial" w:eastAsia="Arial" w:hAnsi="Arial"/>
+        </w:rPr>
         <w:t xml:space="preserve">CONFIRM_ORDER_REVIEW: the hearing centre admin reviews the order with "Confirm order review": no date a party must do something by, a final order, and nothing left to do. This closes the claim on any track, moving it to All_FINAL_ORDERS_ISSUED. It is always done in the UI.</w:t>
       </w:r>
     </w:p>
@@ -471,7 +490,7 @@
         <w:rPr>
           <w:rFonts w:ascii="Arial" w:cs="Arial" w:eastAsia="Arial" w:hAnsi="Arial"/>
         </w:rPr>
-        <w:t xml:space="preserve">The steps with an API version are CREATE_CLAIM, INFORM_AGREED_EXTENSION_DEFENDANT1/2, RESPOND_TO_CLAIM_DEFENDANT1/2 and RESPOND_TO_DEFENCE. ADD_CASE_NOTE, CREATE_SDO, MAKE_DIRECTIONS_ORDER, UPLOAD_EVIDENCE, CREATE_HEARING_NOTICE, PAY_HEARING_FEE, CONFIRM_TRIAL_ARRANGEMENTS, MAKE_FINAL_ORDER and CONFIRM_ORDER_REVIEW always use the UI. With API_UNTIL=&lt;state&gt; they go through the CCD API until the claim reaches that state, and every step after it goes through the UI. Leave API_UNTIL unset to do everything through the UI.</w:t>
+        <w:t xml:space="preserve">The steps with an API version are CREATE_CLAIM, INFORM_AGREED_EXTENSION_DEFENDANT1/2, RESPOND_TO_CLAIM_DEFENDANT1/2 and RESPOND_TO_DEFENCE. ADD_CASE_NOTE, CREATE_CASE_FLAGS, MAKE_CASE_FLAG_INACTIVE, CREATE_SDO, MAKE_DIRECTIONS_ORDER, UPLOAD_EVIDENCE, CREATE_HEARING_NOTICE, PAY_HEARING_FEE, CONFIRM_TRIAL_ARRANGEMENTS, MAKE_FINAL_ORDER and CONFIRM_ORDER_REVIEW always use the UI. With API_UNTIL=&lt;state&gt; they go through the CCD API until the claim reaches that state, and every step after it goes through the UI. Leave API_UNTIL unset to do everything through the UI.</w:t>
       </w:r>
     </w:p>
     <w:p>
@@ -2403,7 +2422,7 @@
         <w:rPr>
           <w:rFonts w:ascii="Arial" w:cs="Arial" w:eastAsia="Arial" w:hAnsi="Arial"/>
         </w:rPr>
-        <w:t xml:space="preserve">8. Paying fees by PBA or card</w:t>
+        <w:t xml:space="preserve">8. Case flags</w:t>
       </w:r>
     </w:p>
     <w:p>
@@ -2414,7 +2433,56 @@
         <w:rPr>
           <w:rFonts w:ascii="Arial" w:cs="Arial" w:eastAsia="Arial" w:hAnsi="Arial"/>
         </w:rPr>
-        <w:t xml:space="preserve">PAYMENT_METHOD picks how the claimant's solicitor pays the claim fee and the hearing fee. PBA (the default) pays from their PBA account. CARD pays on GOV.UK Pay's pages with a test card, always in the UI, even when the claim is created through the API. Use CARD when PBA payments fail on the environment, for example with "Unable to retrieve account information".</w:t>
+        <w:t xml:space="preserve">CASE_FLAGS switches on the case flag steps. Once the claimant has responded and the claim is still online (JUDICIAL_REFERRAL, IN_MEDIATION for a small claim, or after an admission AWAITING_APPLICANT_INTENTION or All_FINAL_ORDERS_ISSUED), the hearing centre admin adds each flag, then makes the first one inactive.</w:t>
+      </w:r>
+    </w:p>
+    <w:p>
+      <w:pPr>
+        <w:pStyle w:val="ListParagraph"/>
+        <w:numPr>
+          <w:ilvl w:val="0"/>
+          <w:numId w:val="2"/>
+        </w:numPr>
+        <w:tabs>
+          <w:tab w:val="left" w:pos="720"/>
+        </w:tabs>
+        <w:spacing w:after="60"/>
+      </w:pPr>
+      <w:r>
+        <w:rPr>
+          <w:rFonts w:ascii="Arial" w:cs="Arial" w:eastAsia="Arial" w:hAnsi="Arial"/>
+        </w:rPr>
+        <w:t xml:space="preserve">representative: a hearing loop for Claimant 1 (RA0043, the longest route through the flag pages), evidence by live link for Defendant 1 (SM0003) and vulnerable user for Defendant 2 (PF0002), leaving out a flag for a party the claim does not have.</w:t>
+      </w:r>
+    </w:p>
+    <w:p>
+      <w:pPr>
+        <w:pStyle w:val="ListParagraph"/>
+        <w:numPr>
+          <w:ilvl w:val="0"/>
+          <w:numId w:val="2"/>
+        </w:numPr>
+        <w:tabs>
+          <w:tab w:val="left" w:pos="720"/>
+        </w:tabs>
+        <w:spacing w:after="60"/>
+      </w:pPr>
+      <w:r>
+        <w:rPr>
+          <w:rFonts w:ascii="Arial" w:cs="Arial" w:eastAsia="Arial" w:hAnsi="Arial"/>
+        </w:rPr>
+        <w:t xml:space="preserve">A list of holder:code, e.g. CASE:CF0002,DEFENDANT_1:RA0012. A third part gives the language for an interpreter flag (CLAIMANT_1:PF0015:Spanish) or the description for an "Other" flag (OT0001).</w:t>
+      </w:r>
+    </w:p>
+    <w:p>
+      <w:pPr>
+        <w:spacing w:after="120"/>
+      </w:pPr>
+      <w:r>
+        <w:rPr>
+          <w:rFonts w:ascii="Arial" w:cs="Arial" w:eastAsia="Arial" w:hAnsi="Arial"/>
+        </w:rPr>
+        <w:t xml:space="preserve">The holders are CASE, CLAIMANT_1, CLAIMANT_2 (2v1) and DEFENDANT_1, DEFENDANT_2 (1v2). A specified claim's directions questionnaires name no experts or witnesses, so they cannot be flagged. A holder the claim does not have stops the run before it starts.</w:t>
       </w:r>
     </w:p>
     <w:p>
@@ -2428,29 +2496,7 @@
           <w:sz w:val="18"/>
           <w:szCs w:val="18"/>
         </w:rPr>
-        <w:t xml:space="preserve">ENV=aat PAYMENT_METHOD=CARD API_UNTIL=JUDICIAL_REFERRAL npx playwright test playwright-tests/e2e/journeys/SpecifiedSS.test.ts --project chromium</w:t>
-      </w:r>
-    </w:p>
-    <w:p>
-      <w:pPr>
-        <w:pStyle w:val="Heading2"/>
-      </w:pPr>
-      <w:r>
-        <w:rPr>
-          <w:rFonts w:ascii="Arial" w:cs="Arial" w:eastAsia="Arial" w:hAnsi="Arial"/>
-        </w:rPr>
-        <w:t xml:space="preserve">9. Named scenarios</w:t>
-      </w:r>
-    </w:p>
-    <w:p>
-      <w:pPr>
-        <w:spacing w:after="120"/>
-      </w:pPr>
-      <w:r>
-        <w:rPr>
-          <w:rFonts w:ascii="Arial" w:cs="Arial" w:eastAsia="Arial" w:hAnsi="Arial"/>
-        </w:rPr>
-        <w:t xml:space="preserve">Run a named scenario from playwright-tests/scenarios/specifiedScenarios.ts, or use a test:SPEC_* script in package.json:</w:t>
+        <w:t xml:space="preserve">ENV=aat CASE_FLAGS=representative STOP_AFTER_TEST=MAKE_CASE_FLAG_INACTIVE npx playwright test playwright-tests/e2e/journeys/SpecifiedSS.test.ts --project chromium</w:t>
       </w:r>
     </w:p>
     <w:p>
@@ -2464,6 +2510,78 @@
           <w:sz w:val="18"/>
           <w:szCs w:val="18"/>
         </w:rPr>
+        <w:t xml:space="preserve">ENV=aat CLAIM_TYPE=1v2DS API_UNTIL=JUDICIAL_REFERRAL CASE_FLAGS='CASE:CF0002,DEFENDANT_2:PF0015:Spanish' STOP_AFTER_TEST=MAKE_CASE_FLAG_INACTIVE npx playwright test playwright-tests/e2e/journeys/SpecifiedSS.test.ts --project chromium</w:t>
+      </w:r>
+    </w:p>
+    <w:p>
+      <w:pPr>
+        <w:pStyle w:val="Heading2"/>
+      </w:pPr>
+      <w:r>
+        <w:rPr>
+          <w:rFonts w:ascii="Arial" w:cs="Arial" w:eastAsia="Arial" w:hAnsi="Arial"/>
+        </w:rPr>
+        <w:t xml:space="preserve">9. Paying fees by PBA or card</w:t>
+      </w:r>
+    </w:p>
+    <w:p>
+      <w:pPr>
+        <w:spacing w:after="120"/>
+      </w:pPr>
+      <w:r>
+        <w:rPr>
+          <w:rFonts w:ascii="Arial" w:cs="Arial" w:eastAsia="Arial" w:hAnsi="Arial"/>
+        </w:rPr>
+        <w:t xml:space="preserve">PAYMENT_METHOD picks how the claimant's solicitor pays the claim fee and the hearing fee. PBA (the default) pays from their PBA account. CARD pays on GOV.UK Pay's pages with a test card, always in the UI, even when the claim is created through the API. Use CARD when PBA payments fail on the environment, for example with "Unable to retrieve account information".</w:t>
+      </w:r>
+    </w:p>
+    <w:p>
+      <w:pPr>
+        <w:shd w:fill="F2F2F2" w:color="auto" w:val="clear"/>
+        <w:spacing w:after="160" w:before="60"/>
+      </w:pPr>
+      <w:r>
+        <w:rPr>
+          <w:rFonts w:ascii="Courier New" w:cs="Courier New" w:eastAsia="Courier New" w:hAnsi="Courier New"/>
+          <w:sz w:val="18"/>
+          <w:szCs w:val="18"/>
+        </w:rPr>
+        <w:t xml:space="preserve">ENV=aat PAYMENT_METHOD=CARD API_UNTIL=JUDICIAL_REFERRAL npx playwright test playwright-tests/e2e/journeys/SpecifiedSS.test.ts --project chromium</w:t>
+      </w:r>
+    </w:p>
+    <w:p>
+      <w:pPr>
+        <w:pStyle w:val="Heading2"/>
+      </w:pPr>
+      <w:r>
+        <w:rPr>
+          <w:rFonts w:ascii="Arial" w:cs="Arial" w:eastAsia="Arial" w:hAnsi="Arial"/>
+        </w:rPr>
+        <w:t xml:space="preserve">10. Named scenarios</w:t>
+      </w:r>
+    </w:p>
+    <w:p>
+      <w:pPr>
+        <w:spacing w:after="120"/>
+      </w:pPr>
+      <w:r>
+        <w:rPr>
+          <w:rFonts w:ascii="Arial" w:cs="Arial" w:eastAsia="Arial" w:hAnsi="Arial"/>
+        </w:rPr>
+        <w:t xml:space="preserve">Run a named scenario from playwright-tests/scenarios/specifiedScenarios.ts, or use a test:SPEC_* script in package.json:</w:t>
+      </w:r>
+    </w:p>
+    <w:p>
+      <w:pPr>
+        <w:shd w:fill="F2F2F2" w:color="auto" w:val="clear"/>
+        <w:spacing w:after="160" w:before="60"/>
+      </w:pPr>
+      <w:r>
+        <w:rPr>
+          <w:rFonts w:ascii="Courier New" w:cs="Courier New" w:eastAsia="Courier New" w:hAnsi="Courier New"/>
+          <w:sz w:val="18"/>
+          <w:szCs w:val="18"/>
+        </w:rPr>
         <w:t xml:space="preserve">ENV=aat SCENARIOS=Yes npx playwright test playwright-tests/e2e/journeys/SpecifiedSS.test.ts --project chromium --grep @SPEC_1v2DS_FAST</w:t>
       </w:r>
     </w:p>
@@ -2475,7 +2593,7 @@
         <w:rPr>
           <w:rFonts w:ascii="Arial" w:cs="Arial" w:eastAsia="Arial" w:hAnsi="Arial"/>
         </w:rPr>
-        <w:t xml:space="preserve">10. Claim parameters</w:t>
+        <w:t xml:space="preserve">11. Claim parameters</w:t>
       </w:r>
     </w:p>
     <w:p>
@@ -4015,7 +4133,7 @@
                 <w:sz w:val="20"/>
                 <w:szCs w:val="20"/>
               </w:rPr>
-              <w:t xml:space="preserve">INFORM_AGREED_EXTENSION</w:t>
+              <w:t xml:space="preserve">CASE_FLAGS</w:t>
             </w:r>
           </w:p>
         </w:tc>
@@ -4042,7 +4160,7 @@
                 <w:sz w:val="20"/>
                 <w:szCs w:val="20"/>
               </w:rPr>
-              <w:t xml:space="preserve">Yes, No</w:t>
+              <w:t xml:space="preserve">representative, or a list of holder:code[:detail]</w:t>
             </w:r>
           </w:p>
         </w:tc>
@@ -4069,7 +4187,7 @@
                 <w:sz w:val="20"/>
                 <w:szCs w:val="20"/>
               </w:rPr>
-              <w:t xml:space="preserve">No</w:t>
+              <w:t xml:space="preserve">None</w:t>
             </w:r>
           </w:p>
         </w:tc>
@@ -4096,7 +4214,7 @@
                 <w:sz w:val="20"/>
                 <w:szCs w:val="20"/>
               </w:rPr>
-              <w:t xml:space="preserve">Optional steps: each defendant's solicitor informs the court of an agreed extension before responding.</w:t>
+              <w:t xml:space="preserve">Optional steps: add flags once the claimant has responded, then make the first inactive (section 8). Holders: CASE, CLAIMANT_1, CLAIMANT_2, DEFENDANT_1, DEFENDANT_2. The detail is the language for an interpreter flag or the description for an OT0001 flag.</w:t>
             </w:r>
           </w:p>
         </w:tc>
@@ -4128,7 +4246,7 @@
                 <w:sz w:val="20"/>
                 <w:szCs w:val="20"/>
               </w:rPr>
-              <w:t xml:space="preserve">RESPONDENT1_RESPONSE</w:t>
+              <w:t xml:space="preserve">INFORM_AGREED_EXTENSION</w:t>
             </w:r>
           </w:p>
         </w:tc>
@@ -4155,7 +4273,7 @@
                 <w:sz w:val="20"/>
                 <w:szCs w:val="20"/>
               </w:rPr>
-              <w:t xml:space="preserve">FULL_DEFENCE, FULL_ADMISSION, PART_ADMISSION, COUNTER_CLAIM</w:t>
+              <w:t xml:space="preserve">Yes, No</w:t>
             </w:r>
           </w:p>
         </w:tc>
@@ -4182,7 +4300,7 @@
                 <w:sz w:val="20"/>
                 <w:szCs w:val="20"/>
               </w:rPr>
-              <w:t xml:space="preserve">FULL_DEFENCE</w:t>
+              <w:t xml:space="preserve">No</w:t>
             </w:r>
           </w:p>
         </w:tc>
@@ -4209,7 +4327,7 @@
                 <w:sz w:val="20"/>
                 <w:szCs w:val="20"/>
               </w:rPr>
-              <w:t xml:space="preserve">Defendant 1's response.</w:t>
+              <w:t xml:space="preserve">Optional steps: each defendant's solicitor informs the court of an agreed extension before responding.</w:t>
             </w:r>
           </w:p>
         </w:tc>
@@ -4241,7 +4359,7 @@
                 <w:sz w:val="20"/>
                 <w:szCs w:val="20"/>
               </w:rPr>
-              <w:t xml:space="preserve">RESPONDENT2_RESPONSE</w:t>
+              <w:t xml:space="preserve">RESPONDENT1_RESPONSE</w:t>
             </w:r>
           </w:p>
         </w:tc>
@@ -4322,7 +4440,7 @@
                 <w:sz w:val="20"/>
                 <w:szCs w:val="20"/>
               </w:rPr>
-              <w:t xml:space="preserve">Defendant 2's response, or in a 2v1 claim the defendant's response to Claimant 2.</w:t>
+              <w:t xml:space="preserve">Defendant 1's response.</w:t>
             </w:r>
           </w:p>
         </w:tc>
@@ -4354,7 +4472,7 @@
                 <w:sz w:val="20"/>
                 <w:szCs w:val="20"/>
               </w:rPr>
-              <w:t xml:space="preserve">RESPONDENT1_EMPLOYMENT</w:t>
+              <w:t xml:space="preserve">RESPONDENT2_RESPONSE</w:t>
             </w:r>
           </w:p>
         </w:tc>
@@ -4381,7 +4499,7 @@
                 <w:sz w:val="20"/>
                 <w:szCs w:val="20"/>
               </w:rPr>
-              <w:t xml:space="preserve">RETIRED, SELF_EMPLOYED</w:t>
+              <w:t xml:space="preserve">FULL_DEFENCE, FULL_ADMISSION, PART_ADMISSION, COUNTER_CLAIM</w:t>
             </w:r>
           </w:p>
         </w:tc>
@@ -4408,7 +4526,7 @@
                 <w:sz w:val="20"/>
                 <w:szCs w:val="20"/>
               </w:rPr>
-              <w:t xml:space="preserve">RETIRED</w:t>
+              <w:t xml:space="preserve">FULL_DEFENCE</w:t>
             </w:r>
           </w:p>
         </w:tc>
@@ -4435,7 +4553,7 @@
                 <w:sz w:val="20"/>
                 <w:szCs w:val="20"/>
               </w:rPr>
-              <w:t xml:space="preserve">What Defendant 1 says about their work when they give their finances (an individual or sole trader admitting and not paying immediately).</w:t>
+              <w:t xml:space="preserve">Defendant 2's response, or in a 2v1 claim the defendant's response to Claimant 2.</w:t>
             </w:r>
           </w:p>
         </w:tc>
@@ -4467,7 +4585,7 @@
                 <w:sz w:val="20"/>
                 <w:szCs w:val="20"/>
               </w:rPr>
-              <w:t xml:space="preserve">RESPONDENT2_EMPLOYMENT</w:t>
+              <w:t xml:space="preserve">RESPONDENT1_EMPLOYMENT</w:t>
             </w:r>
           </w:p>
         </w:tc>
@@ -4548,7 +4666,7 @@
                 <w:sz w:val="20"/>
                 <w:szCs w:val="20"/>
               </w:rPr>
-              <w:t xml:space="preserve">The same for Defendant 2.</w:t>
+              <w:t xml:space="preserve">What Defendant 1 says about their work when they give their finances (an individual or sole trader admitting and not paying immediately).</w:t>
             </w:r>
           </w:p>
         </w:tc>
@@ -4580,7 +4698,7 @@
                 <w:sz w:val="20"/>
                 <w:szCs w:val="20"/>
               </w:rPr>
-              <w:t xml:space="preserve">ADMISSION_PAYMENT_ROUTE</w:t>
+              <w:t xml:space="preserve">RESPONDENT2_EMPLOYMENT</w:t>
             </w:r>
           </w:p>
         </w:tc>
@@ -4607,7 +4725,7 @@
                 <w:sz w:val="20"/>
                 <w:szCs w:val="20"/>
               </w:rPr>
-              <w:t xml:space="preserve">IMMEDIATELY, BY_SET_DATE, SUGGESTION_OF_REPAYMENT_PLAN</w:t>
+              <w:t xml:space="preserve">RETIRED, SELF_EMPLOYED</w:t>
             </w:r>
           </w:p>
         </w:tc>
@@ -4634,7 +4752,7 @@
                 <w:sz w:val="20"/>
                 <w:szCs w:val="20"/>
               </w:rPr>
-              <w:t xml:space="preserve">IMMEDIATELY</w:t>
+              <w:t xml:space="preserve">RETIRED</w:t>
             </w:r>
           </w:p>
         </w:tc>
@@ -4661,7 +4779,7 @@
                 <w:sz w:val="20"/>
                 <w:szCs w:val="20"/>
               </w:rPr>
-              <w:t xml:space="preserve">When a defendant who admits all or part of the claim will pay.</w:t>
+              <w:t xml:space="preserve">The same for Defendant 2.</w:t>
             </w:r>
           </w:p>
         </w:tc>
@@ -4693,7 +4811,7 @@
                 <w:sz w:val="20"/>
                 <w:szCs w:val="20"/>
               </w:rPr>
-              <w:t xml:space="preserve">CLAIMANT_PROCEED</w:t>
+              <w:t xml:space="preserve">ADMISSION_PAYMENT_ROUTE</w:t>
             </w:r>
           </w:p>
         </w:tc>
@@ -4720,7 +4838,7 @@
                 <w:sz w:val="20"/>
                 <w:szCs w:val="20"/>
               </w:rPr>
-              <w:t xml:space="preserve">Yes, No</w:t>
+              <w:t xml:space="preserve">IMMEDIATELY, BY_SET_DATE, SUGGESTION_OF_REPAYMENT_PLAN</w:t>
             </w:r>
           </w:p>
         </w:tc>
@@ -4747,7 +4865,7 @@
                 <w:sz w:val="20"/>
                 <w:szCs w:val="20"/>
               </w:rPr>
-              <w:t xml:space="preserve">Yes</w:t>
+              <w:t xml:space="preserve">IMMEDIATELY</w:t>
             </w:r>
           </w:p>
         </w:tc>
@@ -4774,7 +4892,7 @@
                 <w:sz w:val="20"/>
                 <w:szCs w:val="20"/>
               </w:rPr>
-              <w:t xml:space="preserve">Whether the claimant proceeds with the claim after the defendants' full defences, or after a 2v1 or 1v2SS admission. Any other value stops the run.</w:t>
+              <w:t xml:space="preserve">When a defendant who admits all or part of the claim will pay.</w:t>
             </w:r>
           </w:p>
         </w:tc>
@@ -4806,7 +4924,7 @@
                 <w:sz w:val="20"/>
                 <w:szCs w:val="20"/>
               </w:rPr>
-              <w:t xml:space="preserve">CLAIMANT_ACCEPTS_AMOUNT</w:t>
+              <w:t xml:space="preserve">CLAIMANT_PROCEED</w:t>
             </w:r>
           </w:p>
         </w:tc>
@@ -4887,7 +5005,7 @@
                 <w:sz w:val="20"/>
                 <w:szCs w:val="20"/>
               </w:rPr>
-              <w:t xml:space="preserve">Whether the claimant accepts the amount a 1v1 defendant admits (part admission).</w:t>
+              <w:t xml:space="preserve">Whether the claimant proceeds with the claim after the defendants' full defences, or after a 2v1 or 1v2SS admission. Any other value stops the run.</w:t>
             </w:r>
           </w:p>
         </w:tc>
@@ -4919,7 +5037,7 @@
                 <w:sz w:val="20"/>
                 <w:szCs w:val="20"/>
               </w:rPr>
-              <w:t xml:space="preserve">CLAIMANT_ACCEPTS_PLAN</w:t>
+              <w:t xml:space="preserve">CLAIMANT_ACCEPTS_AMOUNT</w:t>
             </w:r>
           </w:p>
         </w:tc>
@@ -5000,7 +5118,7 @@
                 <w:sz w:val="20"/>
                 <w:szCs w:val="20"/>
               </w:rPr>
-              <w:t xml:space="preserve">Whether the claimant accepts a 1v1 defendant's payment date or repayment plan.</w:t>
+              <w:t xml:space="preserve">Whether the claimant accepts the amount a 1v1 defendant admits (part admission).</w:t>
             </w:r>
           </w:p>
         </w:tc>
@@ -5032,7 +5150,7 @@
                 <w:sz w:val="20"/>
                 <w:szCs w:val="20"/>
               </w:rPr>
-              <w:t xml:space="preserve">CLAIMANT_SUGGESTED_PAYMENT</w:t>
+              <w:t xml:space="preserve">CLAIMANT_ACCEPTS_PLAN</w:t>
             </w:r>
           </w:p>
         </w:tc>
@@ -5059,7 +5177,7 @@
                 <w:sz w:val="20"/>
                 <w:szCs w:val="20"/>
               </w:rPr>
-              <w:t xml:space="preserve">IMMEDIATELY, SET_DATE, REPAYMENT_PLAN</w:t>
+              <w:t xml:space="preserve">Yes, No</w:t>
             </w:r>
           </w:p>
         </w:tc>
@@ -5086,7 +5204,7 @@
                 <w:sz w:val="20"/>
                 <w:szCs w:val="20"/>
               </w:rPr>
-              <w:t xml:space="preserve">IMMEDIATELY</w:t>
+              <w:t xml:space="preserve">Yes</w:t>
             </w:r>
           </w:p>
         </w:tc>
@@ -5113,7 +5231,7 @@
                 <w:sz w:val="20"/>
                 <w:szCs w:val="20"/>
               </w:rPr>
-              <w:t xml:space="preserve">How the claimant suggests the defendant pays when they reject the date or plan.</w:t>
+              <w:t xml:space="preserve">Whether the claimant accepts a 1v1 defendant's payment date or repayment plan.</w:t>
             </w:r>
           </w:p>
         </w:tc>
@@ -5145,6 +5263,119 @@
                 <w:sz w:val="20"/>
                 <w:szCs w:val="20"/>
               </w:rPr>
+              <w:t xml:space="preserve">CLAIMANT_SUGGESTED_PAYMENT</w:t>
+            </w:r>
+          </w:p>
+        </w:tc>
+        <w:tc>
+          <w:tcPr>
+            <w:tcW w:type="dxa" w:w="3196"/>
+            <w:tcBorders>
+              <w:top w:val="single" w:color="BFBFBF" w:sz="4"/>
+              <w:left w:val="single" w:color="BFBFBF" w:sz="4"/>
+              <w:bottom w:val="single" w:color="BFBFBF" w:sz="4"/>
+              <w:right w:val="single" w:color="BFBFBF" w:sz="4"/>
+            </w:tcBorders>
+            <w:tcMar>
+              <w:top w:type="dxa" w:w="60"/>
+              <w:left w:type="dxa" w:w="100"/>
+              <w:bottom w:type="dxa" w:w="60"/>
+              <w:right w:type="dxa" w:w="100"/>
+            </w:tcMar>
+          </w:tcPr>
+          <w:p>
+            <w:r>
+              <w:rPr>
+                <w:rFonts w:ascii="Arial" w:cs="Arial" w:eastAsia="Arial" w:hAnsi="Arial"/>
+                <w:sz w:val="20"/>
+                <w:szCs w:val="20"/>
+              </w:rPr>
+              <w:t xml:space="preserve">IMMEDIATELY, SET_DATE, REPAYMENT_PLAN</w:t>
+            </w:r>
+          </w:p>
+        </w:tc>
+        <w:tc>
+          <w:tcPr>
+            <w:tcW w:type="dxa" w:w="1551"/>
+            <w:tcBorders>
+              <w:top w:val="single" w:color="BFBFBF" w:sz="4"/>
+              <w:left w:val="single" w:color="BFBFBF" w:sz="4"/>
+              <w:bottom w:val="single" w:color="BFBFBF" w:sz="4"/>
+              <w:right w:val="single" w:color="BFBFBF" w:sz="4"/>
+            </w:tcBorders>
+            <w:tcMar>
+              <w:top w:type="dxa" w:w="60"/>
+              <w:left w:type="dxa" w:w="100"/>
+              <w:bottom w:type="dxa" w:w="60"/>
+              <w:right w:type="dxa" w:w="100"/>
+            </w:tcMar>
+          </w:tcPr>
+          <w:p>
+            <w:r>
+              <w:rPr>
+                <w:rFonts w:ascii="Arial" w:cs="Arial" w:eastAsia="Arial" w:hAnsi="Arial"/>
+                <w:sz w:val="20"/>
+                <w:szCs w:val="20"/>
+              </w:rPr>
+              <w:t xml:space="preserve">IMMEDIATELY</w:t>
+            </w:r>
+          </w:p>
+        </w:tc>
+        <w:tc>
+          <w:tcPr>
+            <w:tcW w:type="dxa" w:w="3199"/>
+            <w:tcBorders>
+              <w:top w:val="single" w:color="BFBFBF" w:sz="4"/>
+              <w:left w:val="single" w:color="BFBFBF" w:sz="4"/>
+              <w:bottom w:val="single" w:color="BFBFBF" w:sz="4"/>
+              <w:right w:val="single" w:color="BFBFBF" w:sz="4"/>
+            </w:tcBorders>
+            <w:tcMar>
+              <w:top w:type="dxa" w:w="60"/>
+              <w:left w:type="dxa" w:w="100"/>
+              <w:bottom w:type="dxa" w:w="60"/>
+              <w:right w:type="dxa" w:w="100"/>
+            </w:tcMar>
+          </w:tcPr>
+          <w:p>
+            <w:r>
+              <w:rPr>
+                <w:rFonts w:ascii="Arial" w:cs="Arial" w:eastAsia="Arial" w:hAnsi="Arial"/>
+                <w:sz w:val="20"/>
+                <w:szCs w:val="20"/>
+              </w:rPr>
+              <w:t xml:space="preserve">How the claimant suggests the defendant pays when they reject the date or plan.</w:t>
+            </w:r>
+          </w:p>
+        </w:tc>
+      </w:tr>
+      <w:tr>
+        <w:trPr>
+          <w:tblHeader w:val="off"/>
+        </w:trPr>
+        <w:tc>
+          <w:tcPr>
+            <w:tcW w:type="dxa" w:w="1692"/>
+            <w:tcBorders>
+              <w:top w:val="single" w:color="BFBFBF" w:sz="4"/>
+              <w:left w:val="single" w:color="BFBFBF" w:sz="4"/>
+              <w:bottom w:val="single" w:color="BFBFBF" w:sz="4"/>
+              <w:right w:val="single" w:color="BFBFBF" w:sz="4"/>
+            </w:tcBorders>
+            <w:tcMar>
+              <w:top w:type="dxa" w:w="60"/>
+              <w:left w:type="dxa" w:w="100"/>
+              <w:bottom w:type="dxa" w:w="60"/>
+              <w:right w:type="dxa" w:w="100"/>
+            </w:tcMar>
+          </w:tcPr>
+          <w:p>
+            <w:r>
+              <w:rPr>
+                <w:rFonts w:ascii="Courier New" w:cs="Courier New" w:eastAsia="Courier New" w:hAnsi="Courier New"/>
+                <w:sz w:val="20"/>
+                <w:szCs w:val="20"/>
+              </w:rPr>
               <w:t xml:space="preserve">FINAL_ORDER</w:t>
             </w:r>
           </w:p>
@@ -5248,7 +5479,7 @@
         <w:rPr>
           <w:rFonts w:ascii="Arial" w:cs="Arial" w:eastAsia="Arial" w:hAnsi="Arial"/>
         </w:rPr>
-        <w:t xml:space="preserve">11. Run settings</w:t>
+        <w:t xml:space="preserve">12. Run settings</w:t>
       </w:r>
     </w:p>
     <w:p>

</xml_diff>

<commit_message>
Add Manage Contact Information to the specified journey
With MANAGE_CONTACT_INFORMATION set, once the claimant has responded and
the claim is still online, each entry is a Manage Contact Information
run as the admin or a solicitor, through the UI or the API, reusing the
unspecified journey's event classes. civil-service does not let a
solicitor run it while the claim waits in AWAITING_APPLICANT_INTENTION,
so their runs are skipped then.

The contact information specs now take either journey's claim. A
specified claim has no litigation friends and names no witnesses or
experts for a solicitor to change, so those choices are rejected before
the run starts. The new address line is shortened to fit the 35
characters civil-service allows for a specified claim's party. The guide
gains a Manage Contact Information section and the Word copy is
regenerated.
</commit_message>
<xml_diff>
--- a/playwright-tests/RUNNING_SPECIFIED_TESTS.docx
+++ b/playwright-tests/RUNNING_SPECIFIED_TESTS.docx
@@ -256,7 +256,7 @@
         <w:rPr>
           <w:rFonts w:ascii="Arial" w:cs="Arial" w:eastAsia="Arial" w:hAnsi="Arial"/>
         </w:rPr>
-        <w:t xml:space="preserve">CREATE_SDO: the judge makes a Standard Direction Order, moving the claim from JUDICIAL_REFERRAL to CASE_PROGRESSION. It only runs on the fast track, when the claimant's response took the claim to JUDICIAL_REFERRAL. It is always done in the UI, where the judge opens the event by its URL (and claims the directions task first where work allocation needs one).</w:t>
+        <w:t xml:space="preserve">MANAGE_CONTACT_INFORMATION (group, optional): once the claimant has responded and the claim is still online, each run in MANAGE_CONTACT_INFORMATION updates contact details with "Manage Contact Information", as the admin or a solicitor (see section 9). The test checks each change was saved, and the claim stays in the state the claimant's response left it in. It has an API version.</w:t>
       </w:r>
     </w:p>
     <w:p>
@@ -275,7 +275,7 @@
         <w:rPr>
           <w:rFonts w:ascii="Arial" w:cs="Arial" w:eastAsia="Arial" w:hAnsi="Arial"/>
         </w:rPr>
-        <w:t xml:space="preserve">MAKE_DIRECTIONS_ORDER: on the intermediate and multi tracks, which have no Standard Direction Order, the judge makes a directions order with "Make an order" instead, also moving the claim from JUDICIAL_REFERRAL to CASE_PROGRESSION. The judge keeps the claim on its track, chooses the blank template for an order before a hearing and uploads the completed order (playwright-tests/documents/TEST_ORDER.docx; the page only takes Word documents). It is always done in the UI (claiming the track allocation task first where work allocation needs one).</w:t>
+        <w:t xml:space="preserve">CREATE_SDO: the judge makes a Standard Direction Order, moving the claim from JUDICIAL_REFERRAL to CASE_PROGRESSION. It only runs on the fast track, when the claimant's response took the claim to JUDICIAL_REFERRAL. It is always done in the UI, where the judge opens the event by its URL (and claims the directions task first where work allocation needs one).</w:t>
       </w:r>
     </w:p>
     <w:p>
@@ -294,7 +294,7 @@
         <w:rPr>
           <w:rFonts w:ascii="Arial" w:cs="Arial" w:eastAsia="Arial" w:hAnsi="Arial"/>
         </w:rPr>
-        <w:t xml:space="preserve">UPLOAD_EVIDENCE (group: _CLAIMANT_SOLICITOR, _DEFENDANT1_SOLICITOR, _DEFENDANT2_SOLICITOR): once the judge's order has moved the claim to CASE_PROGRESSION, each solicitor uploads a disclosure list with "Upload Your Documents" (the second defendant's solicitor only for 1v2DS). A solicitor acting for two parties uploads it for both. The claim stays in CASE_PROGRESSION. It is always done in the UI.</w:t>
+        <w:t xml:space="preserve">MAKE_DIRECTIONS_ORDER: on the intermediate and multi tracks, which have no Standard Direction Order, the judge makes a directions order with "Make an order" instead, also moving the claim from JUDICIAL_REFERRAL to CASE_PROGRESSION. The judge keeps the claim on its track, chooses the blank template for an order before a hearing and uploads the completed order (playwright-tests/documents/TEST_ORDER.docx; the page only takes Word documents). It is always done in the UI (claiming the track allocation task first where work allocation needs one).</w:t>
       </w:r>
     </w:p>
     <w:p>
@@ -313,7 +313,7 @@
         <w:rPr>
           <w:rFonts w:ascii="Arial" w:cs="Arial" w:eastAsia="Arial" w:hAnsi="Arial"/>
         </w:rPr>
-        <w:t xml:space="preserve">CREATE_HEARING_NOTICE: once the evidence is in, the hearing centre admin lists the trial with "Create a hearing notice" (a first listing of a "Trial (Fast, Intermediate and Multi track)" notice at Clerkenwell, 8 weeks ahead). This stands in for HMC returning a listed hearing. civil-service works out the hearing fee and moves the claim to HEARING_READINESS. It is always done in the UI.</w:t>
+        <w:t xml:space="preserve">UPLOAD_EVIDENCE (group: _CLAIMANT_SOLICITOR, _DEFENDANT1_SOLICITOR, _DEFENDANT2_SOLICITOR): once the judge's order has moved the claim to CASE_PROGRESSION, each solicitor uploads a disclosure list with "Upload Your Documents" (the second defendant's solicitor only for 1v2DS). A solicitor acting for two parties uploads it for both. The claim stays in CASE_PROGRESSION. It is always done in the UI.</w:t>
       </w:r>
     </w:p>
     <w:p>
@@ -332,7 +332,7 @@
         <w:rPr>
           <w:rFonts w:ascii="Arial" w:cs="Arial" w:eastAsia="Arial" w:hAnsi="Arial"/>
         </w:rPr>
-        <w:t xml:space="preserve">PAY_HEARING_FEE: the claimant's solicitor pays the hearing fee from the Service Request tab, by PBA or card (PAYMENT_METHOD). If the payment service has not told civil-service about the payment within a minute, the test does. The test then runs HEARING_FEE_PAID, which civil-service's scheduler would otherwise run later, moving the claim to PREPARE_FOR_HEARING_CONDUCT_HEARING. It is always done in the UI.</w:t>
+        <w:t xml:space="preserve">CREATE_HEARING_NOTICE: once the evidence is in, the hearing centre admin lists the trial with "Create a hearing notice" (a first listing of a "Trial (Fast, Intermediate and Multi track)" notice at Clerkenwell, 8 weeks ahead). This stands in for HMC returning a listed hearing. civil-service works out the hearing fee and moves the claim to HEARING_READINESS. It is always done in the UI.</w:t>
       </w:r>
     </w:p>
     <w:p>
@@ -351,7 +351,7 @@
         <w:rPr>
           <w:rFonts w:ascii="Arial" w:cs="Arial" w:eastAsia="Arial" w:hAnsi="Arial"/>
         </w:rPr>
-        <w:t xml:space="preserve">TRIAL_READY_CHECK: on the fast track only, the parties are asked to confirm they are ready for trial. civil-service's scheduler does this once the hearing is less than 3 weeks away; the hearing is 8 weeks ahead, so the test runs the event itself and checks it was recorded on the case. The claim stays in PREPARE_FOR_HEARING_CONDUCT_HEARING.</w:t>
+        <w:t xml:space="preserve">PAY_HEARING_FEE: the claimant's solicitor pays the hearing fee from the Service Request tab, by PBA or card (PAYMENT_METHOD). If the payment service has not told civil-service about the payment within a minute, the test does. The test then runs HEARING_FEE_PAID, which civil-service's scheduler would otherwise run later, moving the claim to PREPARE_FOR_HEARING_CONDUCT_HEARING. It is always done in the UI.</w:t>
       </w:r>
     </w:p>
     <w:p>
@@ -370,7 +370,7 @@
         <w:rPr>
           <w:rFonts w:ascii="Arial" w:cs="Arial" w:eastAsia="Arial" w:hAnsi="Arial"/>
         </w:rPr>
-        <w:t xml:space="preserve">CONFIRM_TRIAL_ARRANGEMENTS (group: _CLAIMANT_SOLICITOR, _DEFENDANT1_SOLICITOR, _DEFENDANT2_SOLICITOR): each solicitor confirms with "Confirm trial arrangements" that the case is ready for trial, with no change to the hearing requirements (the second defendant's solicitor only for 1v2DS). A solicitor acting for two parties confirms for both. Like the trial ready check it is fast track only (XUI does not offer it on the intermediate or multi tracks), and it has to be done more than 3 weeks before the hearing. The claim stays in PREPARE_FOR_HEARING_CONDUCT_HEARING. It is always done in the UI.</w:t>
+        <w:t xml:space="preserve">TRIAL_READY_CHECK: on the fast track only, the parties are asked to confirm they are ready for trial. civil-service's scheduler does this once the hearing is less than 3 weeks away; the hearing is 8 weeks ahead, so the test runs the event itself and checks it was recorded on the case. The claim stays in PREPARE_FOR_HEARING_CONDUCT_HEARING.</w:t>
       </w:r>
     </w:p>
     <w:p>
@@ -389,7 +389,7 @@
         <w:rPr>
           <w:rFonts w:ascii="Arial" w:cs="Arial" w:eastAsia="Arial" w:hAnsi="Arial"/>
         </w:rPr>
-        <w:t xml:space="preserve">CREATE_TRIAL_BUNDLE: the trial bundle is created. civil-service's scheduler does this about 3 weeks before the hearing, for every track except intermediate and multi (small claims have bundles too, but go to mediation in this journey), so the test asks civil-service to do it now, waits for the bundle to be stitched into one document and checks the claimant's solicitor sees it on the Bundles tab. The claim stays in PREPARE_FOR_HEARING_CONDUCT_HEARING.</w:t>
+        <w:t xml:space="preserve">CONFIRM_TRIAL_ARRANGEMENTS (group: _CLAIMANT_SOLICITOR, _DEFENDANT1_SOLICITOR, _DEFENDANT2_SOLICITOR): each solicitor confirms with "Confirm trial arrangements" that the case is ready for trial, with no change to the hearing requirements (the second defendant's solicitor only for 1v2DS). A solicitor acting for two parties confirms for both. Like the trial ready check it is fast track only (XUI does not offer it on the intermediate or multi tracks), and it has to be done more than 3 weeks before the hearing. The claim stays in PREPARE_FOR_HEARING_CONDUCT_HEARING. It is always done in the UI.</w:t>
       </w:r>
     </w:p>
     <w:p>
@@ -408,7 +408,7 @@
         <w:rPr>
           <w:rFonts w:ascii="Arial" w:cs="Arial" w:eastAsia="Arial" w:hAnsi="Arial"/>
         </w:rPr>
-        <w:t xml:space="preserve">MOVE_TO_DECISION_OUTCOME: once the hearing date has passed, civil-service's scheduler moves the claim to DECISION_OUTCOME to wait for the judge's decision, on every track. The hearing is weeks away, so the test runs the event itself.</w:t>
+        <w:t xml:space="preserve">CREATE_TRIAL_BUNDLE: the trial bundle is created. civil-service's scheduler does this about 3 weeks before the hearing, for every track except intermediate and multi (small claims have bundles too, but go to mediation in this journey), so the test asks civil-service to do it now, waits for the bundle to be stitched into one document and checks the claimant's solicitor sees it on the Bundles tab. The claim stays in PREPARE_FOR_HEARING_CONDUCT_HEARING.</w:t>
       </w:r>
     </w:p>
     <w:p>
@@ -427,7 +427,7 @@
         <w:rPr>
           <w:rFonts w:ascii="Arial" w:cs="Arial" w:eastAsia="Arial" w:hAnsi="Arial"/>
         </w:rPr>
-        <w:t xml:space="preserve">MAKE_FINAL_ORDER: the judge makes the final order with "Make an order" (FINAL_ORDER, see section 11). On the fast track the judge writes a free form or an assisted order on the page. On the intermediate and multi tracks the judge keeps the claim on its track, picks a template (for the after-hearing template, giving today as the hearing date), and uploads the completed order (playwright-tests/documents/TEST_ORDER.docx). The test checks the order was added to the case and its notifications sent. The claim stays in DECISION_OUTCOME. It is always done in the UI.</w:t>
+        <w:t xml:space="preserve">MOVE_TO_DECISION_OUTCOME: once the hearing date has passed, civil-service's scheduler moves the claim to DECISION_OUTCOME to wait for the judge's decision, on every track. The hearing is weeks away, so the test runs the event itself.</w:t>
       </w:r>
     </w:p>
     <w:p>
@@ -446,6 +446,25 @@
         <w:rPr>
           <w:rFonts w:ascii="Arial" w:cs="Arial" w:eastAsia="Arial" w:hAnsi="Arial"/>
         </w:rPr>
+        <w:t xml:space="preserve">MAKE_FINAL_ORDER: the judge makes the final order with "Make an order" (FINAL_ORDER, see section 12). On the fast track the judge writes a free form or an assisted order on the page. On the intermediate and multi tracks the judge keeps the claim on its track, picks a template (for the after-hearing template, giving today as the hearing date), and uploads the completed order (playwright-tests/documents/TEST_ORDER.docx). The test checks the order was added to the case and its notifications sent. The claim stays in DECISION_OUTCOME. It is always done in the UI.</w:t>
+      </w:r>
+    </w:p>
+    <w:p>
+      <w:pPr>
+        <w:pStyle w:val="ListParagraph"/>
+        <w:numPr>
+          <w:ilvl w:val="0"/>
+          <w:numId w:val="2"/>
+        </w:numPr>
+        <w:tabs>
+          <w:tab w:val="left" w:pos="720"/>
+        </w:tabs>
+        <w:spacing w:after="60"/>
+      </w:pPr>
+      <w:r>
+        <w:rPr>
+          <w:rFonts w:ascii="Arial" w:cs="Arial" w:eastAsia="Arial" w:hAnsi="Arial"/>
+        </w:rPr>
         <w:t xml:space="preserve">CONFIRM_ORDER_REVIEW: the hearing centre admin reviews the order with "Confirm order review": no date a party must do something by, a final order, and nothing left to do. This closes the claim on any track, moving it to All_FINAL_ORDERS_ISSUED. It is always done in the UI.</w:t>
       </w:r>
     </w:p>
@@ -490,7 +509,7 @@
         <w:rPr>
           <w:rFonts w:ascii="Arial" w:cs="Arial" w:eastAsia="Arial" w:hAnsi="Arial"/>
         </w:rPr>
-        <w:t xml:space="preserve">The steps with an API version are CREATE_CLAIM, INFORM_AGREED_EXTENSION_DEFENDANT1/2, RESPOND_TO_CLAIM_DEFENDANT1/2 and RESPOND_TO_DEFENCE. ADD_CASE_NOTE, CREATE_CASE_FLAGS, MAKE_CASE_FLAG_INACTIVE, CREATE_SDO, MAKE_DIRECTIONS_ORDER, UPLOAD_EVIDENCE, CREATE_HEARING_NOTICE, PAY_HEARING_FEE, CONFIRM_TRIAL_ARRANGEMENTS, MAKE_FINAL_ORDER and CONFIRM_ORDER_REVIEW always use the UI. With API_UNTIL=&lt;state&gt; they go through the CCD API until the claim reaches that state, and every step after it goes through the UI. Leave API_UNTIL unset to do everything through the UI.</w:t>
+        <w:t xml:space="preserve">The steps with an API version are CREATE_CLAIM, INFORM_AGREED_EXTENSION_DEFENDANT1/2, RESPOND_TO_CLAIM_DEFENDANT1/2, RESPOND_TO_DEFENCE and MANAGE_CONTACT_INFORMATION. ADD_CASE_NOTE, CREATE_CASE_FLAGS, MAKE_CASE_FLAG_INACTIVE, CREATE_SDO, MAKE_DIRECTIONS_ORDER, UPLOAD_EVIDENCE, CREATE_HEARING_NOTICE, PAY_HEARING_FEE, CONFIRM_TRIAL_ARRANGEMENTS, MAKE_FINAL_ORDER and CONFIRM_ORDER_REVIEW always use the UI. With API_UNTIL=&lt;state&gt; they go through the CCD API until the claim reaches that state, and every step after it goes through the UI. Leave API_UNTIL unset to do everything through the UI.</w:t>
       </w:r>
     </w:p>
     <w:p>
@@ -2521,7 +2540,7 @@
         <w:rPr>
           <w:rFonts w:ascii="Arial" w:cs="Arial" w:eastAsia="Arial" w:hAnsi="Arial"/>
         </w:rPr>
-        <w:t xml:space="preserve">9. Paying fees by PBA or card</w:t>
+        <w:t xml:space="preserve">9. Manage Contact Information</w:t>
       </w:r>
     </w:p>
     <w:p>
@@ -2532,7 +2551,67 @@
         <w:rPr>
           <w:rFonts w:ascii="Arial" w:cs="Arial" w:eastAsia="Arial" w:hAnsi="Arial"/>
         </w:rPr>
-        <w:t xml:space="preserve">PAYMENT_METHOD picks how the claimant's solicitor pays the claim fee and the hearing fee. PBA (the default) pays from their PBA account. CARD pays on GOV.UK Pay's pages with a test card, always in the UI, even when the claim is created through the API. Use CARD when PBA payments fail on the environment, for example with "Unable to retrieve account information".</w:t>
+        <w:t xml:space="preserve">MANAGE_CONTACT_INFORMATION switches on the contact information steps, which run once the claimant has responded and the claim is still online.</w:t>
+      </w:r>
+    </w:p>
+    <w:p>
+      <w:pPr>
+        <w:pStyle w:val="ListParagraph"/>
+        <w:numPr>
+          <w:ilvl w:val="0"/>
+          <w:numId w:val="2"/>
+        </w:numPr>
+        <w:tabs>
+          <w:tab w:val="left" w:pos="720"/>
+        </w:tabs>
+        <w:spacing w:after="60"/>
+      </w:pPr>
+      <w:r>
+        <w:rPr>
+          <w:rFonts w:ascii="Arial" w:cs="Arial" w:eastAsia="Arial" w:hAnsi="Arial"/>
+        </w:rPr>
+        <w:t xml:space="preserve">representative: the claimant's solicitor changes Claimant 1's details and adds someone attending for their firm, each defendant's solicitor changes their client's details, and the admin adds a witness for Defendant 1. A run for a party or solicitor the claim does not have is left out.</w:t>
+      </w:r>
+    </w:p>
+    <w:p>
+      <w:pPr>
+        <w:pStyle w:val="ListParagraph"/>
+        <w:numPr>
+          <w:ilvl w:val="0"/>
+          <w:numId w:val="2"/>
+        </w:numPr>
+        <w:tabs>
+          <w:tab w:val="left" w:pos="720"/>
+        </w:tabs>
+        <w:spacing w:after="60"/>
+      </w:pPr>
+      <w:r>
+        <w:rPr>
+          <w:rFonts w:ascii="Arial" w:cs="Arial" w:eastAsia="Arial" w:hAnsi="Arial"/>
+        </w:rPr>
+        <w:t xml:space="preserve">A list of user:party, one run of the event each. The users are admin, claimantSolicitor, respondent1Solicitor and respondent2Solicitor; the parties are the event's options, e.g. CLAIMANT_1, DEFENDANT_1_LR_INDIVIDUALS or DEFENDANT_2_ORGANISATION_INDIVIDUALS (a company or organisation defendant).</w:t>
+      </w:r>
+    </w:p>
+    <w:p>
+      <w:pPr>
+        <w:spacing w:after="120"/>
+      </w:pPr>
+      <w:r>
+        <w:rPr>
+          <w:rFonts w:ascii="Arial" w:cs="Arial" w:eastAsia="Arial" w:hAnsi="Arial"/>
+        </w:rPr>
+        <w:t xml:space="preserve">A party's email and first address line are changed, someone attending for an organisation or its solicitor is added, and the admin adds a witness or expert. A solicitor only sees their own client's side. A specified claim names no witnesses or experts and has no litigation friends, so a solicitor cannot choose witnesses or experts, and no one can choose a litigation friend. A run the claim does not allow stops the run before it starts.</w:t>
+      </w:r>
+    </w:p>
+    <w:p>
+      <w:pPr>
+        <w:spacing w:after="120"/>
+      </w:pPr>
+      <w:r>
+        <w:rPr>
+          <w:rFonts w:ascii="Arial" w:cs="Arial" w:eastAsia="Arial" w:hAnsi="Arial"/>
+        </w:rPr>
+        <w:t xml:space="preserve">civil-service does not let a solicitor manage contact information while a claim waits in AWAITING_APPLICANT_INTENTION (a 1v1 full admission paid immediately), so a solicitor's run is skipped then; the admin's still runs.</w:t>
       </w:r>
     </w:p>
     <w:p>
@@ -2546,29 +2625,7 @@
           <w:sz w:val="18"/>
           <w:szCs w:val="18"/>
         </w:rPr>
-        <w:t xml:space="preserve">ENV=aat PAYMENT_METHOD=CARD API_UNTIL=JUDICIAL_REFERRAL npx playwright test playwright-tests/e2e/journeys/SpecifiedSS.test.ts --project chromium</w:t>
-      </w:r>
-    </w:p>
-    <w:p>
-      <w:pPr>
-        <w:pStyle w:val="Heading2"/>
-      </w:pPr>
-      <w:r>
-        <w:rPr>
-          <w:rFonts w:ascii="Arial" w:cs="Arial" w:eastAsia="Arial" w:hAnsi="Arial"/>
-        </w:rPr>
-        <w:t xml:space="preserve">10. Named scenarios</w:t>
-      </w:r>
-    </w:p>
-    <w:p>
-      <w:pPr>
-        <w:spacing w:after="120"/>
-      </w:pPr>
-      <w:r>
-        <w:rPr>
-          <w:rFonts w:ascii="Arial" w:cs="Arial" w:eastAsia="Arial" w:hAnsi="Arial"/>
-        </w:rPr>
-        <w:t xml:space="preserve">Run a named scenario from playwright-tests/scenarios/specifiedScenarios.ts, or use a test:SPEC_* script in package.json:</w:t>
+        <w:t xml:space="preserve">ENV=aat MANAGE_CONTACT_INFORMATION=representative STOP_AFTER_TEST=MANAGE_CONTACT_INFORMATION npx playwright test playwright-tests/e2e/journeys/SpecifiedSS.test.ts --project chromium</w:t>
       </w:r>
     </w:p>
     <w:p>
@@ -2582,6 +2639,78 @@
           <w:sz w:val="18"/>
           <w:szCs w:val="18"/>
         </w:rPr>
+        <w:t xml:space="preserve">ENV=aat CLAIM_TYPE=1v2DS DEFENDANT_TYPE=COMPANY API_UNTIL=JUDICIAL_REFERRAL MANAGE_CONTACT_INFORMATION='admin:CLAIMANT_1,respondent1Solicitor:DEFENDANT_1_ORGANISATION_INDIVIDUALS,respondent2Solicitor:DEFENDANT_2' STOP_AFTER_TEST=MANAGE_CONTACT_INFORMATION npx playwright test playwright-tests/e2e/journeys/SpecifiedSS.test.ts --project chromium</w:t>
+      </w:r>
+    </w:p>
+    <w:p>
+      <w:pPr>
+        <w:pStyle w:val="Heading2"/>
+      </w:pPr>
+      <w:r>
+        <w:rPr>
+          <w:rFonts w:ascii="Arial" w:cs="Arial" w:eastAsia="Arial" w:hAnsi="Arial"/>
+        </w:rPr>
+        <w:t xml:space="preserve">10. Paying fees by PBA or card</w:t>
+      </w:r>
+    </w:p>
+    <w:p>
+      <w:pPr>
+        <w:spacing w:after="120"/>
+      </w:pPr>
+      <w:r>
+        <w:rPr>
+          <w:rFonts w:ascii="Arial" w:cs="Arial" w:eastAsia="Arial" w:hAnsi="Arial"/>
+        </w:rPr>
+        <w:t xml:space="preserve">PAYMENT_METHOD picks how the claimant's solicitor pays the claim fee and the hearing fee. PBA (the default) pays from their PBA account. CARD pays on GOV.UK Pay's pages with a test card, always in the UI, even when the claim is created through the API. Use CARD when PBA payments fail on the environment, for example with "Unable to retrieve account information".</w:t>
+      </w:r>
+    </w:p>
+    <w:p>
+      <w:pPr>
+        <w:shd w:fill="F2F2F2" w:color="auto" w:val="clear"/>
+        <w:spacing w:after="160" w:before="60"/>
+      </w:pPr>
+      <w:r>
+        <w:rPr>
+          <w:rFonts w:ascii="Courier New" w:cs="Courier New" w:eastAsia="Courier New" w:hAnsi="Courier New"/>
+          <w:sz w:val="18"/>
+          <w:szCs w:val="18"/>
+        </w:rPr>
+        <w:t xml:space="preserve">ENV=aat PAYMENT_METHOD=CARD API_UNTIL=JUDICIAL_REFERRAL npx playwright test playwright-tests/e2e/journeys/SpecifiedSS.test.ts --project chromium</w:t>
+      </w:r>
+    </w:p>
+    <w:p>
+      <w:pPr>
+        <w:pStyle w:val="Heading2"/>
+      </w:pPr>
+      <w:r>
+        <w:rPr>
+          <w:rFonts w:ascii="Arial" w:cs="Arial" w:eastAsia="Arial" w:hAnsi="Arial"/>
+        </w:rPr>
+        <w:t xml:space="preserve">11. Named scenarios</w:t>
+      </w:r>
+    </w:p>
+    <w:p>
+      <w:pPr>
+        <w:spacing w:after="120"/>
+      </w:pPr>
+      <w:r>
+        <w:rPr>
+          <w:rFonts w:ascii="Arial" w:cs="Arial" w:eastAsia="Arial" w:hAnsi="Arial"/>
+        </w:rPr>
+        <w:t xml:space="preserve">Run a named scenario from playwright-tests/scenarios/specifiedScenarios.ts, or use a test:SPEC_* script in package.json:</w:t>
+      </w:r>
+    </w:p>
+    <w:p>
+      <w:pPr>
+        <w:shd w:fill="F2F2F2" w:color="auto" w:val="clear"/>
+        <w:spacing w:after="160" w:before="60"/>
+      </w:pPr>
+      <w:r>
+        <w:rPr>
+          <w:rFonts w:ascii="Courier New" w:cs="Courier New" w:eastAsia="Courier New" w:hAnsi="Courier New"/>
+          <w:sz w:val="18"/>
+          <w:szCs w:val="18"/>
+        </w:rPr>
         <w:t xml:space="preserve">ENV=aat SCENARIOS=Yes npx playwright test playwright-tests/e2e/journeys/SpecifiedSS.test.ts --project chromium --grep @SPEC_1v2DS_FAST</w:t>
       </w:r>
     </w:p>
@@ -2593,7 +2722,7 @@
         <w:rPr>
           <w:rFonts w:ascii="Arial" w:cs="Arial" w:eastAsia="Arial" w:hAnsi="Arial"/>
         </w:rPr>
-        <w:t xml:space="preserve">11. Claim parameters</w:t>
+        <w:t xml:space="preserve">12. Claim parameters</w:t>
       </w:r>
     </w:p>
     <w:p>
@@ -4246,7 +4375,7 @@
                 <w:sz w:val="20"/>
                 <w:szCs w:val="20"/>
               </w:rPr>
-              <w:t xml:space="preserve">INFORM_AGREED_EXTENSION</w:t>
+              <w:t xml:space="preserve">MANAGE_CONTACT_INFORMATION</w:t>
             </w:r>
           </w:p>
         </w:tc>
@@ -4273,7 +4402,7 @@
                 <w:sz w:val="20"/>
                 <w:szCs w:val="20"/>
               </w:rPr>
-              <w:t xml:space="preserve">Yes, No</w:t>
+              <w:t xml:space="preserve">representative, or a list of user:party</w:t>
             </w:r>
           </w:p>
         </w:tc>
@@ -4300,7 +4429,7 @@
                 <w:sz w:val="20"/>
                 <w:szCs w:val="20"/>
               </w:rPr>
-              <w:t xml:space="preserve">No</w:t>
+              <w:t xml:space="preserve">None</w:t>
             </w:r>
           </w:p>
         </w:tc>
@@ -4327,7 +4456,7 @@
                 <w:sz w:val="20"/>
                 <w:szCs w:val="20"/>
               </w:rPr>
-              <w:t xml:space="preserve">Optional steps: each defendant's solicitor informs the court of an agreed extension before responding.</w:t>
+              <w:t xml:space="preserve">Optional steps: Manage Contact Information once the claimant has responded, one run per entry, each checked against the saved case data (section 9). Users: admin, claimantSolicitor, respondent1Solicitor, respondent2Solicitor. Parties: CLAIMANT_1/2, DEFENDANT_1/2, each with _ORGANISATION_INDIVIDUALS, and CLAIMANT_1/DEFENDANT_1/DEFENDANT_2 with _LR_INDIVIDUALS; the admin can also add _WITNESSES or _EXPERTS. Has an API version.</w:t>
             </w:r>
           </w:p>
         </w:tc>
@@ -4359,7 +4488,7 @@
                 <w:sz w:val="20"/>
                 <w:szCs w:val="20"/>
               </w:rPr>
-              <w:t xml:space="preserve">RESPONDENT1_RESPONSE</w:t>
+              <w:t xml:space="preserve">INFORM_AGREED_EXTENSION</w:t>
             </w:r>
           </w:p>
         </w:tc>
@@ -4386,7 +4515,7 @@
                 <w:sz w:val="20"/>
                 <w:szCs w:val="20"/>
               </w:rPr>
-              <w:t xml:space="preserve">FULL_DEFENCE, FULL_ADMISSION, PART_ADMISSION, COUNTER_CLAIM</w:t>
+              <w:t xml:space="preserve">Yes, No</w:t>
             </w:r>
           </w:p>
         </w:tc>
@@ -4413,7 +4542,7 @@
                 <w:sz w:val="20"/>
                 <w:szCs w:val="20"/>
               </w:rPr>
-              <w:t xml:space="preserve">FULL_DEFENCE</w:t>
+              <w:t xml:space="preserve">No</w:t>
             </w:r>
           </w:p>
         </w:tc>
@@ -4440,7 +4569,7 @@
                 <w:sz w:val="20"/>
                 <w:szCs w:val="20"/>
               </w:rPr>
-              <w:t xml:space="preserve">Defendant 1's response.</w:t>
+              <w:t xml:space="preserve">Optional steps: each defendant's solicitor informs the court of an agreed extension before responding.</w:t>
             </w:r>
           </w:p>
         </w:tc>
@@ -4472,7 +4601,7 @@
                 <w:sz w:val="20"/>
                 <w:szCs w:val="20"/>
               </w:rPr>
-              <w:t xml:space="preserve">RESPONDENT2_RESPONSE</w:t>
+              <w:t xml:space="preserve">RESPONDENT1_RESPONSE</w:t>
             </w:r>
           </w:p>
         </w:tc>
@@ -4553,7 +4682,7 @@
                 <w:sz w:val="20"/>
                 <w:szCs w:val="20"/>
               </w:rPr>
-              <w:t xml:space="preserve">Defendant 2's response, or in a 2v1 claim the defendant's response to Claimant 2.</w:t>
+              <w:t xml:space="preserve">Defendant 1's response.</w:t>
             </w:r>
           </w:p>
         </w:tc>
@@ -4585,7 +4714,7 @@
                 <w:sz w:val="20"/>
                 <w:szCs w:val="20"/>
               </w:rPr>
-              <w:t xml:space="preserve">RESPONDENT1_EMPLOYMENT</w:t>
+              <w:t xml:space="preserve">RESPONDENT2_RESPONSE</w:t>
             </w:r>
           </w:p>
         </w:tc>
@@ -4612,7 +4741,7 @@
                 <w:sz w:val="20"/>
                 <w:szCs w:val="20"/>
               </w:rPr>
-              <w:t xml:space="preserve">RETIRED, SELF_EMPLOYED</w:t>
+              <w:t xml:space="preserve">FULL_DEFENCE, FULL_ADMISSION, PART_ADMISSION, COUNTER_CLAIM</w:t>
             </w:r>
           </w:p>
         </w:tc>
@@ -4639,7 +4768,7 @@
                 <w:sz w:val="20"/>
                 <w:szCs w:val="20"/>
               </w:rPr>
-              <w:t xml:space="preserve">RETIRED</w:t>
+              <w:t xml:space="preserve">FULL_DEFENCE</w:t>
             </w:r>
           </w:p>
         </w:tc>
@@ -4666,7 +4795,7 @@
                 <w:sz w:val="20"/>
                 <w:szCs w:val="20"/>
               </w:rPr>
-              <w:t xml:space="preserve">What Defendant 1 says about their work when they give their finances (an individual or sole trader admitting and not paying immediately).</w:t>
+              <w:t xml:space="preserve">Defendant 2's response, or in a 2v1 claim the defendant's response to Claimant 2.</w:t>
             </w:r>
           </w:p>
         </w:tc>
@@ -4698,7 +4827,7 @@
                 <w:sz w:val="20"/>
                 <w:szCs w:val="20"/>
               </w:rPr>
-              <w:t xml:space="preserve">RESPONDENT2_EMPLOYMENT</w:t>
+              <w:t xml:space="preserve">RESPONDENT1_EMPLOYMENT</w:t>
             </w:r>
           </w:p>
         </w:tc>
@@ -4779,7 +4908,7 @@
                 <w:sz w:val="20"/>
                 <w:szCs w:val="20"/>
               </w:rPr>
-              <w:t xml:space="preserve">The same for Defendant 2.</w:t>
+              <w:t xml:space="preserve">What Defendant 1 says about their work when they give their finances (an individual or sole trader admitting and not paying immediately).</w:t>
             </w:r>
           </w:p>
         </w:tc>
@@ -4811,7 +4940,7 @@
                 <w:sz w:val="20"/>
                 <w:szCs w:val="20"/>
               </w:rPr>
-              <w:t xml:space="preserve">ADMISSION_PAYMENT_ROUTE</w:t>
+              <w:t xml:space="preserve">RESPONDENT2_EMPLOYMENT</w:t>
             </w:r>
           </w:p>
         </w:tc>
@@ -4838,7 +4967,7 @@
                 <w:sz w:val="20"/>
                 <w:szCs w:val="20"/>
               </w:rPr>
-              <w:t xml:space="preserve">IMMEDIATELY, BY_SET_DATE, SUGGESTION_OF_REPAYMENT_PLAN</w:t>
+              <w:t xml:space="preserve">RETIRED, SELF_EMPLOYED</w:t>
             </w:r>
           </w:p>
         </w:tc>
@@ -4865,7 +4994,7 @@
                 <w:sz w:val="20"/>
                 <w:szCs w:val="20"/>
               </w:rPr>
-              <w:t xml:space="preserve">IMMEDIATELY</w:t>
+              <w:t xml:space="preserve">RETIRED</w:t>
             </w:r>
           </w:p>
         </w:tc>
@@ -4892,7 +5021,7 @@
                 <w:sz w:val="20"/>
                 <w:szCs w:val="20"/>
               </w:rPr>
-              <w:t xml:space="preserve">When a defendant who admits all or part of the claim will pay.</w:t>
+              <w:t xml:space="preserve">The same for Defendant 2.</w:t>
             </w:r>
           </w:p>
         </w:tc>
@@ -4924,7 +5053,7 @@
                 <w:sz w:val="20"/>
                 <w:szCs w:val="20"/>
               </w:rPr>
-              <w:t xml:space="preserve">CLAIMANT_PROCEED</w:t>
+              <w:t xml:space="preserve">ADMISSION_PAYMENT_ROUTE</w:t>
             </w:r>
           </w:p>
         </w:tc>
@@ -4951,7 +5080,7 @@
                 <w:sz w:val="20"/>
                 <w:szCs w:val="20"/>
               </w:rPr>
-              <w:t xml:space="preserve">Yes, No</w:t>
+              <w:t xml:space="preserve">IMMEDIATELY, BY_SET_DATE, SUGGESTION_OF_REPAYMENT_PLAN</w:t>
             </w:r>
           </w:p>
         </w:tc>
@@ -4978,7 +5107,7 @@
                 <w:sz w:val="20"/>
                 <w:szCs w:val="20"/>
               </w:rPr>
-              <w:t xml:space="preserve">Yes</w:t>
+              <w:t xml:space="preserve">IMMEDIATELY</w:t>
             </w:r>
           </w:p>
         </w:tc>
@@ -5005,7 +5134,7 @@
                 <w:sz w:val="20"/>
                 <w:szCs w:val="20"/>
               </w:rPr>
-              <w:t xml:space="preserve">Whether the claimant proceeds with the claim after the defendants' full defences, or after a 2v1 or 1v2SS admission. Any other value stops the run.</w:t>
+              <w:t xml:space="preserve">When a defendant who admits all or part of the claim will pay.</w:t>
             </w:r>
           </w:p>
         </w:tc>
@@ -5037,7 +5166,7 @@
                 <w:sz w:val="20"/>
                 <w:szCs w:val="20"/>
               </w:rPr>
-              <w:t xml:space="preserve">CLAIMANT_ACCEPTS_AMOUNT</w:t>
+              <w:t xml:space="preserve">CLAIMANT_PROCEED</w:t>
             </w:r>
           </w:p>
         </w:tc>
@@ -5118,7 +5247,7 @@
                 <w:sz w:val="20"/>
                 <w:szCs w:val="20"/>
               </w:rPr>
-              <w:t xml:space="preserve">Whether the claimant accepts the amount a 1v1 defendant admits (part admission).</w:t>
+              <w:t xml:space="preserve">Whether the claimant proceeds with the claim after the defendants' full defences, or after a 2v1 or 1v2SS admission. Any other value stops the run.</w:t>
             </w:r>
           </w:p>
         </w:tc>
@@ -5150,7 +5279,7 @@
                 <w:sz w:val="20"/>
                 <w:szCs w:val="20"/>
               </w:rPr>
-              <w:t xml:space="preserve">CLAIMANT_ACCEPTS_PLAN</w:t>
+              <w:t xml:space="preserve">CLAIMANT_ACCEPTS_AMOUNT</w:t>
             </w:r>
           </w:p>
         </w:tc>
@@ -5231,7 +5360,7 @@
                 <w:sz w:val="20"/>
                 <w:szCs w:val="20"/>
               </w:rPr>
-              <w:t xml:space="preserve">Whether the claimant accepts a 1v1 defendant's payment date or repayment plan.</w:t>
+              <w:t xml:space="preserve">Whether the claimant accepts the amount a 1v1 defendant admits (part admission).</w:t>
             </w:r>
           </w:p>
         </w:tc>
@@ -5263,7 +5392,7 @@
                 <w:sz w:val="20"/>
                 <w:szCs w:val="20"/>
               </w:rPr>
-              <w:t xml:space="preserve">CLAIMANT_SUGGESTED_PAYMENT</w:t>
+              <w:t xml:space="preserve">CLAIMANT_ACCEPTS_PLAN</w:t>
             </w:r>
           </w:p>
         </w:tc>
@@ -5290,7 +5419,7 @@
                 <w:sz w:val="20"/>
                 <w:szCs w:val="20"/>
               </w:rPr>
-              <w:t xml:space="preserve">IMMEDIATELY, SET_DATE, REPAYMENT_PLAN</w:t>
+              <w:t xml:space="preserve">Yes, No</w:t>
             </w:r>
           </w:p>
         </w:tc>
@@ -5317,7 +5446,7 @@
                 <w:sz w:val="20"/>
                 <w:szCs w:val="20"/>
               </w:rPr>
-              <w:t xml:space="preserve">IMMEDIATELY</w:t>
+              <w:t xml:space="preserve">Yes</w:t>
             </w:r>
           </w:p>
         </w:tc>
@@ -5344,7 +5473,7 @@
                 <w:sz w:val="20"/>
                 <w:szCs w:val="20"/>
               </w:rPr>
-              <w:t xml:space="preserve">How the claimant suggests the defendant pays when they reject the date or plan.</w:t>
+              <w:t xml:space="preserve">Whether the claimant accepts a 1v1 defendant's payment date or repayment plan.</w:t>
             </w:r>
           </w:p>
         </w:tc>
@@ -5376,6 +5505,119 @@
                 <w:sz w:val="20"/>
                 <w:szCs w:val="20"/>
               </w:rPr>
+              <w:t xml:space="preserve">CLAIMANT_SUGGESTED_PAYMENT</w:t>
+            </w:r>
+          </w:p>
+        </w:tc>
+        <w:tc>
+          <w:tcPr>
+            <w:tcW w:type="dxa" w:w="3196"/>
+            <w:tcBorders>
+              <w:top w:val="single" w:color="BFBFBF" w:sz="4"/>
+              <w:left w:val="single" w:color="BFBFBF" w:sz="4"/>
+              <w:bottom w:val="single" w:color="BFBFBF" w:sz="4"/>
+              <w:right w:val="single" w:color="BFBFBF" w:sz="4"/>
+            </w:tcBorders>
+            <w:tcMar>
+              <w:top w:type="dxa" w:w="60"/>
+              <w:left w:type="dxa" w:w="100"/>
+              <w:bottom w:type="dxa" w:w="60"/>
+              <w:right w:type="dxa" w:w="100"/>
+            </w:tcMar>
+          </w:tcPr>
+          <w:p>
+            <w:r>
+              <w:rPr>
+                <w:rFonts w:ascii="Arial" w:cs="Arial" w:eastAsia="Arial" w:hAnsi="Arial"/>
+                <w:sz w:val="20"/>
+                <w:szCs w:val="20"/>
+              </w:rPr>
+              <w:t xml:space="preserve">IMMEDIATELY, SET_DATE, REPAYMENT_PLAN</w:t>
+            </w:r>
+          </w:p>
+        </w:tc>
+        <w:tc>
+          <w:tcPr>
+            <w:tcW w:type="dxa" w:w="1551"/>
+            <w:tcBorders>
+              <w:top w:val="single" w:color="BFBFBF" w:sz="4"/>
+              <w:left w:val="single" w:color="BFBFBF" w:sz="4"/>
+              <w:bottom w:val="single" w:color="BFBFBF" w:sz="4"/>
+              <w:right w:val="single" w:color="BFBFBF" w:sz="4"/>
+            </w:tcBorders>
+            <w:tcMar>
+              <w:top w:type="dxa" w:w="60"/>
+              <w:left w:type="dxa" w:w="100"/>
+              <w:bottom w:type="dxa" w:w="60"/>
+              <w:right w:type="dxa" w:w="100"/>
+            </w:tcMar>
+          </w:tcPr>
+          <w:p>
+            <w:r>
+              <w:rPr>
+                <w:rFonts w:ascii="Arial" w:cs="Arial" w:eastAsia="Arial" w:hAnsi="Arial"/>
+                <w:sz w:val="20"/>
+                <w:szCs w:val="20"/>
+              </w:rPr>
+              <w:t xml:space="preserve">IMMEDIATELY</w:t>
+            </w:r>
+          </w:p>
+        </w:tc>
+        <w:tc>
+          <w:tcPr>
+            <w:tcW w:type="dxa" w:w="3199"/>
+            <w:tcBorders>
+              <w:top w:val="single" w:color="BFBFBF" w:sz="4"/>
+              <w:left w:val="single" w:color="BFBFBF" w:sz="4"/>
+              <w:bottom w:val="single" w:color="BFBFBF" w:sz="4"/>
+              <w:right w:val="single" w:color="BFBFBF" w:sz="4"/>
+            </w:tcBorders>
+            <w:tcMar>
+              <w:top w:type="dxa" w:w="60"/>
+              <w:left w:type="dxa" w:w="100"/>
+              <w:bottom w:type="dxa" w:w="60"/>
+              <w:right w:type="dxa" w:w="100"/>
+            </w:tcMar>
+          </w:tcPr>
+          <w:p>
+            <w:r>
+              <w:rPr>
+                <w:rFonts w:ascii="Arial" w:cs="Arial" w:eastAsia="Arial" w:hAnsi="Arial"/>
+                <w:sz w:val="20"/>
+                <w:szCs w:val="20"/>
+              </w:rPr>
+              <w:t xml:space="preserve">How the claimant suggests the defendant pays when they reject the date or plan.</w:t>
+            </w:r>
+          </w:p>
+        </w:tc>
+      </w:tr>
+      <w:tr>
+        <w:trPr>
+          <w:tblHeader w:val="off"/>
+        </w:trPr>
+        <w:tc>
+          <w:tcPr>
+            <w:tcW w:type="dxa" w:w="1692"/>
+            <w:tcBorders>
+              <w:top w:val="single" w:color="BFBFBF" w:sz="4"/>
+              <w:left w:val="single" w:color="BFBFBF" w:sz="4"/>
+              <w:bottom w:val="single" w:color="BFBFBF" w:sz="4"/>
+              <w:right w:val="single" w:color="BFBFBF" w:sz="4"/>
+            </w:tcBorders>
+            <w:tcMar>
+              <w:top w:type="dxa" w:w="60"/>
+              <w:left w:type="dxa" w:w="100"/>
+              <w:bottom w:type="dxa" w:w="60"/>
+              <w:right w:type="dxa" w:w="100"/>
+            </w:tcMar>
+          </w:tcPr>
+          <w:p>
+            <w:r>
+              <w:rPr>
+                <w:rFonts w:ascii="Courier New" w:cs="Courier New" w:eastAsia="Courier New" w:hAnsi="Courier New"/>
+                <w:sz w:val="20"/>
+                <w:szCs w:val="20"/>
+              </w:rPr>
               <w:t xml:space="preserve">FINAL_ORDER</w:t>
             </w:r>
           </w:p>
@@ -5479,7 +5721,7 @@
         <w:rPr>
           <w:rFonts w:ascii="Arial" w:cs="Arial" w:eastAsia="Arial" w:hAnsi="Arial"/>
         </w:rPr>
-        <w:t xml:space="preserve">12. Run settings</w:t>
+        <w:t xml:space="preserve">13. Run settings</w:t>
       </w:r>
     </w:p>
     <w:p>

</xml_diff>

<commit_message>
Add staying the case to the specified journey
With STAY_CASE=Yes, once the claimant's response has taken the claim to
JUDICIAL_REFERRAL, the hearing centre admin stays the case, asks the
parties for an update and then lifts the stay, reusing StayCase and
ManageStay as in the unspecified journey. Lifting the stay takes the
claim back to JUDICIAL_REFERRAL, so the journey carries on to the
judge's order. The guide covers the new steps and setting, and the Word
copy is regenerated.
</commit_message>
<xml_diff>
--- a/playwright-tests/RUNNING_SPECIFIED_TESTS.docx
+++ b/playwright-tests/RUNNING_SPECIFIED_TESTS.docx
@@ -275,7 +275,7 @@
         <w:rPr>
           <w:rFonts w:ascii="Arial" w:cs="Arial" w:eastAsia="Arial" w:hAnsi="Arial"/>
         </w:rPr>
-        <w:t xml:space="preserve">CREATE_SDO: the judge makes a Standard Direction Order, moving the claim from JUDICIAL_REFERRAL to CASE_PROGRESSION. It only runs on the fast track, when the claimant's response took the claim to JUDICIAL_REFERRAL. It is always done in the UI, where the judge opens the event by its URL (and claims the directions task first where work allocation needs one).</w:t>
+        <w:t xml:space="preserve">STAY_CASE, MANAGE_STAY_REQUEST_UPDATE, LIFT_STAY (optional): once the claimant's response has taken the claim to JUDICIAL_REFERRAL, the hearing centre admin stays the case with "Stay case" (CASE_STAYED), asks the parties for an update with "Manage stay", then lifts the stay, which takes the claim back to JUDICIAL_REFERRAL for the judge's order (STAY_CASE=Yes). It is always done in the UI.</w:t>
       </w:r>
     </w:p>
     <w:p>
@@ -294,7 +294,7 @@
         <w:rPr>
           <w:rFonts w:ascii="Arial" w:cs="Arial" w:eastAsia="Arial" w:hAnsi="Arial"/>
         </w:rPr>
-        <w:t xml:space="preserve">MAKE_DIRECTIONS_ORDER: on the intermediate and multi tracks, which have no Standard Direction Order, the judge makes a directions order with "Make an order" instead, also moving the claim from JUDICIAL_REFERRAL to CASE_PROGRESSION. The judge keeps the claim on its track, chooses the blank template for an order before a hearing and uploads the completed order (playwright-tests/documents/TEST_ORDER.docx; the page only takes Word documents). It is always done in the UI (claiming the track allocation task first where work allocation needs one).</w:t>
+        <w:t xml:space="preserve">CREATE_SDO: the judge makes a Standard Direction Order, moving the claim from JUDICIAL_REFERRAL to CASE_PROGRESSION. It only runs on the fast track, when the claimant's response took the claim to JUDICIAL_REFERRAL. It is always done in the UI, where the judge opens the event by its URL (and claims the directions task first where work allocation needs one).</w:t>
       </w:r>
     </w:p>
     <w:p>
@@ -313,7 +313,7 @@
         <w:rPr>
           <w:rFonts w:ascii="Arial" w:cs="Arial" w:eastAsia="Arial" w:hAnsi="Arial"/>
         </w:rPr>
-        <w:t xml:space="preserve">UPLOAD_EVIDENCE (group: _CLAIMANT_SOLICITOR, _DEFENDANT1_SOLICITOR, _DEFENDANT2_SOLICITOR): once the judge's order has moved the claim to CASE_PROGRESSION, each solicitor uploads a disclosure list with "Upload Your Documents" (the second defendant's solicitor only for 1v2DS). A solicitor acting for two parties uploads it for both. The claim stays in CASE_PROGRESSION. It is always done in the UI.</w:t>
+        <w:t xml:space="preserve">MAKE_DIRECTIONS_ORDER: on the intermediate and multi tracks, which have no Standard Direction Order, the judge makes a directions order with "Make an order" instead, also moving the claim from JUDICIAL_REFERRAL to CASE_PROGRESSION. The judge keeps the claim on its track, chooses the blank template for an order before a hearing and uploads the completed order (playwright-tests/documents/TEST_ORDER.docx; the page only takes Word documents). It is always done in the UI (claiming the track allocation task first where work allocation needs one).</w:t>
       </w:r>
     </w:p>
     <w:p>
@@ -332,7 +332,7 @@
         <w:rPr>
           <w:rFonts w:ascii="Arial" w:cs="Arial" w:eastAsia="Arial" w:hAnsi="Arial"/>
         </w:rPr>
-        <w:t xml:space="preserve">CREATE_HEARING_NOTICE: once the evidence is in, the hearing centre admin lists the trial with "Create a hearing notice" (a first listing of a "Trial (Fast, Intermediate and Multi track)" notice at Clerkenwell, 8 weeks ahead). This stands in for HMC returning a listed hearing. civil-service works out the hearing fee and moves the claim to HEARING_READINESS. It is always done in the UI.</w:t>
+        <w:t xml:space="preserve">UPLOAD_EVIDENCE (group: _CLAIMANT_SOLICITOR, _DEFENDANT1_SOLICITOR, _DEFENDANT2_SOLICITOR): once the judge's order has moved the claim to CASE_PROGRESSION, each solicitor uploads a disclosure list with "Upload Your Documents" (the second defendant's solicitor only for 1v2DS). A solicitor acting for two parties uploads it for both. The claim stays in CASE_PROGRESSION. It is always done in the UI.</w:t>
       </w:r>
     </w:p>
     <w:p>
@@ -351,7 +351,7 @@
         <w:rPr>
           <w:rFonts w:ascii="Arial" w:cs="Arial" w:eastAsia="Arial" w:hAnsi="Arial"/>
         </w:rPr>
-        <w:t xml:space="preserve">PAY_HEARING_FEE: the claimant's solicitor pays the hearing fee from the Service Request tab, by PBA or card (PAYMENT_METHOD). If the payment service has not told civil-service about the payment within a minute, the test does. The test then runs HEARING_FEE_PAID, which civil-service's scheduler would otherwise run later, moving the claim to PREPARE_FOR_HEARING_CONDUCT_HEARING. It is always done in the UI.</w:t>
+        <w:t xml:space="preserve">CREATE_HEARING_NOTICE: once the evidence is in, the hearing centre admin lists the trial with "Create a hearing notice" (a first listing of a "Trial (Fast, Intermediate and Multi track)" notice at Clerkenwell, 8 weeks ahead). This stands in for HMC returning a listed hearing. civil-service works out the hearing fee and moves the claim to HEARING_READINESS. It is always done in the UI.</w:t>
       </w:r>
     </w:p>
     <w:p>
@@ -370,7 +370,7 @@
         <w:rPr>
           <w:rFonts w:ascii="Arial" w:cs="Arial" w:eastAsia="Arial" w:hAnsi="Arial"/>
         </w:rPr>
-        <w:t xml:space="preserve">TRIAL_READY_CHECK: on the fast track only, the parties are asked to confirm they are ready for trial. civil-service's scheduler does this once the hearing is less than 3 weeks away; the hearing is 8 weeks ahead, so the test runs the event itself and checks it was recorded on the case. The claim stays in PREPARE_FOR_HEARING_CONDUCT_HEARING.</w:t>
+        <w:t xml:space="preserve">PAY_HEARING_FEE: the claimant's solicitor pays the hearing fee from the Service Request tab, by PBA or card (PAYMENT_METHOD). If the payment service has not told civil-service about the payment within a minute, the test does. The test then runs HEARING_FEE_PAID, which civil-service's scheduler would otherwise run later, moving the claim to PREPARE_FOR_HEARING_CONDUCT_HEARING. It is always done in the UI.</w:t>
       </w:r>
     </w:p>
     <w:p>
@@ -389,7 +389,7 @@
         <w:rPr>
           <w:rFonts w:ascii="Arial" w:cs="Arial" w:eastAsia="Arial" w:hAnsi="Arial"/>
         </w:rPr>
-        <w:t xml:space="preserve">CONFIRM_TRIAL_ARRANGEMENTS (group: _CLAIMANT_SOLICITOR, _DEFENDANT1_SOLICITOR, _DEFENDANT2_SOLICITOR): each solicitor confirms with "Confirm trial arrangements" that the case is ready for trial, with no change to the hearing requirements (the second defendant's solicitor only for 1v2DS). A solicitor acting for two parties confirms for both. Like the trial ready check it is fast track only (XUI does not offer it on the intermediate or multi tracks), and it has to be done more than 3 weeks before the hearing. The claim stays in PREPARE_FOR_HEARING_CONDUCT_HEARING. It is always done in the UI.</w:t>
+        <w:t xml:space="preserve">TRIAL_READY_CHECK: on the fast track only, the parties are asked to confirm they are ready for trial. civil-service's scheduler does this once the hearing is less than 3 weeks away; the hearing is 8 weeks ahead, so the test runs the event itself and checks it was recorded on the case. The claim stays in PREPARE_FOR_HEARING_CONDUCT_HEARING.</w:t>
       </w:r>
     </w:p>
     <w:p>
@@ -408,7 +408,7 @@
         <w:rPr>
           <w:rFonts w:ascii="Arial" w:cs="Arial" w:eastAsia="Arial" w:hAnsi="Arial"/>
         </w:rPr>
-        <w:t xml:space="preserve">CREATE_TRIAL_BUNDLE: the trial bundle is created. civil-service's scheduler does this about 3 weeks before the hearing, for every track except intermediate and multi (small claims have bundles too, but go to mediation in this journey), so the test asks civil-service to do it now, waits for the bundle to be stitched into one document and checks the claimant's solicitor sees it on the Bundles tab. The claim stays in PREPARE_FOR_HEARING_CONDUCT_HEARING.</w:t>
+        <w:t xml:space="preserve">CONFIRM_TRIAL_ARRANGEMENTS (group: _CLAIMANT_SOLICITOR, _DEFENDANT1_SOLICITOR, _DEFENDANT2_SOLICITOR): each solicitor confirms with "Confirm trial arrangements" that the case is ready for trial, with no change to the hearing requirements (the second defendant's solicitor only for 1v2DS). A solicitor acting for two parties confirms for both. Like the trial ready check it is fast track only (XUI does not offer it on the intermediate or multi tracks), and it has to be done more than 3 weeks before the hearing. The claim stays in PREPARE_FOR_HEARING_CONDUCT_HEARING. It is always done in the UI.</w:t>
       </w:r>
     </w:p>
     <w:p>
@@ -427,7 +427,7 @@
         <w:rPr>
           <w:rFonts w:ascii="Arial" w:cs="Arial" w:eastAsia="Arial" w:hAnsi="Arial"/>
         </w:rPr>
-        <w:t xml:space="preserve">MOVE_TO_DECISION_OUTCOME: once the hearing date has passed, civil-service's scheduler moves the claim to DECISION_OUTCOME to wait for the judge's decision, on every track. The hearing is weeks away, so the test runs the event itself.</w:t>
+        <w:t xml:space="preserve">CREATE_TRIAL_BUNDLE: the trial bundle is created. civil-service's scheduler does this about 3 weeks before the hearing, for every track except intermediate and multi (small claims have bundles too, but go to mediation in this journey), so the test asks civil-service to do it now, waits for the bundle to be stitched into one document and checks the claimant's solicitor sees it on the Bundles tab. The claim stays in PREPARE_FOR_HEARING_CONDUCT_HEARING.</w:t>
       </w:r>
     </w:p>
     <w:p>
@@ -446,7 +446,7 @@
         <w:rPr>
           <w:rFonts w:ascii="Arial" w:cs="Arial" w:eastAsia="Arial" w:hAnsi="Arial"/>
         </w:rPr>
-        <w:t xml:space="preserve">MAKE_FINAL_ORDER: the judge makes the final order with "Make an order" (FINAL_ORDER, see section 12). On the fast track the judge writes a free form or an assisted order on the page. On the intermediate and multi tracks the judge keeps the claim on its track, picks a template (for the after-hearing template, giving today as the hearing date), and uploads the completed order (playwright-tests/documents/TEST_ORDER.docx). The test checks the order was added to the case and its notifications sent. The claim stays in DECISION_OUTCOME. It is always done in the UI.</w:t>
+        <w:t xml:space="preserve">MOVE_TO_DECISION_OUTCOME: once the hearing date has passed, civil-service's scheduler moves the claim to DECISION_OUTCOME to wait for the judge's decision, on every track. The hearing is weeks away, so the test runs the event itself.</w:t>
       </w:r>
     </w:p>
     <w:p>
@@ -465,6 +465,25 @@
         <w:rPr>
           <w:rFonts w:ascii="Arial" w:cs="Arial" w:eastAsia="Arial" w:hAnsi="Arial"/>
         </w:rPr>
+        <w:t xml:space="preserve">MAKE_FINAL_ORDER: the judge makes the final order with "Make an order" (FINAL_ORDER, see section 12). On the fast track the judge writes a free form or an assisted order on the page. On the intermediate and multi tracks the judge keeps the claim on its track, picks a template (for the after-hearing template, giving today as the hearing date), and uploads the completed order (playwright-tests/documents/TEST_ORDER.docx). The test checks the order was added to the case and its notifications sent. The claim stays in DECISION_OUTCOME. It is always done in the UI.</w:t>
+      </w:r>
+    </w:p>
+    <w:p>
+      <w:pPr>
+        <w:pStyle w:val="ListParagraph"/>
+        <w:numPr>
+          <w:ilvl w:val="0"/>
+          <w:numId w:val="2"/>
+        </w:numPr>
+        <w:tabs>
+          <w:tab w:val="left" w:pos="720"/>
+        </w:tabs>
+        <w:spacing w:after="60"/>
+      </w:pPr>
+      <w:r>
+        <w:rPr>
+          <w:rFonts w:ascii="Arial" w:cs="Arial" w:eastAsia="Arial" w:hAnsi="Arial"/>
+        </w:rPr>
         <w:t xml:space="preserve">CONFIRM_ORDER_REVIEW: the hearing centre admin reviews the order with "Confirm order review": no date a party must do something by, a final order, and nothing left to do. This closes the claim on any track, moving it to All_FINAL_ORDERS_ISSUED. It is always done in the UI.</w:t>
       </w:r>
     </w:p>
@@ -509,7 +528,7 @@
         <w:rPr>
           <w:rFonts w:ascii="Arial" w:cs="Arial" w:eastAsia="Arial" w:hAnsi="Arial"/>
         </w:rPr>
-        <w:t xml:space="preserve">The steps with an API version are CREATE_CLAIM, INFORM_AGREED_EXTENSION_DEFENDANT1/2, RESPOND_TO_CLAIM_DEFENDANT1/2, RESPOND_TO_DEFENCE and MANAGE_CONTACT_INFORMATION. ADD_CASE_NOTE, CREATE_CASE_FLAGS, MAKE_CASE_FLAG_INACTIVE, CREATE_SDO, MAKE_DIRECTIONS_ORDER, UPLOAD_EVIDENCE, CREATE_HEARING_NOTICE, PAY_HEARING_FEE, CONFIRM_TRIAL_ARRANGEMENTS, MAKE_FINAL_ORDER and CONFIRM_ORDER_REVIEW always use the UI. With API_UNTIL=&lt;state&gt; they go through the CCD API until the claim reaches that state, and every step after it goes through the UI. Leave API_UNTIL unset to do everything through the UI.</w:t>
+        <w:t xml:space="preserve">The steps with an API version are CREATE_CLAIM, INFORM_AGREED_EXTENSION_DEFENDANT1/2, RESPOND_TO_CLAIM_DEFENDANT1/2, RESPOND_TO_DEFENCE and MANAGE_CONTACT_INFORMATION. ADD_CASE_NOTE, CREATE_CASE_FLAGS, MAKE_CASE_FLAG_INACTIVE, STAY_CASE, MANAGE_STAY_REQUEST_UPDATE, LIFT_STAY, CREATE_SDO, MAKE_DIRECTIONS_ORDER, UPLOAD_EVIDENCE, CREATE_HEARING_NOTICE, PAY_HEARING_FEE, CONFIRM_TRIAL_ARRANGEMENTS, MAKE_FINAL_ORDER and CONFIRM_ORDER_REVIEW always use the UI. With API_UNTIL=&lt;state&gt; they go through the CCD API until the claim reaches that state, and every step after it goes through the UI. Leave API_UNTIL unset to do everything through the UI.</w:t>
       </w:r>
     </w:p>
     <w:p>
@@ -606,7 +625,7 @@
         <w:rPr>
           <w:rFonts w:ascii="Arial" w:cs="Arial" w:eastAsia="Arial" w:hAnsi="Arial"/>
         </w:rPr>
-        <w:t xml:space="preserve">States the journey reaches: PENDING_CASE_ISSUED, AWAITING_RESPONDENT_ACKNOWLEDGEMENT, AWAITING_APPLICANT_INTENTION, JUDICIAL_REFERRAL, CASE_PROGRESSION, HEARING_READINESS, PREPARE_FOR_HEARING_CONDUCT_HEARING, DECISION_OUTCOME, IN_MEDIATION, All_FINAL_ORDERS_ISSUED, PROCEEDS_IN_HERITAGE_SYSTEM.</w:t>
+        <w:t xml:space="preserve">States the journey reaches: PENDING_CASE_ISSUED, AWAITING_RESPONDENT_ACKNOWLEDGEMENT, AWAITING_APPLICANT_INTENTION, JUDICIAL_REFERRAL, CASE_PROGRESSION, HEARING_READINESS, PREPARE_FOR_HEARING_CONDUCT_HEARING, DECISION_OUTCOME, IN_MEDIATION, CASE_STAYED, All_FINAL_ORDERS_ISSUED, PROCEEDS_IN_HERITAGE_SYSTEM.</w:t>
       </w:r>
     </w:p>
     <w:p>
@@ -4457,6 +4476,119 @@
                 <w:szCs w:val="20"/>
               </w:rPr>
               <w:t xml:space="preserve">Optional steps: Manage Contact Information once the claimant has responded, one run per entry, each checked against the saved case data (section 9). Users: admin, claimantSolicitor, respondent1Solicitor, respondent2Solicitor. Parties: CLAIMANT_1/2, DEFENDANT_1/2, each with _ORGANISATION_INDIVIDUALS, and CLAIMANT_1/DEFENDANT_1/DEFENDANT_2 with _LR_INDIVIDUALS; the admin can also add _WITNESSES or _EXPERTS. Has an API version.</w:t>
+            </w:r>
+          </w:p>
+        </w:tc>
+      </w:tr>
+      <w:tr>
+        <w:trPr>
+          <w:tblHeader w:val="off"/>
+        </w:trPr>
+        <w:tc>
+          <w:tcPr>
+            <w:tcW w:type="dxa" w:w="1692"/>
+            <w:tcBorders>
+              <w:top w:val="single" w:color="BFBFBF" w:sz="4"/>
+              <w:left w:val="single" w:color="BFBFBF" w:sz="4"/>
+              <w:bottom w:val="single" w:color="BFBFBF" w:sz="4"/>
+              <w:right w:val="single" w:color="BFBFBF" w:sz="4"/>
+            </w:tcBorders>
+            <w:tcMar>
+              <w:top w:type="dxa" w:w="60"/>
+              <w:left w:type="dxa" w:w="100"/>
+              <w:bottom w:type="dxa" w:w="60"/>
+              <w:right w:type="dxa" w:w="100"/>
+            </w:tcMar>
+          </w:tcPr>
+          <w:p>
+            <w:r>
+              <w:rPr>
+                <w:rFonts w:ascii="Courier New" w:cs="Courier New" w:eastAsia="Courier New" w:hAnsi="Courier New"/>
+                <w:sz w:val="20"/>
+                <w:szCs w:val="20"/>
+              </w:rPr>
+              <w:t xml:space="preserve">STAY_CASE</w:t>
+            </w:r>
+          </w:p>
+        </w:tc>
+        <w:tc>
+          <w:tcPr>
+            <w:tcW w:type="dxa" w:w="3196"/>
+            <w:tcBorders>
+              <w:top w:val="single" w:color="BFBFBF" w:sz="4"/>
+              <w:left w:val="single" w:color="BFBFBF" w:sz="4"/>
+              <w:bottom w:val="single" w:color="BFBFBF" w:sz="4"/>
+              <w:right w:val="single" w:color="BFBFBF" w:sz="4"/>
+            </w:tcBorders>
+            <w:tcMar>
+              <w:top w:type="dxa" w:w="60"/>
+              <w:left w:type="dxa" w:w="100"/>
+              <w:bottom w:type="dxa" w:w="60"/>
+              <w:right w:type="dxa" w:w="100"/>
+            </w:tcMar>
+          </w:tcPr>
+          <w:p>
+            <w:r>
+              <w:rPr>
+                <w:rFonts w:ascii="Arial" w:cs="Arial" w:eastAsia="Arial" w:hAnsi="Arial"/>
+                <w:sz w:val="20"/>
+                <w:szCs w:val="20"/>
+              </w:rPr>
+              <w:t xml:space="preserve">Yes, No</w:t>
+            </w:r>
+          </w:p>
+        </w:tc>
+        <w:tc>
+          <w:tcPr>
+            <w:tcW w:type="dxa" w:w="1551"/>
+            <w:tcBorders>
+              <w:top w:val="single" w:color="BFBFBF" w:sz="4"/>
+              <w:left w:val="single" w:color="BFBFBF" w:sz="4"/>
+              <w:bottom w:val="single" w:color="BFBFBF" w:sz="4"/>
+              <w:right w:val="single" w:color="BFBFBF" w:sz="4"/>
+            </w:tcBorders>
+            <w:tcMar>
+              <w:top w:type="dxa" w:w="60"/>
+              <w:left w:type="dxa" w:w="100"/>
+              <w:bottom w:type="dxa" w:w="60"/>
+              <w:right w:type="dxa" w:w="100"/>
+            </w:tcMar>
+          </w:tcPr>
+          <w:p>
+            <w:r>
+              <w:rPr>
+                <w:rFonts w:ascii="Arial" w:cs="Arial" w:eastAsia="Arial" w:hAnsi="Arial"/>
+                <w:sz w:val="20"/>
+                <w:szCs w:val="20"/>
+              </w:rPr>
+              <w:t xml:space="preserve">No</w:t>
+            </w:r>
+          </w:p>
+        </w:tc>
+        <w:tc>
+          <w:tcPr>
+            <w:tcW w:type="dxa" w:w="3199"/>
+            <w:tcBorders>
+              <w:top w:val="single" w:color="BFBFBF" w:sz="4"/>
+              <w:left w:val="single" w:color="BFBFBF" w:sz="4"/>
+              <w:bottom w:val="single" w:color="BFBFBF" w:sz="4"/>
+              <w:right w:val="single" w:color="BFBFBF" w:sz="4"/>
+            </w:tcBorders>
+            <w:tcMar>
+              <w:top w:type="dxa" w:w="60"/>
+              <w:left w:type="dxa" w:w="100"/>
+              <w:bottom w:type="dxa" w:w="60"/>
+              <w:right w:type="dxa" w:w="100"/>
+            </w:tcMar>
+          </w:tcPr>
+          <w:p>
+            <w:r>
+              <w:rPr>
+                <w:rFonts w:ascii="Arial" w:cs="Arial" w:eastAsia="Arial" w:hAnsi="Arial"/>
+                <w:sz w:val="20"/>
+                <w:szCs w:val="20"/>
+              </w:rPr>
+              <w:t xml:space="preserve">Optional steps: stay the case once it reaches JUDICIAL_REFERRAL, ask for an update and lift the stay.</w:t>
             </w:r>
           </w:p>
         </w:tc>

</xml_diff>

<commit_message>
Take specified small claims out of mediation to a small claims order
When the claimant's response takes a small claim to mediation, the
hearing centre admin now records with "Mediation Unsuccessful" that a
party withdrew, which moves the claim to JUDICIAL_REFERRAL. Work
allocation gives a small claim's directions task to a legal adviser, so
a region 1 legal adviser user is added (LEGAL_ADVISER_USERNAME and
LEGAL_ADVISER_PASSWORD override it), and they make the Standard
Direction Order, moving the claim to CASE_PROGRESSION. CreateSdo now has
the small claims track: civil-service fills in the directions, an in
person hearing and the court, and the order sets a one hour hearing.
The small claims steps after the order are not coded yet, so they are
skipped. The guide covers the new steps and the Word copy is
regenerated.
</commit_message>
<xml_diff>
--- a/playwright-tests/RUNNING_SPECIFIED_TESTS.docx
+++ b/playwright-tests/RUNNING_SPECIFIED_TESTS.docx
@@ -32,7 +32,7 @@
         <w:rPr>
           <w:rFonts w:ascii="Arial" w:cs="Arial" w:eastAsia="Arial" w:hAnsi="Arial"/>
         </w:rPr>
-        <w:t xml:space="preserve">Each command starts the journey from scratch: it creates a new specified (money) claim and takes it through the steps in order. A step that does not apply to the claim, or is switched off, is skipped. The journey currently ends with court staff confirming the judge's final order, which moves the claim to All_FINAL_ORDERS_ISSUED.</w:t>
+        <w:t xml:space="preserve">Each command starts the journey from scratch: it creates a new specified (money) claim and takes it through the steps in order. A step that does not apply to the claim, or is switched off, is skipped. The journey currently ends with court staff confirming the judge's final order, which moves the claim to All_FINAL_ORDERS_ISSUED. A small claim goes to mediation, then after unsuccessful mediation gets the judge's small claims Standard Direction Order and ends in CASE_PROGRESSION: the small claims steps after the order are not coded yet.</w:t>
       </w:r>
     </w:p>
     <w:p>
@@ -294,7 +294,7 @@
         <w:rPr>
           <w:rFonts w:ascii="Arial" w:cs="Arial" w:eastAsia="Arial" w:hAnsi="Arial"/>
         </w:rPr>
-        <w:t xml:space="preserve">CREATE_SDO: the judge makes a Standard Direction Order, moving the claim from JUDICIAL_REFERRAL to CASE_PROGRESSION. It only runs on the fast track, when the claimant's response took the claim to JUDICIAL_REFERRAL. It is always done in the UI, where the judge opens the event by its URL (and claims the directions task first where work allocation needs one).</w:t>
+        <w:t xml:space="preserve">MEDIATION_UNSUCCESSFUL: when the claimant's response took a small claim to mediation (IN_MEDIATION), the hearing centre admin records with "Mediation Unsuccessful" that a party withdrew. civil-service moves the claim to JUDICIAL_REFERRAL for the judge's directions. It is always done in the UI.</w:t>
       </w:r>
     </w:p>
     <w:p>
@@ -313,7 +313,7 @@
         <w:rPr>
           <w:rFonts w:ascii="Arial" w:cs="Arial" w:eastAsia="Arial" w:hAnsi="Arial"/>
         </w:rPr>
-        <w:t xml:space="preserve">MAKE_DIRECTIONS_ORDER: on the intermediate and multi tracks, which have no Standard Direction Order, the judge makes a directions order with "Make an order" instead, also moving the claim from JUDICIAL_REFERRAL to CASE_PROGRESSION. The judge keeps the claim on its track, chooses the blank template for an order before a hearing and uploads the completed order (playwright-tests/documents/TEST_ORDER.docx; the page only takes Word documents). It is always done in the UI (claiming the track allocation task first where work allocation needs one).</w:t>
+        <w:t xml:space="preserve">CREATE_SDO: the judge makes a Standard Direction Order, moving the claim from JUDICIAL_REFERRAL to CASE_PROGRESSION. It runs on the fast track when the claimant's response took the claim to JUDICIAL_REFERRAL, and on the small claims track after unsuccessful mediation, where work allocation gives the directions task to a legal adviser, who makes the order (a one hour hearing, in person at the court civil-service fills in). It is always done in the UI, where the judge opens the event by its URL (and claims the directions task first where work allocation needs one).</w:t>
       </w:r>
     </w:p>
     <w:p>
@@ -332,7 +332,7 @@
         <w:rPr>
           <w:rFonts w:ascii="Arial" w:cs="Arial" w:eastAsia="Arial" w:hAnsi="Arial"/>
         </w:rPr>
-        <w:t xml:space="preserve">UPLOAD_EVIDENCE (group: _CLAIMANT_SOLICITOR, _DEFENDANT1_SOLICITOR, _DEFENDANT2_SOLICITOR): once the judge's order has moved the claim to CASE_PROGRESSION, each solicitor uploads a disclosure list with "Upload Your Documents" (the second defendant's solicitor only for 1v2DS). A solicitor acting for two parties uploads it for both. The claim stays in CASE_PROGRESSION. It is always done in the UI.</w:t>
+        <w:t xml:space="preserve">MAKE_DIRECTIONS_ORDER: on the intermediate and multi tracks, which have no Standard Direction Order, the judge makes a directions order with "Make an order" instead, also moving the claim from JUDICIAL_REFERRAL to CASE_PROGRESSION. The judge keeps the claim on its track, chooses the blank template for an order before a hearing and uploads the completed order (playwright-tests/documents/TEST_ORDER.docx; the page only takes Word documents). It is always done in the UI (claiming the track allocation task first where work allocation needs one).</w:t>
       </w:r>
     </w:p>
     <w:p>
@@ -351,7 +351,7 @@
         <w:rPr>
           <w:rFonts w:ascii="Arial" w:cs="Arial" w:eastAsia="Arial" w:hAnsi="Arial"/>
         </w:rPr>
-        <w:t xml:space="preserve">CREATE_HEARING_NOTICE: once the evidence is in, the hearing centre admin lists the trial with "Create a hearing notice" (a first listing of a "Trial (Fast, Intermediate and Multi track)" notice at Clerkenwell, 8 weeks ahead). This stands in for HMC returning a listed hearing. civil-service works out the hearing fee and moves the claim to HEARING_READINESS. It is always done in the UI.</w:t>
+        <w:t xml:space="preserve">UPLOAD_EVIDENCE (group: _CLAIMANT_SOLICITOR, _DEFENDANT1_SOLICITOR, _DEFENDANT2_SOLICITOR): once the judge's order has moved the claim to CASE_PROGRESSION, each solicitor uploads a disclosure list with "Upload Your Documents" (the second defendant's solicitor only for 1v2DS). A solicitor acting for two parties uploads it for both. The claim stays in CASE_PROGRESSION. It is always done in the UI.</w:t>
       </w:r>
     </w:p>
     <w:p>
@@ -370,7 +370,7 @@
         <w:rPr>
           <w:rFonts w:ascii="Arial" w:cs="Arial" w:eastAsia="Arial" w:hAnsi="Arial"/>
         </w:rPr>
-        <w:t xml:space="preserve">PAY_HEARING_FEE: the claimant's solicitor pays the hearing fee from the Service Request tab, by PBA or card (PAYMENT_METHOD). If the payment service has not told civil-service about the payment within a minute, the test does. The test then runs HEARING_FEE_PAID, which civil-service's scheduler would otherwise run later, moving the claim to PREPARE_FOR_HEARING_CONDUCT_HEARING. It is always done in the UI.</w:t>
+        <w:t xml:space="preserve">CREATE_HEARING_NOTICE: once the evidence is in, the hearing centre admin lists the trial with "Create a hearing notice" (a first listing of a "Trial (Fast, Intermediate and Multi track)" notice at Clerkenwell, 8 weeks ahead). This stands in for HMC returning a listed hearing. civil-service works out the hearing fee and moves the claim to HEARING_READINESS. It is always done in the UI.</w:t>
       </w:r>
     </w:p>
     <w:p>
@@ -389,7 +389,7 @@
         <w:rPr>
           <w:rFonts w:ascii="Arial" w:cs="Arial" w:eastAsia="Arial" w:hAnsi="Arial"/>
         </w:rPr>
-        <w:t xml:space="preserve">TRIAL_READY_CHECK: on the fast track only, the parties are asked to confirm they are ready for trial. civil-service's scheduler does this once the hearing is less than 3 weeks away; the hearing is 8 weeks ahead, so the test runs the event itself and checks it was recorded on the case. The claim stays in PREPARE_FOR_HEARING_CONDUCT_HEARING.</w:t>
+        <w:t xml:space="preserve">PAY_HEARING_FEE: the claimant's solicitor pays the hearing fee from the Service Request tab, by PBA or card (PAYMENT_METHOD). If the payment service has not told civil-service about the payment within a minute, the test does. The test then runs HEARING_FEE_PAID, which civil-service's scheduler would otherwise run later, moving the claim to PREPARE_FOR_HEARING_CONDUCT_HEARING. It is always done in the UI.</w:t>
       </w:r>
     </w:p>
     <w:p>
@@ -408,7 +408,7 @@
         <w:rPr>
           <w:rFonts w:ascii="Arial" w:cs="Arial" w:eastAsia="Arial" w:hAnsi="Arial"/>
         </w:rPr>
-        <w:t xml:space="preserve">CONFIRM_TRIAL_ARRANGEMENTS (group: _CLAIMANT_SOLICITOR, _DEFENDANT1_SOLICITOR, _DEFENDANT2_SOLICITOR): each solicitor confirms with "Confirm trial arrangements" that the case is ready for trial, with no change to the hearing requirements (the second defendant's solicitor only for 1v2DS). A solicitor acting for two parties confirms for both. Like the trial ready check it is fast track only (XUI does not offer it on the intermediate or multi tracks), and it has to be done more than 3 weeks before the hearing. The claim stays in PREPARE_FOR_HEARING_CONDUCT_HEARING. It is always done in the UI.</w:t>
+        <w:t xml:space="preserve">TRIAL_READY_CHECK: on the fast track only, the parties are asked to confirm they are ready for trial. civil-service's scheduler does this once the hearing is less than 3 weeks away; the hearing is 8 weeks ahead, so the test runs the event itself and checks it was recorded on the case. The claim stays in PREPARE_FOR_HEARING_CONDUCT_HEARING.</w:t>
       </w:r>
     </w:p>
     <w:p>
@@ -427,7 +427,7 @@
         <w:rPr>
           <w:rFonts w:ascii="Arial" w:cs="Arial" w:eastAsia="Arial" w:hAnsi="Arial"/>
         </w:rPr>
-        <w:t xml:space="preserve">CREATE_TRIAL_BUNDLE: the trial bundle is created. civil-service's scheduler does this about 3 weeks before the hearing, for every track except intermediate and multi (small claims have bundles too, but go to mediation in this journey), so the test asks civil-service to do it now, waits for the bundle to be stitched into one document and checks the claimant's solicitor sees it on the Bundles tab. The claim stays in PREPARE_FOR_HEARING_CONDUCT_HEARING.</w:t>
+        <w:t xml:space="preserve">CONFIRM_TRIAL_ARRANGEMENTS (group: _CLAIMANT_SOLICITOR, _DEFENDANT1_SOLICITOR, _DEFENDANT2_SOLICITOR): each solicitor confirms with "Confirm trial arrangements" that the case is ready for trial, with no change to the hearing requirements (the second defendant's solicitor only for 1v2DS). A solicitor acting for two parties confirms for both. Like the trial ready check it is fast track only (XUI does not offer it on the intermediate or multi tracks), and it has to be done more than 3 weeks before the hearing. The claim stays in PREPARE_FOR_HEARING_CONDUCT_HEARING. It is always done in the UI.</w:t>
       </w:r>
     </w:p>
     <w:p>
@@ -446,7 +446,7 @@
         <w:rPr>
           <w:rFonts w:ascii="Arial" w:cs="Arial" w:eastAsia="Arial" w:hAnsi="Arial"/>
         </w:rPr>
-        <w:t xml:space="preserve">MOVE_TO_DECISION_OUTCOME: once the hearing date has passed, civil-service's scheduler moves the claim to DECISION_OUTCOME to wait for the judge's decision, on every track. The hearing is weeks away, so the test runs the event itself.</w:t>
+        <w:t xml:space="preserve">CREATE_TRIAL_BUNDLE: the trial bundle is created. civil-service's scheduler does this about 3 weeks before the hearing, for every track except intermediate and multi (small claims have bundles too, but the journey stops after their Standard Direction Order), so the test asks civil-service to do it now, waits for the bundle to be stitched into one document and checks the claimant's solicitor sees it on the Bundles tab. The claim stays in PREPARE_FOR_HEARING_CONDUCT_HEARING.</w:t>
       </w:r>
     </w:p>
     <w:p>
@@ -465,7 +465,7 @@
         <w:rPr>
           <w:rFonts w:ascii="Arial" w:cs="Arial" w:eastAsia="Arial" w:hAnsi="Arial"/>
         </w:rPr>
-        <w:t xml:space="preserve">MAKE_FINAL_ORDER: the judge makes the final order with "Make an order" (FINAL_ORDER, see section 12). On the fast track the judge writes a free form or an assisted order on the page. On the intermediate and multi tracks the judge keeps the claim on its track, picks a template (for the after-hearing template, giving today as the hearing date), and uploads the completed order (playwright-tests/documents/TEST_ORDER.docx). The test checks the order was added to the case and its notifications sent. The claim stays in DECISION_OUTCOME. It is always done in the UI.</w:t>
+        <w:t xml:space="preserve">MOVE_TO_DECISION_OUTCOME: once the hearing date has passed, civil-service's scheduler moves the claim to DECISION_OUTCOME to wait for the judge's decision, on every track. The hearing is weeks away, so the test runs the event itself.</w:t>
       </w:r>
     </w:p>
     <w:p>
@@ -484,6 +484,25 @@
         <w:rPr>
           <w:rFonts w:ascii="Arial" w:cs="Arial" w:eastAsia="Arial" w:hAnsi="Arial"/>
         </w:rPr>
+        <w:t xml:space="preserve">MAKE_FINAL_ORDER: the judge makes the final order with "Make an order" (FINAL_ORDER, see section 12). On the fast track the judge writes a free form or an assisted order on the page. On the intermediate and multi tracks the judge keeps the claim on its track, picks a template (for the after-hearing template, giving today as the hearing date), and uploads the completed order (playwright-tests/documents/TEST_ORDER.docx). The test checks the order was added to the case and its notifications sent. The claim stays in DECISION_OUTCOME. It is always done in the UI.</w:t>
+      </w:r>
+    </w:p>
+    <w:p>
+      <w:pPr>
+        <w:pStyle w:val="ListParagraph"/>
+        <w:numPr>
+          <w:ilvl w:val="0"/>
+          <w:numId w:val="2"/>
+        </w:numPr>
+        <w:tabs>
+          <w:tab w:val="left" w:pos="720"/>
+        </w:tabs>
+        <w:spacing w:after="60"/>
+      </w:pPr>
+      <w:r>
+        <w:rPr>
+          <w:rFonts w:ascii="Arial" w:cs="Arial" w:eastAsia="Arial" w:hAnsi="Arial"/>
+        </w:rPr>
         <w:t xml:space="preserve">CONFIRM_ORDER_REVIEW: the hearing centre admin reviews the order with "Confirm order review": no date a party must do something by, a final order, and nothing left to do. This closes the claim on any track, moving it to All_FINAL_ORDERS_ISSUED. It is always done in the UI.</w:t>
       </w:r>
     </w:p>
@@ -528,7 +547,7 @@
         <w:rPr>
           <w:rFonts w:ascii="Arial" w:cs="Arial" w:eastAsia="Arial" w:hAnsi="Arial"/>
         </w:rPr>
-        <w:t xml:space="preserve">The steps with an API version are CREATE_CLAIM, INFORM_AGREED_EXTENSION_DEFENDANT1/2, RESPOND_TO_CLAIM_DEFENDANT1/2, RESPOND_TO_DEFENCE and MANAGE_CONTACT_INFORMATION. ADD_CASE_NOTE, CREATE_CASE_FLAGS, MAKE_CASE_FLAG_INACTIVE, STAY_CASE, MANAGE_STAY_REQUEST_UPDATE, LIFT_STAY, CREATE_SDO, MAKE_DIRECTIONS_ORDER, UPLOAD_EVIDENCE, CREATE_HEARING_NOTICE, PAY_HEARING_FEE, CONFIRM_TRIAL_ARRANGEMENTS, MAKE_FINAL_ORDER and CONFIRM_ORDER_REVIEW always use the UI. With API_UNTIL=&lt;state&gt; they go through the CCD API until the claim reaches that state, and every step after it goes through the UI. Leave API_UNTIL unset to do everything through the UI.</w:t>
+        <w:t xml:space="preserve">The steps with an API version are CREATE_CLAIM, INFORM_AGREED_EXTENSION_DEFENDANT1/2, RESPOND_TO_CLAIM_DEFENDANT1/2, RESPOND_TO_DEFENCE and MANAGE_CONTACT_INFORMATION. ADD_CASE_NOTE, MEDIATION_UNSUCCESSFUL, CREATE_CASE_FLAGS, MAKE_CASE_FLAG_INACTIVE, STAY_CASE, MANAGE_STAY_REQUEST_UPDATE, LIFT_STAY, CREATE_SDO, MAKE_DIRECTIONS_ORDER, UPLOAD_EVIDENCE, CREATE_HEARING_NOTICE, PAY_HEARING_FEE, CONFIRM_TRIAL_ARRANGEMENTS, MAKE_FINAL_ORDER and CONFIRM_ORDER_REVIEW always use the UI. With API_UNTIL=&lt;state&gt; they go through the CCD API until the claim reaches that state, and every step after it goes through the UI. Leave API_UNTIL unset to do everything through the UI.</w:t>
       </w:r>
     </w:p>
     <w:p>
@@ -1345,9 +1364,9 @@
         </w:tblBorders>
       </w:tblPr>
       <w:tblGrid>
-        <w:gridCol w:w="3633"/>
-        <w:gridCol w:w="2765"/>
-        <w:gridCol w:w="3240"/>
+        <w:gridCol w:w="2860"/>
+        <w:gridCol w:w="4228"/>
+        <w:gridCol w:w="2550"/>
       </w:tblGrid>
       <w:tr>
         <w:trPr>
@@ -1355,7 +1374,7 @@
         </w:trPr>
         <w:tc>
           <w:tcPr>
-            <w:tcW w:type="dxa" w:w="3633"/>
+            <w:tcW w:type="dxa" w:w="2860"/>
             <w:tcBorders>
               <w:top w:val="single" w:color="BFBFBF" w:sz="4"/>
               <w:left w:val="single" w:color="BFBFBF" w:sz="4"/>
@@ -1385,7 +1404,7 @@
         </w:tc>
         <w:tc>
           <w:tcPr>
-            <w:tcW w:type="dxa" w:w="2765"/>
+            <w:tcW w:type="dxa" w:w="4228"/>
             <w:tcBorders>
               <w:top w:val="single" w:color="BFBFBF" w:sz="4"/>
               <w:left w:val="single" w:color="BFBFBF" w:sz="4"/>
@@ -1415,7 +1434,7 @@
         </w:tc>
         <w:tc>
           <w:tcPr>
-            <w:tcW w:type="dxa" w:w="3240"/>
+            <w:tcW w:type="dxa" w:w="2550"/>
             <w:tcBorders>
               <w:top w:val="single" w:color="BFBFBF" w:sz="4"/>
               <w:left w:val="single" w:color="BFBFBF" w:sz="4"/>
@@ -1450,7 +1469,7 @@
         </w:trPr>
         <w:tc>
           <w:tcPr>
-            <w:tcW w:type="dxa" w:w="3633"/>
+            <w:tcW w:type="dxa" w:w="2860"/>
             <w:tcBorders>
               <w:top w:val="single" w:color="BFBFBF" w:sz="4"/>
               <w:left w:val="single" w:color="BFBFBF" w:sz="4"/>
@@ -1477,34 +1496,34 @@
         </w:tc>
         <w:tc>
           <w:tcPr>
-            <w:tcW w:type="dxa" w:w="2765"/>
-            <w:tcBorders>
-              <w:top w:val="single" w:color="BFBFBF" w:sz="4"/>
-              <w:left w:val="single" w:color="BFBFBF" w:sz="4"/>
-              <w:bottom w:val="single" w:color="BFBFBF" w:sz="4"/>
-              <w:right w:val="single" w:color="BFBFBF" w:sz="4"/>
-            </w:tcBorders>
-            <w:tcMar>
-              <w:top w:type="dxa" w:w="60"/>
-              <w:left w:type="dxa" w:w="100"/>
-              <w:bottom w:type="dxa" w:w="60"/>
-              <w:right w:type="dxa" w:w="100"/>
-            </w:tcMar>
-          </w:tcPr>
-          <w:p>
-            <w:r>
-              <w:rPr>
-                <w:rFonts w:ascii="Arial" w:cs="Arial" w:eastAsia="Arial" w:hAnsi="Arial"/>
-                <w:sz w:val="20"/>
-                <w:szCs w:val="20"/>
-              </w:rPr>
-              <w:t xml:space="preserve">IN_MEDIATION</w:t>
-            </w:r>
-          </w:p>
-        </w:tc>
-        <w:tc>
-          <w:tcPr>
-            <w:tcW w:type="dxa" w:w="3240"/>
+            <w:tcW w:type="dxa" w:w="4228"/>
+            <w:tcBorders>
+              <w:top w:val="single" w:color="BFBFBF" w:sz="4"/>
+              <w:left w:val="single" w:color="BFBFBF" w:sz="4"/>
+              <w:bottom w:val="single" w:color="BFBFBF" w:sz="4"/>
+              <w:right w:val="single" w:color="BFBFBF" w:sz="4"/>
+            </w:tcBorders>
+            <w:tcMar>
+              <w:top w:type="dxa" w:w="60"/>
+              <w:left w:type="dxa" w:w="100"/>
+              <w:bottom w:type="dxa" w:w="60"/>
+              <w:right w:type="dxa" w:w="100"/>
+            </w:tcMar>
+          </w:tcPr>
+          <w:p>
+            <w:r>
+              <w:rPr>
+                <w:rFonts w:ascii="Arial" w:cs="Arial" w:eastAsia="Arial" w:hAnsi="Arial"/>
+                <w:sz w:val="20"/>
+                <w:szCs w:val="20"/>
+              </w:rPr>
+              <w:t xml:space="preserve">IN_MEDIATION, then JUDICIAL_REFERRAL after unsuccessful mediation</w:t>
+            </w:r>
+          </w:p>
+        </w:tc>
+        <w:tc>
+          <w:tcPr>
+            <w:tcW w:type="dxa" w:w="2550"/>
             <w:tcBorders>
               <w:top w:val="single" w:color="BFBFBF" w:sz="4"/>
               <w:left w:val="single" w:color="BFBFBF" w:sz="4"/>
@@ -1536,7 +1555,7 @@
         </w:trPr>
         <w:tc>
           <w:tcPr>
-            <w:tcW w:type="dxa" w:w="3633"/>
+            <w:tcW w:type="dxa" w:w="2860"/>
             <w:tcBorders>
               <w:top w:val="single" w:color="BFBFBF" w:sz="4"/>
               <w:left w:val="single" w:color="BFBFBF" w:sz="4"/>
@@ -1563,7 +1582,7 @@
         </w:tc>
         <w:tc>
           <w:tcPr>
-            <w:tcW w:type="dxa" w:w="2765"/>
+            <w:tcW w:type="dxa" w:w="4228"/>
             <w:tcBorders>
               <w:top w:val="single" w:color="BFBFBF" w:sz="4"/>
               <w:left w:val="single" w:color="BFBFBF" w:sz="4"/>
@@ -1590,7 +1609,7 @@
         </w:tc>
         <w:tc>
           <w:tcPr>
-            <w:tcW w:type="dxa" w:w="3240"/>
+            <w:tcW w:type="dxa" w:w="2550"/>
             <w:tcBorders>
               <w:top w:val="single" w:color="BFBFBF" w:sz="4"/>
               <w:left w:val="single" w:color="BFBFBF" w:sz="4"/>

</xml_diff>

<commit_message>
Take specified small claims through evidence, hearing notice and fee
After the small claims Standard Direction Order, each solicitor uploads
evidence, the hearing centre admin creates a small claims hearing notice
and the claimant's solicitor pays the hearing fee, leaving the claim in
PREPARE_FOR_HEARING_CONDUCT_HEARING. A small claim has no disclosure, so
UploadEvidence uploads documentary evidence for the hearing instead of a
disclosure list, and CreateHearingNotice picks the small claims hearing
type with a one hour hearing. The guide covers the small claims route
and the Word copy is regenerated.
</commit_message>
<xml_diff>
--- a/playwright-tests/RUNNING_SPECIFIED_TESTS.docx
+++ b/playwright-tests/RUNNING_SPECIFIED_TESTS.docx
@@ -32,7 +32,7 @@
         <w:rPr>
           <w:rFonts w:ascii="Arial" w:cs="Arial" w:eastAsia="Arial" w:hAnsi="Arial"/>
         </w:rPr>
-        <w:t xml:space="preserve">Each command starts the journey from scratch: it creates a new specified (money) claim and takes it through the steps in order. A step that does not apply to the claim, or is switched off, is skipped. The journey currently ends with court staff confirming the judge's final order, which moves the claim to All_FINAL_ORDERS_ISSUED. A small claim goes to mediation, then after unsuccessful mediation gets the judge's small claims Standard Direction Order and ends in CASE_PROGRESSION: the small claims steps after the order are not coded yet.</w:t>
+        <w:t xml:space="preserve">Each command starts the journey from scratch: it creates a new specified (money) claim and takes it through the steps in order. A step that does not apply to the claim, or is switched off, is skipped. The journey currently ends with court staff confirming the judge's final order, which moves the claim to All_FINAL_ORDERS_ISSUED. A small claim goes to mediation, then after unsuccessful mediation gets a legal adviser's small claims Standard Direction Order, the solicitors' evidence uploads and a small claims hearing notice, and the claimant's solicitor pays the hearing fee, ending in PREPARE_FOR_HEARING_CONDUCT_HEARING: the small claims steps after that are not coded yet.</w:t>
       </w:r>
     </w:p>
     <w:p>
@@ -351,7 +351,7 @@
         <w:rPr>
           <w:rFonts w:ascii="Arial" w:cs="Arial" w:eastAsia="Arial" w:hAnsi="Arial"/>
         </w:rPr>
-        <w:t xml:space="preserve">UPLOAD_EVIDENCE (group: _CLAIMANT_SOLICITOR, _DEFENDANT1_SOLICITOR, _DEFENDANT2_SOLICITOR): once the judge's order has moved the claim to CASE_PROGRESSION, each solicitor uploads a disclosure list with "Upload Your Documents" (the second defendant's solicitor only for 1v2DS). A solicitor acting for two parties uploads it for both. The claim stays in CASE_PROGRESSION. It is always done in the UI.</w:t>
+        <w:t xml:space="preserve">UPLOAD_EVIDENCE (group: _CLAIMANT_SOLICITOR, _DEFENDANT1_SOLICITOR, _DEFENDANT2_SOLICITOR): once the judge's order has moved the claim to CASE_PROGRESSION, each solicitor uploads a disclosure list with "Upload Your Documents", or on the small claims track, which has no disclosure, documentary evidence for the hearing (once the small claims order is made) (the second defendant's solicitor only for 1v2DS). A solicitor acting for two parties uploads it for both. The claim stays in CASE_PROGRESSION. It is always done in the UI.</w:t>
       </w:r>
     </w:p>
     <w:p>
@@ -370,7 +370,7 @@
         <w:rPr>
           <w:rFonts w:ascii="Arial" w:cs="Arial" w:eastAsia="Arial" w:hAnsi="Arial"/>
         </w:rPr>
-        <w:t xml:space="preserve">CREATE_HEARING_NOTICE: once the evidence is in, the hearing centre admin lists the trial with "Create a hearing notice" (a first listing of a "Trial (Fast, Intermediate and Multi track)" notice at Clerkenwell, 8 weeks ahead). This stands in for HMC returning a listed hearing. civil-service works out the hearing fee and moves the claim to HEARING_READINESS. It is always done in the UI.</w:t>
+        <w:t xml:space="preserve">CREATE_HEARING_NOTICE: once the evidence is in, the hearing centre admin lists the trial with "Create a hearing notice" (a first listing of a "Trial (Fast, Intermediate and Multi track)" notice at Clerkenwell, 8 weeks ahead). A small claim gets a "Small claims hearing" notice instead, straight after its Standard Direction Order. This stands in for HMC returning a listed hearing. civil-service works out the hearing fee and moves the claim to HEARING_READINESS. It is always done in the UI.</w:t>
       </w:r>
     </w:p>
     <w:p>

</xml_diff>

<commit_message>
Add the trial bundle to specified small claims
civil-service's bundle scheduler only leaves out intermediate and multi
track claims, so a small claim now gets its trial bundle after the
hearing fee is paid, as the fast track does. The guide says so and the
Word copy is regenerated.
</commit_message>
<xml_diff>
--- a/playwright-tests/RUNNING_SPECIFIED_TESTS.docx
+++ b/playwright-tests/RUNNING_SPECIFIED_TESTS.docx
@@ -32,7 +32,7 @@
         <w:rPr>
           <w:rFonts w:ascii="Arial" w:cs="Arial" w:eastAsia="Arial" w:hAnsi="Arial"/>
         </w:rPr>
-        <w:t xml:space="preserve">Each command starts the journey from scratch: it creates a new specified (money) claim and takes it through the steps in order. A step that does not apply to the claim, or is switched off, is skipped. The journey currently ends with court staff confirming the judge's final order, which moves the claim to All_FINAL_ORDERS_ISSUED. A small claim goes to mediation, then after unsuccessful mediation gets a legal adviser's small claims Standard Direction Order, the solicitors' evidence uploads and a small claims hearing notice, and the claimant's solicitor pays the hearing fee, ending in PREPARE_FOR_HEARING_CONDUCT_HEARING: the small claims steps after that are not coded yet.</w:t>
+        <w:t xml:space="preserve">Each command starts the journey from scratch: it creates a new specified (money) claim and takes it through the steps in order. A step that does not apply to the claim, or is switched off, is skipped. The journey currently ends with court staff confirming the judge's final order, which moves the claim to All_FINAL_ORDERS_ISSUED. A small claim goes to mediation, then after unsuccessful mediation gets a legal adviser's small claims Standard Direction Order, the solicitors' evidence uploads and a small claims hearing notice, the claimant's solicitor pays the hearing fee and the trial bundle is created, ending in PREPARE_FOR_HEARING_CONDUCT_HEARING: the small claims steps after that are not coded yet.</w:t>
       </w:r>
     </w:p>
     <w:p>
@@ -446,7 +446,7 @@
         <w:rPr>
           <w:rFonts w:ascii="Arial" w:cs="Arial" w:eastAsia="Arial" w:hAnsi="Arial"/>
         </w:rPr>
-        <w:t xml:space="preserve">CREATE_TRIAL_BUNDLE: the trial bundle is created. civil-service's scheduler does this about 3 weeks before the hearing, for every track except intermediate and multi (small claims have bundles too, but the journey stops after their Standard Direction Order), so the test asks civil-service to do it now, waits for the bundle to be stitched into one document and checks the claimant's solicitor sees it on the Bundles tab. The claim stays in PREPARE_FOR_HEARING_CONDUCT_HEARING.</w:t>
+        <w:t xml:space="preserve">CREATE_TRIAL_BUNDLE: the trial bundle is created. civil-service's scheduler does this about 3 weeks before the hearing, for every track except intermediate and multi (small claims have bundles too), so the test asks civil-service to do it now, waits for the bundle to be stitched into one document and checks the claimant's solicitor sees it on the Bundles tab. The claim stays in PREPARE_FOR_HEARING_CONDUCT_HEARING.</w:t>
       </w:r>
     </w:p>
     <w:p>

</xml_diff>

<commit_message>
Take specified small claims through to the final order
After the trial bundle, a small claim now moves to DECISION_OUTCOME, the
judge makes the final order (a free form order by default) and court
staff confirm the order review, moving it to All_FINAL_ORDERS_ISSUED as
on the other tracks. With every step after the small claims order coded,
the two lists of when those steps run are merged into one, which
includes small claims that reached their order through mediation. The
guide covers small claims final orders and the Word copy is regenerated.
</commit_message>
<xml_diff>
--- a/playwright-tests/RUNNING_SPECIFIED_TESTS.docx
+++ b/playwright-tests/RUNNING_SPECIFIED_TESTS.docx
@@ -32,7 +32,7 @@
         <w:rPr>
           <w:rFonts w:ascii="Arial" w:cs="Arial" w:eastAsia="Arial" w:hAnsi="Arial"/>
         </w:rPr>
-        <w:t xml:space="preserve">Each command starts the journey from scratch: it creates a new specified (money) claim and takes it through the steps in order. A step that does not apply to the claim, or is switched off, is skipped. The journey currently ends with court staff confirming the judge's final order, which moves the claim to All_FINAL_ORDERS_ISSUED. A small claim goes to mediation, then after unsuccessful mediation gets a legal adviser's small claims Standard Direction Order, the solicitors' evidence uploads and a small claims hearing notice, the claimant's solicitor pays the hearing fee and the trial bundle is created, ending in PREPARE_FOR_HEARING_CONDUCT_HEARING: the small claims steps after that are not coded yet.</w:t>
+        <w:t xml:space="preserve">Each command starts the journey from scratch: it creates a new specified (money) claim and takes it through the steps in order. A step that does not apply to the claim, or is switched off, is skipped. The journey currently ends with court staff confirming the judge's final order, which moves the claim to All_FINAL_ORDERS_ISSUED. A small claim goes to mediation, then after unsuccessful mediation gets a legal adviser's small claims Standard Direction Order, the solicitors' evidence uploads and a small claims hearing notice, the claimant's solicitor pays the hearing fee and the trial bundle is created. After the hearing the judge's final order and the order review take it to All_FINAL_ORDERS_ISSUED, as on the other tracks.</w:t>
       </w:r>
     </w:p>
     <w:p>
@@ -484,7 +484,7 @@
         <w:rPr>
           <w:rFonts w:ascii="Arial" w:cs="Arial" w:eastAsia="Arial" w:hAnsi="Arial"/>
         </w:rPr>
-        <w:t xml:space="preserve">MAKE_FINAL_ORDER: the judge makes the final order with "Make an order" (FINAL_ORDER, see section 12). On the fast track the judge writes a free form or an assisted order on the page. On the intermediate and multi tracks the judge keeps the claim on its track, picks a template (for the after-hearing template, giving today as the hearing date), and uploads the completed order (playwright-tests/documents/TEST_ORDER.docx). The test checks the order was added to the case and its notifications sent. The claim stays in DECISION_OUTCOME. It is always done in the UI.</w:t>
+        <w:t xml:space="preserve">MAKE_FINAL_ORDER: the judge makes the final order with "Make an order" (FINAL_ORDER, see section 12). On the small claims and fast tracks the judge writes a free form or an assisted order on the page. On the intermediate and multi tracks the judge keeps the claim on its track, picks a template (for the after-hearing template, giving today as the hearing date), and uploads the completed order (playwright-tests/documents/TEST_ORDER.docx). The test checks the order was added to the case and its notifications sent. The claim stays in DECISION_OUTCOME. It is always done in the UI.</w:t>
       </w:r>
     </w:p>
     <w:p>
@@ -5796,7 +5796,7 @@
                 <w:sz w:val="20"/>
                 <w:szCs w:val="20"/>
               </w:rPr>
-              <w:t xml:space="preserve">Fast: FREE_FORM_ORDER, ASSISTED_ORDER. Intermediate: BLANK_TEMPLATE_AFTER_HEARING, BLANK_TEMPLATE_BEFORE_HEARING, FIX_A_DATE_FOR_CMC. Multi: those three and FIX_A_DATE_FOR_CCMC</w:t>
+              <w:t xml:space="preserve">Small and fast: FREE_FORM_ORDER, ASSISTED_ORDER. Intermediate: BLANK_TEMPLATE_AFTER_HEARING, BLANK_TEMPLATE_BEFORE_HEARING, FIX_A_DATE_FOR_CMC. Multi: those three and FIX_A_DATE_FOR_CCMC</w:t>
             </w:r>
           </w:p>
         </w:tc>
@@ -5850,7 +5850,7 @@
                 <w:sz w:val="20"/>
                 <w:szCs w:val="20"/>
               </w:rPr>
-              <w:t xml:space="preserve">FREE_FORM_ORDER on fast, BLANK_TEMPLATE_AFTER_HEARING on intermediate and multi. Any other value stops the run.</w:t>
+              <w:t xml:space="preserve">FREE_FORM_ORDER on small and fast, BLANK_TEMPLATE_AFTER_HEARING on intermediate and multi. Any other value stops the run.</w:t>
             </w:r>
           </w:p>
         </w:tc>

</xml_diff>

<commit_message>
Add successful mediation to specified small claims
With MEDIATION_SUCCESSFUL=Yes, a small claim the claimant's response
took to mediation is settled: the hearing centre admin records with
"Mediation Successful" that the settlement was agreed today and uploads
the mediation agreement, which stays the case (CASE_STAYED). The
journey ends there, so MEDIATION_UNSUCCESSFUL, the small claims order
and every step after it are skipped. AAT shows the agreement page
before the settlement date page, the other way round from the
definition, so each page is answered as it comes. The guide covers the
new step and setting, and the Word copy is regenerated.
</commit_message>
<xml_diff>
--- a/playwright-tests/RUNNING_SPECIFIED_TESTS.docx
+++ b/playwright-tests/RUNNING_SPECIFIED_TESTS.docx
@@ -294,7 +294,7 @@
         <w:rPr>
           <w:rFonts w:ascii="Arial" w:cs="Arial" w:eastAsia="Arial" w:hAnsi="Arial"/>
         </w:rPr>
-        <w:t xml:space="preserve">MEDIATION_UNSUCCESSFUL: when the claimant's response took a small claim to mediation (IN_MEDIATION), the hearing centre admin records with "Mediation Unsuccessful" that a party withdrew. civil-service moves the claim to JUDICIAL_REFERRAL for the judge's directions. It is always done in the UI.</w:t>
+        <w:t xml:space="preserve">MEDIATION_SUCCESSFUL (optional): when the claimant's response took a small claim to mediation (IN_MEDIATION), the hearing centre admin records with "Mediation Successful" that the claim settled today and uploads the mediation agreement. civil-service stays the case (CASE_STAYED), which ends the journey: MEDIATION_UNSUCCESSFUL and every step after it are skipped (MEDIATION_SUCCESSFUL=Yes). It is always done in the UI.</w:t>
       </w:r>
     </w:p>
     <w:p>
@@ -313,7 +313,7 @@
         <w:rPr>
           <w:rFonts w:ascii="Arial" w:cs="Arial" w:eastAsia="Arial" w:hAnsi="Arial"/>
         </w:rPr>
-        <w:t xml:space="preserve">CREATE_SDO: the judge makes a Standard Direction Order, moving the claim from JUDICIAL_REFERRAL to CASE_PROGRESSION. It runs on the fast track when the claimant's response took the claim to JUDICIAL_REFERRAL, and on the small claims track after unsuccessful mediation, where work allocation gives the directions task to a legal adviser, who makes the order (a one hour hearing, in person at the court civil-service fills in). It is always done in the UI, where the judge opens the event by its URL (and claims the directions task first where work allocation needs one).</w:t>
+        <w:t xml:space="preserve">MEDIATION_UNSUCCESSFUL: when the claimant's response took a small claim to mediation (IN_MEDIATION) and MEDIATION_SUCCESSFUL is not Yes, the hearing centre admin records with "Mediation Unsuccessful" that a party withdrew. civil-service moves the claim to JUDICIAL_REFERRAL for the judge's directions. It is always done in the UI.</w:t>
       </w:r>
     </w:p>
     <w:p>
@@ -332,7 +332,7 @@
         <w:rPr>
           <w:rFonts w:ascii="Arial" w:cs="Arial" w:eastAsia="Arial" w:hAnsi="Arial"/>
         </w:rPr>
-        <w:t xml:space="preserve">MAKE_DIRECTIONS_ORDER: on the intermediate and multi tracks, which have no Standard Direction Order, the judge makes a directions order with "Make an order" instead, also moving the claim from JUDICIAL_REFERRAL to CASE_PROGRESSION. The judge keeps the claim on its track, chooses the blank template for an order before a hearing and uploads the completed order (playwright-tests/documents/TEST_ORDER.docx; the page only takes Word documents). It is always done in the UI (claiming the track allocation task first where work allocation needs one).</w:t>
+        <w:t xml:space="preserve">CREATE_SDO: the judge makes a Standard Direction Order, moving the claim from JUDICIAL_REFERRAL to CASE_PROGRESSION. It runs on the fast track when the claimant's response took the claim to JUDICIAL_REFERRAL, and on the small claims track after unsuccessful mediation, where work allocation gives the directions task to a legal adviser, who makes the order (a one hour hearing, in person at the court civil-service fills in). It is always done in the UI, where the judge opens the event by its URL (and claims the directions task first where work allocation needs one).</w:t>
       </w:r>
     </w:p>
     <w:p>
@@ -351,7 +351,7 @@
         <w:rPr>
           <w:rFonts w:ascii="Arial" w:cs="Arial" w:eastAsia="Arial" w:hAnsi="Arial"/>
         </w:rPr>
-        <w:t xml:space="preserve">UPLOAD_EVIDENCE (group: _CLAIMANT_SOLICITOR, _DEFENDANT1_SOLICITOR, _DEFENDANT2_SOLICITOR): once the judge's order has moved the claim to CASE_PROGRESSION, each solicitor uploads a disclosure list with "Upload Your Documents", or on the small claims track, which has no disclosure, documentary evidence for the hearing (once the small claims order is made) (the second defendant's solicitor only for 1v2DS). A solicitor acting for two parties uploads it for both. The claim stays in CASE_PROGRESSION. It is always done in the UI.</w:t>
+        <w:t xml:space="preserve">MAKE_DIRECTIONS_ORDER: on the intermediate and multi tracks, which have no Standard Direction Order, the judge makes a directions order with "Make an order" instead, also moving the claim from JUDICIAL_REFERRAL to CASE_PROGRESSION. The judge keeps the claim on its track, chooses the blank template for an order before a hearing and uploads the completed order (playwright-tests/documents/TEST_ORDER.docx; the page only takes Word documents). It is always done in the UI (claiming the track allocation task first where work allocation needs one).</w:t>
       </w:r>
     </w:p>
     <w:p>
@@ -370,7 +370,7 @@
         <w:rPr>
           <w:rFonts w:ascii="Arial" w:cs="Arial" w:eastAsia="Arial" w:hAnsi="Arial"/>
         </w:rPr>
-        <w:t xml:space="preserve">CREATE_HEARING_NOTICE: once the evidence is in, the hearing centre admin lists the trial with "Create a hearing notice" (a first listing of a "Trial (Fast, Intermediate and Multi track)" notice at Clerkenwell, 8 weeks ahead). A small claim gets a "Small claims hearing" notice instead, straight after its Standard Direction Order. This stands in for HMC returning a listed hearing. civil-service works out the hearing fee and moves the claim to HEARING_READINESS. It is always done in the UI.</w:t>
+        <w:t xml:space="preserve">UPLOAD_EVIDENCE (group: _CLAIMANT_SOLICITOR, _DEFENDANT1_SOLICITOR, _DEFENDANT2_SOLICITOR): once the judge's order has moved the claim to CASE_PROGRESSION, each solicitor uploads a disclosure list with "Upload Your Documents", or on the small claims track, which has no disclosure, documentary evidence for the hearing (once the small claims order is made) (the second defendant's solicitor only for 1v2DS). A solicitor acting for two parties uploads it for both. The claim stays in CASE_PROGRESSION. It is always done in the UI.</w:t>
       </w:r>
     </w:p>
     <w:p>
@@ -389,7 +389,7 @@
         <w:rPr>
           <w:rFonts w:ascii="Arial" w:cs="Arial" w:eastAsia="Arial" w:hAnsi="Arial"/>
         </w:rPr>
-        <w:t xml:space="preserve">PAY_HEARING_FEE: the claimant's solicitor pays the hearing fee from the Service Request tab, by PBA or card (PAYMENT_METHOD). If the payment service has not told civil-service about the payment within a minute, the test does. The test then runs HEARING_FEE_PAID, which civil-service's scheduler would otherwise run later, moving the claim to PREPARE_FOR_HEARING_CONDUCT_HEARING. It is always done in the UI.</w:t>
+        <w:t xml:space="preserve">CREATE_HEARING_NOTICE: once the evidence is in, the hearing centre admin lists the trial with "Create a hearing notice" (a first listing of a "Trial (Fast, Intermediate and Multi track)" notice at Clerkenwell, 8 weeks ahead). A small claim gets a "Small claims hearing" notice instead, straight after its Standard Direction Order. This stands in for HMC returning a listed hearing. civil-service works out the hearing fee and moves the claim to HEARING_READINESS. It is always done in the UI.</w:t>
       </w:r>
     </w:p>
     <w:p>
@@ -408,7 +408,7 @@
         <w:rPr>
           <w:rFonts w:ascii="Arial" w:cs="Arial" w:eastAsia="Arial" w:hAnsi="Arial"/>
         </w:rPr>
-        <w:t xml:space="preserve">TRIAL_READY_CHECK: on the fast track only, the parties are asked to confirm they are ready for trial. civil-service's scheduler does this once the hearing is less than 3 weeks away; the hearing is 8 weeks ahead, so the test runs the event itself and checks it was recorded on the case. The claim stays in PREPARE_FOR_HEARING_CONDUCT_HEARING.</w:t>
+        <w:t xml:space="preserve">PAY_HEARING_FEE: the claimant's solicitor pays the hearing fee from the Service Request tab, by PBA or card (PAYMENT_METHOD). If the payment service has not told civil-service about the payment within a minute, the test does. The test then runs HEARING_FEE_PAID, which civil-service's scheduler would otherwise run later, moving the claim to PREPARE_FOR_HEARING_CONDUCT_HEARING. It is always done in the UI.</w:t>
       </w:r>
     </w:p>
     <w:p>
@@ -427,7 +427,7 @@
         <w:rPr>
           <w:rFonts w:ascii="Arial" w:cs="Arial" w:eastAsia="Arial" w:hAnsi="Arial"/>
         </w:rPr>
-        <w:t xml:space="preserve">CONFIRM_TRIAL_ARRANGEMENTS (group: _CLAIMANT_SOLICITOR, _DEFENDANT1_SOLICITOR, _DEFENDANT2_SOLICITOR): each solicitor confirms with "Confirm trial arrangements" that the case is ready for trial, with no change to the hearing requirements (the second defendant's solicitor only for 1v2DS). A solicitor acting for two parties confirms for both. Like the trial ready check it is fast track only (XUI does not offer it on the intermediate or multi tracks), and it has to be done more than 3 weeks before the hearing. The claim stays in PREPARE_FOR_HEARING_CONDUCT_HEARING. It is always done in the UI.</w:t>
+        <w:t xml:space="preserve">TRIAL_READY_CHECK: on the fast track only, the parties are asked to confirm they are ready for trial. civil-service's scheduler does this once the hearing is less than 3 weeks away; the hearing is 8 weeks ahead, so the test runs the event itself and checks it was recorded on the case. The claim stays in PREPARE_FOR_HEARING_CONDUCT_HEARING.</w:t>
       </w:r>
     </w:p>
     <w:p>
@@ -446,7 +446,7 @@
         <w:rPr>
           <w:rFonts w:ascii="Arial" w:cs="Arial" w:eastAsia="Arial" w:hAnsi="Arial"/>
         </w:rPr>
-        <w:t xml:space="preserve">CREATE_TRIAL_BUNDLE: the trial bundle is created. civil-service's scheduler does this about 3 weeks before the hearing, for every track except intermediate and multi (small claims have bundles too), so the test asks civil-service to do it now, waits for the bundle to be stitched into one document and checks the claimant's solicitor sees it on the Bundles tab. The claim stays in PREPARE_FOR_HEARING_CONDUCT_HEARING.</w:t>
+        <w:t xml:space="preserve">CONFIRM_TRIAL_ARRANGEMENTS (group: _CLAIMANT_SOLICITOR, _DEFENDANT1_SOLICITOR, _DEFENDANT2_SOLICITOR): each solicitor confirms with "Confirm trial arrangements" that the case is ready for trial, with no change to the hearing requirements (the second defendant's solicitor only for 1v2DS). A solicitor acting for two parties confirms for both. Like the trial ready check it is fast track only (XUI does not offer it on the intermediate or multi tracks), and it has to be done more than 3 weeks before the hearing. The claim stays in PREPARE_FOR_HEARING_CONDUCT_HEARING. It is always done in the UI.</w:t>
       </w:r>
     </w:p>
     <w:p>
@@ -465,7 +465,7 @@
         <w:rPr>
           <w:rFonts w:ascii="Arial" w:cs="Arial" w:eastAsia="Arial" w:hAnsi="Arial"/>
         </w:rPr>
-        <w:t xml:space="preserve">MOVE_TO_DECISION_OUTCOME: once the hearing date has passed, civil-service's scheduler moves the claim to DECISION_OUTCOME to wait for the judge's decision, on every track. The hearing is weeks away, so the test runs the event itself.</w:t>
+        <w:t xml:space="preserve">CREATE_TRIAL_BUNDLE: the trial bundle is created. civil-service's scheduler does this about 3 weeks before the hearing, for every track except intermediate and multi (small claims have bundles too), so the test asks civil-service to do it now, waits for the bundle to be stitched into one document and checks the claimant's solicitor sees it on the Bundles tab. The claim stays in PREPARE_FOR_HEARING_CONDUCT_HEARING.</w:t>
       </w:r>
     </w:p>
     <w:p>
@@ -484,7 +484,7 @@
         <w:rPr>
           <w:rFonts w:ascii="Arial" w:cs="Arial" w:eastAsia="Arial" w:hAnsi="Arial"/>
         </w:rPr>
-        <w:t xml:space="preserve">MAKE_FINAL_ORDER: the judge makes the final order with "Make an order" (FINAL_ORDER, see section 12). On the small claims and fast tracks the judge writes a free form or an assisted order on the page. On the intermediate and multi tracks the judge keeps the claim on its track, picks a template (for the after-hearing template, giving today as the hearing date), and uploads the completed order (playwright-tests/documents/TEST_ORDER.docx). The test checks the order was added to the case and its notifications sent. The claim stays in DECISION_OUTCOME. It is always done in the UI.</w:t>
+        <w:t xml:space="preserve">MOVE_TO_DECISION_OUTCOME: once the hearing date has passed, civil-service's scheduler moves the claim to DECISION_OUTCOME to wait for the judge's decision, on every track. The hearing is weeks away, so the test runs the event itself.</w:t>
       </w:r>
     </w:p>
     <w:p>
@@ -503,6 +503,25 @@
         <w:rPr>
           <w:rFonts w:ascii="Arial" w:cs="Arial" w:eastAsia="Arial" w:hAnsi="Arial"/>
         </w:rPr>
+        <w:t xml:space="preserve">MAKE_FINAL_ORDER: the judge makes the final order with "Make an order" (FINAL_ORDER, see section 12). On the small claims and fast tracks the judge writes a free form or an assisted order on the page. On the intermediate and multi tracks the judge keeps the claim on its track, picks a template (for the after-hearing template, giving today as the hearing date), and uploads the completed order (playwright-tests/documents/TEST_ORDER.docx). The test checks the order was added to the case and its notifications sent. The claim stays in DECISION_OUTCOME. It is always done in the UI.</w:t>
+      </w:r>
+    </w:p>
+    <w:p>
+      <w:pPr>
+        <w:pStyle w:val="ListParagraph"/>
+        <w:numPr>
+          <w:ilvl w:val="0"/>
+          <w:numId w:val="2"/>
+        </w:numPr>
+        <w:tabs>
+          <w:tab w:val="left" w:pos="720"/>
+        </w:tabs>
+        <w:spacing w:after="60"/>
+      </w:pPr>
+      <w:r>
+        <w:rPr>
+          <w:rFonts w:ascii="Arial" w:cs="Arial" w:eastAsia="Arial" w:hAnsi="Arial"/>
+        </w:rPr>
         <w:t xml:space="preserve">CONFIRM_ORDER_REVIEW: the hearing centre admin reviews the order with "Confirm order review": no date a party must do something by, a final order, and nothing left to do. This closes the claim on any track, moving it to All_FINAL_ORDERS_ISSUED. It is always done in the UI.</w:t>
       </w:r>
     </w:p>
@@ -547,7 +566,7 @@
         <w:rPr>
           <w:rFonts w:ascii="Arial" w:cs="Arial" w:eastAsia="Arial" w:hAnsi="Arial"/>
         </w:rPr>
-        <w:t xml:space="preserve">The steps with an API version are CREATE_CLAIM, INFORM_AGREED_EXTENSION_DEFENDANT1/2, RESPOND_TO_CLAIM_DEFENDANT1/2, RESPOND_TO_DEFENCE and MANAGE_CONTACT_INFORMATION. ADD_CASE_NOTE, MEDIATION_UNSUCCESSFUL, CREATE_CASE_FLAGS, MAKE_CASE_FLAG_INACTIVE, STAY_CASE, MANAGE_STAY_REQUEST_UPDATE, LIFT_STAY, CREATE_SDO, MAKE_DIRECTIONS_ORDER, UPLOAD_EVIDENCE, CREATE_HEARING_NOTICE, PAY_HEARING_FEE, CONFIRM_TRIAL_ARRANGEMENTS, MAKE_FINAL_ORDER and CONFIRM_ORDER_REVIEW always use the UI. With API_UNTIL=&lt;state&gt; they go through the CCD API until the claim reaches that state, and every step after it goes through the UI. Leave API_UNTIL unset to do everything through the UI.</w:t>
+        <w:t xml:space="preserve">The steps with an API version are CREATE_CLAIM, INFORM_AGREED_EXTENSION_DEFENDANT1/2, RESPOND_TO_CLAIM_DEFENDANT1/2, RESPOND_TO_DEFENCE and MANAGE_CONTACT_INFORMATION. ADD_CASE_NOTE, MEDIATION_SUCCESSFUL, MEDIATION_UNSUCCESSFUL, CREATE_CASE_FLAGS, MAKE_CASE_FLAG_INACTIVE, STAY_CASE, MANAGE_STAY_REQUEST_UPDATE, LIFT_STAY, CREATE_SDO, MAKE_DIRECTIONS_ORDER, UPLOAD_EVIDENCE, CREATE_HEARING_NOTICE, PAY_HEARING_FEE, CONFIRM_TRIAL_ARRANGEMENTS, MAKE_FINAL_ORDER and CONFIRM_ORDER_REVIEW always use the UI. With API_UNTIL=&lt;state&gt; they go through the CCD API until the claim reaches that state, and every step after it goes through the UI. Leave API_UNTIL unset to do everything through the UI.</w:t>
       </w:r>
     </w:p>
     <w:p>
@@ -1517,7 +1536,7 @@
                 <w:sz w:val="20"/>
                 <w:szCs w:val="20"/>
               </w:rPr>
-              <w:t xml:space="preserve">IN_MEDIATION, then JUDICIAL_REFERRAL after unsuccessful mediation</w:t>
+              <w:t xml:space="preserve">IN_MEDIATION, then JUDICIAL_REFERRAL after unsuccessful mediation (CASE_STAYED if it was successful)</w:t>
             </w:r>
           </w:p>
         </w:tc>
@@ -4608,6 +4627,119 @@
                 <w:szCs w:val="20"/>
               </w:rPr>
               <w:t xml:space="preserve">Optional steps: stay the case once it reaches JUDICIAL_REFERRAL, ask for an update and lift the stay.</w:t>
+            </w:r>
+          </w:p>
+        </w:tc>
+      </w:tr>
+      <w:tr>
+        <w:trPr>
+          <w:tblHeader w:val="off"/>
+        </w:trPr>
+        <w:tc>
+          <w:tcPr>
+            <w:tcW w:type="dxa" w:w="1692"/>
+            <w:tcBorders>
+              <w:top w:val="single" w:color="BFBFBF" w:sz="4"/>
+              <w:left w:val="single" w:color="BFBFBF" w:sz="4"/>
+              <w:bottom w:val="single" w:color="BFBFBF" w:sz="4"/>
+              <w:right w:val="single" w:color="BFBFBF" w:sz="4"/>
+            </w:tcBorders>
+            <w:tcMar>
+              <w:top w:type="dxa" w:w="60"/>
+              <w:left w:type="dxa" w:w="100"/>
+              <w:bottom w:type="dxa" w:w="60"/>
+              <w:right w:type="dxa" w:w="100"/>
+            </w:tcMar>
+          </w:tcPr>
+          <w:p>
+            <w:r>
+              <w:rPr>
+                <w:rFonts w:ascii="Courier New" w:cs="Courier New" w:eastAsia="Courier New" w:hAnsi="Courier New"/>
+                <w:sz w:val="20"/>
+                <w:szCs w:val="20"/>
+              </w:rPr>
+              <w:t xml:space="preserve">MEDIATION_SUCCESSFUL</w:t>
+            </w:r>
+          </w:p>
+        </w:tc>
+        <w:tc>
+          <w:tcPr>
+            <w:tcW w:type="dxa" w:w="3196"/>
+            <w:tcBorders>
+              <w:top w:val="single" w:color="BFBFBF" w:sz="4"/>
+              <w:left w:val="single" w:color="BFBFBF" w:sz="4"/>
+              <w:bottom w:val="single" w:color="BFBFBF" w:sz="4"/>
+              <w:right w:val="single" w:color="BFBFBF" w:sz="4"/>
+            </w:tcBorders>
+            <w:tcMar>
+              <w:top w:type="dxa" w:w="60"/>
+              <w:left w:type="dxa" w:w="100"/>
+              <w:bottom w:type="dxa" w:w="60"/>
+              <w:right w:type="dxa" w:w="100"/>
+            </w:tcMar>
+          </w:tcPr>
+          <w:p>
+            <w:r>
+              <w:rPr>
+                <w:rFonts w:ascii="Arial" w:cs="Arial" w:eastAsia="Arial" w:hAnsi="Arial"/>
+                <w:sz w:val="20"/>
+                <w:szCs w:val="20"/>
+              </w:rPr>
+              <w:t xml:space="preserve">Yes, No</w:t>
+            </w:r>
+          </w:p>
+        </w:tc>
+        <w:tc>
+          <w:tcPr>
+            <w:tcW w:type="dxa" w:w="1551"/>
+            <w:tcBorders>
+              <w:top w:val="single" w:color="BFBFBF" w:sz="4"/>
+              <w:left w:val="single" w:color="BFBFBF" w:sz="4"/>
+              <w:bottom w:val="single" w:color="BFBFBF" w:sz="4"/>
+              <w:right w:val="single" w:color="BFBFBF" w:sz="4"/>
+            </w:tcBorders>
+            <w:tcMar>
+              <w:top w:type="dxa" w:w="60"/>
+              <w:left w:type="dxa" w:w="100"/>
+              <w:bottom w:type="dxa" w:w="60"/>
+              <w:right w:type="dxa" w:w="100"/>
+            </w:tcMar>
+          </w:tcPr>
+          <w:p>
+            <w:r>
+              <w:rPr>
+                <w:rFonts w:ascii="Arial" w:cs="Arial" w:eastAsia="Arial" w:hAnsi="Arial"/>
+                <w:sz w:val="20"/>
+                <w:szCs w:val="20"/>
+              </w:rPr>
+              <w:t xml:space="preserve">No</w:t>
+            </w:r>
+          </w:p>
+        </w:tc>
+        <w:tc>
+          <w:tcPr>
+            <w:tcW w:type="dxa" w:w="3199"/>
+            <w:tcBorders>
+              <w:top w:val="single" w:color="BFBFBF" w:sz="4"/>
+              <w:left w:val="single" w:color="BFBFBF" w:sz="4"/>
+              <w:bottom w:val="single" w:color="BFBFBF" w:sz="4"/>
+              <w:right w:val="single" w:color="BFBFBF" w:sz="4"/>
+            </w:tcBorders>
+            <w:tcMar>
+              <w:top w:type="dxa" w:w="60"/>
+              <w:left w:type="dxa" w:w="100"/>
+              <w:bottom w:type="dxa" w:w="60"/>
+              <w:right w:type="dxa" w:w="100"/>
+            </w:tcMar>
+          </w:tcPr>
+          <w:p>
+            <w:r>
+              <w:rPr>
+                <w:rFonts w:ascii="Arial" w:cs="Arial" w:eastAsia="Arial" w:hAnsi="Arial"/>
+                <w:sz w:val="20"/>
+                <w:szCs w:val="20"/>
+              </w:rPr>
+              <w:t xml:space="preserve">Optional step: mediation settles a small claim, which stays the case (CASE_STAYED) and ends the journey, instead of mediation being unsuccessful.</w:t>
             </w:r>
           </w:p>
         </w:tc>

</xml_diff>

<commit_message>
Add settling the claim to both journeys
SETTLE_CLAIM settles the claim with "Settle this claim" once the rest
of the journey has run. There are two events with that name:

- MARK_PAID_IN_FULL: the claimant's solicitor marks the claim as paid
  in full (SETTLE_CLAIM_MARK_PAID_FULL), which stays the case. With two
  claimants it is for both. It is skipped where there are two
  defendants and either is a litigant in person, which civil-service
  does not allow.
- JUDGE_ORDER or CONSENT_ORDER: the hearing centre admin records that
  the claim settled for that reason (SETTLE_CLAIM), which moves it to
  CASE_SETTLED. Court staff can also settle a stayed case.

Each step is skipped where the journey ended in a state its event is
not offered in, and both have API versions. Any other SETTLE_CLAIM
value stops the run. The guides and their Word copies cover the new
setting.
</commit_message>
<xml_diff>
--- a/playwright-tests/RUNNING_SPECIFIED_TESTS.docx
+++ b/playwright-tests/RUNNING_SPECIFIED_TESTS.docx
@@ -523,6 +523,44 @@
           <w:rFonts w:ascii="Arial" w:cs="Arial" w:eastAsia="Arial" w:hAnsi="Arial"/>
         </w:rPr>
         <w:t xml:space="preserve">CONFIRM_ORDER_REVIEW: the hearing centre admin reviews the order with "Confirm order review": no date a party must do something by, a final order, and nothing left to do. This closes the claim on any track, moving it to All_FINAL_ORDERS_ISSUED. It has an API version.</w:t>
+      </w:r>
+    </w:p>
+    <w:p>
+      <w:pPr>
+        <w:pStyle w:val="ListParagraph"/>
+        <w:numPr>
+          <w:ilvl w:val="0"/>
+          <w:numId w:val="2"/>
+        </w:numPr>
+        <w:tabs>
+          <w:tab w:val="left" w:pos="720"/>
+        </w:tabs>
+        <w:spacing w:after="60"/>
+      </w:pPr>
+      <w:r>
+        <w:rPr>
+          <w:rFonts w:ascii="Arial" w:cs="Arial" w:eastAsia="Arial" w:hAnsi="Arial"/>
+        </w:rPr>
+        <w:t xml:space="preserve">SETTLE_CLAIM_MARK_PAID_FULL (optional): once the rest of the journey has run, the claimant's solicitor settles the claim with "Settle this claim", marking it paid in full (SETTLE_CLAIM=MARK_PAID_IN_FULL). civil-service stays the case (CASE_STAYED) and tells the defendants. With two claimants it is for both. The step is skipped where the claim has ended in a state the event is not offered in (such as CASE_STAYED after successful mediation), or where there are two defendants and either is a litigant in person. It has an API version.</w:t>
+      </w:r>
+    </w:p>
+    <w:p>
+      <w:pPr>
+        <w:pStyle w:val="ListParagraph"/>
+        <w:numPr>
+          <w:ilvl w:val="0"/>
+          <w:numId w:val="2"/>
+        </w:numPr>
+        <w:tabs>
+          <w:tab w:val="left" w:pos="720"/>
+        </w:tabs>
+        <w:spacing w:after="60"/>
+      </w:pPr>
+      <w:r>
+        <w:rPr>
+          <w:rFonts w:ascii="Arial" w:cs="Arial" w:eastAsia="Arial" w:hAnsi="Arial"/>
+        </w:rPr>
+        <w:t xml:space="preserve">SETTLE_CLAIM (optional): once the rest of the journey has run, the hearing centre admin records with court staff's own "Settle this claim" that the claim settled following a judge's order (SETTLE_CLAIM=JUDGE_ORDER) or an approved consent order (CONSENT_ORDER), which moves it to CASE_SETTLED. Court staff can also settle a stayed case. It has an API version.</w:t>
       </w:r>
     </w:p>
     <w:p>
@@ -4740,6 +4778,119 @@
                 <w:szCs w:val="20"/>
               </w:rPr>
               <w:t xml:space="preserve">Optional step: mediation settles a small claim, which stays the case (CASE_STAYED) and ends the journey, instead of mediation being unsuccessful.</w:t>
+            </w:r>
+          </w:p>
+        </w:tc>
+      </w:tr>
+      <w:tr>
+        <w:trPr>
+          <w:tblHeader w:val="off"/>
+        </w:trPr>
+        <w:tc>
+          <w:tcPr>
+            <w:tcW w:type="dxa" w:w="1692"/>
+            <w:tcBorders>
+              <w:top w:val="single" w:color="BFBFBF" w:sz="4"/>
+              <w:left w:val="single" w:color="BFBFBF" w:sz="4"/>
+              <w:bottom w:val="single" w:color="BFBFBF" w:sz="4"/>
+              <w:right w:val="single" w:color="BFBFBF" w:sz="4"/>
+            </w:tcBorders>
+            <w:tcMar>
+              <w:top w:type="dxa" w:w="60"/>
+              <w:left w:type="dxa" w:w="100"/>
+              <w:bottom w:type="dxa" w:w="60"/>
+              <w:right w:type="dxa" w:w="100"/>
+            </w:tcMar>
+          </w:tcPr>
+          <w:p>
+            <w:r>
+              <w:rPr>
+                <w:rFonts w:ascii="Courier New" w:cs="Courier New" w:eastAsia="Courier New" w:hAnsi="Courier New"/>
+                <w:sz w:val="20"/>
+                <w:szCs w:val="20"/>
+              </w:rPr>
+              <w:t xml:space="preserve">SETTLE_CLAIM</w:t>
+            </w:r>
+          </w:p>
+        </w:tc>
+        <w:tc>
+          <w:tcPr>
+            <w:tcW w:type="dxa" w:w="3196"/>
+            <w:tcBorders>
+              <w:top w:val="single" w:color="BFBFBF" w:sz="4"/>
+              <w:left w:val="single" w:color="BFBFBF" w:sz="4"/>
+              <w:bottom w:val="single" w:color="BFBFBF" w:sz="4"/>
+              <w:right w:val="single" w:color="BFBFBF" w:sz="4"/>
+            </w:tcBorders>
+            <w:tcMar>
+              <w:top w:type="dxa" w:w="60"/>
+              <w:left w:type="dxa" w:w="100"/>
+              <w:bottom w:type="dxa" w:w="60"/>
+              <w:right w:type="dxa" w:w="100"/>
+            </w:tcMar>
+          </w:tcPr>
+          <w:p>
+            <w:r>
+              <w:rPr>
+                <w:rFonts w:ascii="Arial" w:cs="Arial" w:eastAsia="Arial" w:hAnsi="Arial"/>
+                <w:sz w:val="20"/>
+                <w:szCs w:val="20"/>
+              </w:rPr>
+              <w:t xml:space="preserve">MARK_PAID_IN_FULL, JUDGE_ORDER, CONSENT_ORDER</w:t>
+            </w:r>
+          </w:p>
+        </w:tc>
+        <w:tc>
+          <w:tcPr>
+            <w:tcW w:type="dxa" w:w="1551"/>
+            <w:tcBorders>
+              <w:top w:val="single" w:color="BFBFBF" w:sz="4"/>
+              <w:left w:val="single" w:color="BFBFBF" w:sz="4"/>
+              <w:bottom w:val="single" w:color="BFBFBF" w:sz="4"/>
+              <w:right w:val="single" w:color="BFBFBF" w:sz="4"/>
+            </w:tcBorders>
+            <w:tcMar>
+              <w:top w:type="dxa" w:w="60"/>
+              <w:left w:type="dxa" w:w="100"/>
+              <w:bottom w:type="dxa" w:w="60"/>
+              <w:right w:type="dxa" w:w="100"/>
+            </w:tcMar>
+          </w:tcPr>
+          <w:p>
+            <w:r>
+              <w:rPr>
+                <w:rFonts w:ascii="Arial" w:cs="Arial" w:eastAsia="Arial" w:hAnsi="Arial"/>
+                <w:sz w:val="20"/>
+                <w:szCs w:val="20"/>
+              </w:rPr>
+              <w:t xml:space="preserve">None</w:t>
+            </w:r>
+          </w:p>
+        </w:tc>
+        <w:tc>
+          <w:tcPr>
+            <w:tcW w:type="dxa" w:w="3199"/>
+            <w:tcBorders>
+              <w:top w:val="single" w:color="BFBFBF" w:sz="4"/>
+              <w:left w:val="single" w:color="BFBFBF" w:sz="4"/>
+              <w:bottom w:val="single" w:color="BFBFBF" w:sz="4"/>
+              <w:right w:val="single" w:color="BFBFBF" w:sz="4"/>
+            </w:tcBorders>
+            <w:tcMar>
+              <w:top w:type="dxa" w:w="60"/>
+              <w:left w:type="dxa" w:w="100"/>
+              <w:bottom w:type="dxa" w:w="60"/>
+              <w:right w:type="dxa" w:w="100"/>
+            </w:tcMar>
+          </w:tcPr>
+          <w:p>
+            <w:r>
+              <w:rPr>
+                <w:rFonts w:ascii="Arial" w:cs="Arial" w:eastAsia="Arial" w:hAnsi="Arial"/>
+                <w:sz w:val="20"/>
+                <w:szCs w:val="20"/>
+              </w:rPr>
+              <w:t xml:space="preserve">Optional step, once the rest of the journey has run: the claimant's solicitor marks the claim paid in full with "Settle this claim", which stays the case (CASE_STAYED), or the hearing centre admin records it settled after a judge's order or a consent order (CASE_SETTLED). Any other value stops the run.</w:t>
             </w:r>
           </w:p>
         </w:tc>

</xml_diff>

<commit_message>
Add a nightly set for the specified journeys
Every specified scenario is now tagged @spec-nightly, and a new
spec-nightly project runs them headless, as unspec-nightly does for
the unspecified journeys. yarn test:spec-nightly:ci runs it with
SCENARIOS=Yes. Nothing runs either nightly set on a schedule yet.
</commit_message>
<xml_diff>
--- a/playwright-tests/RUNNING_SPECIFIED_TESTS.docx
+++ b/playwright-tests/RUNNING_SPECIFIED_TESTS.docx
@@ -3007,6 +3007,42 @@
           <w:szCs w:val="18"/>
         </w:rPr>
         <w:t xml:space="preserve">ENV=aat SCENARIOS=Yes npx playwright test playwright-tests/e2e/journeys/SpecifiedSS.test.ts --project chromium --grep @SPEC_1v2DS_FAST</w:t>
+      </w:r>
+    </w:p>
+    <w:p>
+      <w:pPr>
+        <w:spacing w:after="120"/>
+      </w:pPr>
+      <w:r>
+        <w:rPr>
+          <w:rFonts w:ascii="Arial" w:cs="Arial" w:eastAsia="Arial" w:hAnsi="Arial"/>
+        </w:rPr>
+        <w:t xml:space="preserve">Every named scenario is tagged @spec-nightly, the specified nightly set. The spec-nightly project runs them all, headless (yarn test:spec-nightly:ci, which sets SCENARIOS=Yes):</w:t>
+      </w:r>
+    </w:p>
+    <w:p>
+      <w:pPr>
+        <w:shd w:fill="F2F2F2" w:color="auto" w:val="clear"/>
+        <w:spacing w:after="160" w:before="60"/>
+      </w:pPr>
+      <w:r>
+        <w:rPr>
+          <w:rFonts w:ascii="Courier New" w:cs="Courier New" w:eastAsia="Courier New" w:hAnsi="Courier New"/>
+          <w:sz w:val="18"/>
+          <w:szCs w:val="18"/>
+        </w:rPr>
+        <w:t xml:space="preserve">ENV=aat SCENARIOS=Yes npx playwright test --project spec-nightly</w:t>
+      </w:r>
+    </w:p>
+    <w:p>
+      <w:pPr>
+        <w:spacing w:after="120"/>
+      </w:pPr>
+      <w:r>
+        <w:rPr>
+          <w:rFonts w:ascii="Arial" w:cs="Arial" w:eastAsia="Arial" w:hAnsi="Arial"/>
+        </w:rPr>
+        <w:t xml:space="preserve">Nothing runs the nightly set on a schedule yet: neither Jenkinsfile_nightly nor Jenkinsfile_CNP calls it.</w:t>
       </w:r>
     </w:p>
     <w:p>

</xml_diff>